<commit_message>
results: TP=1 sweep; RESULTS.md analysis; Word report with plateau and deployment implications; README summary
</commit_message>
<xml_diff>
--- a/reports/Qwen3.8-27B-benchmark-results.docx
+++ b/reports/Qwen3.8-27B-benchmark-results.docx
@@ -670,6 +670,30 @@
           <w:b/>
           <w:bCs/>
         </w:rPr>
+        <w:t xml:space="preserve">Under load, one GPU outserves four: </w:t>
+      </w:r>
+      <w:r>
+        <w:rPr>
+          <w:rFonts w:ascii="Arial" w:cs="Arial" w:eastAsia="Arial" w:hAnsi="Arial"/>
+        </w:rPr>
+        <w:t xml:space="preserve">TP=4 peaks at 185 output tok/s (8 users) and settles at ~124–141 tok/s beyond that, while a single GPU with TP=1 reaches ~210 tok/s (32 users). For many concurrent users, four independent TP=1 replicas (one per GPU) are the throughput-optimal layout — estimated ~840 tok/s per server (estimate, not measured).</w:t>
+      </w:r>
+    </w:p>
+    <w:p>
+      <w:pPr>
+        <w:pStyle w:val="ListParagraph"/>
+        <w:numPr>
+          <w:ilvl w:val="0"/>
+          <w:numId w:val="2"/>
+        </w:numPr>
+        <w:spacing w:after="60"/>
+      </w:pPr>
+      <w:r>
+        <w:rPr>
+          <w:rFonts w:ascii="Arial" w:cs="Arial" w:eastAsia="Arial" w:hAnsi="Arial"/>
+          <w:b/>
+          <w:bCs/>
+        </w:rPr>
         <w:t xml:space="preserve">Concurrency: </w:t>
       </w:r>
       <w:r>
@@ -8255,6 +8279,1056 @@
           </w:p>
         </w:tc>
       </w:tr>
+      <w:tr>
+        <w:tc>
+          <w:tcPr>
+            <w:tcW w:type="dxa" w:w="1834"/>
+            <w:tcBorders>
+              <w:top w:val="single" w:color="BFC7D5" w:sz="4"/>
+              <w:left w:val="single" w:color="BFC7D5" w:sz="4"/>
+              <w:bottom w:val="single" w:color="BFC7D5" w:sz="4"/>
+              <w:right w:val="single" w:color="BFC7D5" w:sz="4"/>
+            </w:tcBorders>
+            <w:tcMar>
+              <w:top w:type="dxa" w:w="60"/>
+              <w:left w:type="dxa" w:w="100"/>
+              <w:bottom w:type="dxa" w:w="60"/>
+              <w:right w:type="dxa" w:w="100"/>
+            </w:tcMar>
+          </w:tcPr>
+          <w:p>
+            <w:pPr>
+              <w:jc w:val="left"/>
+            </w:pPr>
+            <w:r>
+              <w:rPr>
+                <w:rFonts w:ascii="Arial" w:cs="Arial" w:eastAsia="Arial" w:hAnsi="Arial"/>
+                <w:b/>
+                <w:bCs/>
+                <w:sz w:val="18"/>
+                <w:szCs w:val="18"/>
+              </w:rPr>
+              <w:t xml:space="preserve">16</w:t>
+            </w:r>
+          </w:p>
+        </w:tc>
+        <w:tc>
+          <w:tcPr>
+            <w:tcW w:type="dxa" w:w="1834"/>
+            <w:tcBorders>
+              <w:top w:val="single" w:color="BFC7D5" w:sz="4"/>
+              <w:left w:val="single" w:color="BFC7D5" w:sz="4"/>
+              <w:bottom w:val="single" w:color="BFC7D5" w:sz="4"/>
+              <w:right w:val="single" w:color="BFC7D5" w:sz="4"/>
+            </w:tcBorders>
+            <w:tcMar>
+              <w:top w:type="dxa" w:w="60"/>
+              <w:left w:type="dxa" w:w="100"/>
+              <w:bottom w:type="dxa" w:w="60"/>
+              <w:right w:type="dxa" w:w="100"/>
+            </w:tcMar>
+          </w:tcPr>
+          <w:p>
+            <w:pPr>
+              <w:jc w:val="right"/>
+            </w:pPr>
+            <w:r>
+              <w:rPr>
+                <w:rFonts w:ascii="Arial" w:cs="Arial" w:eastAsia="Arial" w:hAnsi="Arial"/>
+                <w:b w:val="false"/>
+                <w:bCs w:val="false"/>
+                <w:sz w:val="18"/>
+                <w:szCs w:val="18"/>
+              </w:rPr>
+              <w:t xml:space="preserve">32</w:t>
+            </w:r>
+          </w:p>
+        </w:tc>
+        <w:tc>
+          <w:tcPr>
+            <w:tcW w:type="dxa" w:w="1834"/>
+            <w:tcBorders>
+              <w:top w:val="single" w:color="BFC7D5" w:sz="4"/>
+              <w:left w:val="single" w:color="BFC7D5" w:sz="4"/>
+              <w:bottom w:val="single" w:color="BFC7D5" w:sz="4"/>
+              <w:right w:val="single" w:color="BFC7D5" w:sz="4"/>
+            </w:tcBorders>
+            <w:tcMar>
+              <w:top w:type="dxa" w:w="60"/>
+              <w:left w:type="dxa" w:w="100"/>
+              <w:bottom w:type="dxa" w:w="60"/>
+              <w:right w:type="dxa" w:w="100"/>
+            </w:tcMar>
+          </w:tcPr>
+          <w:p>
+            <w:pPr>
+              <w:jc w:val="right"/>
+            </w:pPr>
+            <w:r>
+              <w:rPr>
+                <w:rFonts w:ascii="Arial" w:cs="Arial" w:eastAsia="Arial" w:hAnsi="Arial"/>
+                <w:b w:val="false"/>
+                <w:bCs w:val="false"/>
+                <w:sz w:val="18"/>
+                <w:szCs w:val="18"/>
+              </w:rPr>
+              <w:t xml:space="preserve">13.45</w:t>
+            </w:r>
+          </w:p>
+        </w:tc>
+        <w:tc>
+          <w:tcPr>
+            <w:tcW w:type="dxa" w:w="1834"/>
+            <w:tcBorders>
+              <w:top w:val="single" w:color="BFC7D5" w:sz="4"/>
+              <w:left w:val="single" w:color="BFC7D5" w:sz="4"/>
+              <w:bottom w:val="single" w:color="BFC7D5" w:sz="4"/>
+              <w:right w:val="single" w:color="BFC7D5" w:sz="4"/>
+            </w:tcBorders>
+            <w:tcMar>
+              <w:top w:type="dxa" w:w="60"/>
+              <w:left w:type="dxa" w:w="100"/>
+              <w:bottom w:type="dxa" w:w="60"/>
+              <w:right w:type="dxa" w:w="100"/>
+            </w:tcMar>
+          </w:tcPr>
+          <w:p>
+            <w:pPr>
+              <w:jc w:val="right"/>
+            </w:pPr>
+            <w:r>
+              <w:rPr>
+                <w:rFonts w:ascii="Arial" w:cs="Arial" w:eastAsia="Arial" w:hAnsi="Arial"/>
+                <w:b w:val="false"/>
+                <w:bCs w:val="false"/>
+                <w:sz w:val="18"/>
+                <w:szCs w:val="18"/>
+              </w:rPr>
+              <w:t xml:space="preserve">52.47</w:t>
+            </w:r>
+          </w:p>
+        </w:tc>
+        <w:tc>
+          <w:tcPr>
+            <w:tcW w:type="dxa" w:w="1834"/>
+            <w:tcBorders>
+              <w:top w:val="single" w:color="BFC7D5" w:sz="4"/>
+              <w:left w:val="single" w:color="BFC7D5" w:sz="4"/>
+              <w:bottom w:val="single" w:color="BFC7D5" w:sz="4"/>
+              <w:right w:val="single" w:color="BFC7D5" w:sz="4"/>
+            </w:tcBorders>
+            <w:tcMar>
+              <w:top w:type="dxa" w:w="60"/>
+              <w:left w:type="dxa" w:w="100"/>
+              <w:bottom w:type="dxa" w:w="60"/>
+              <w:right w:type="dxa" w:w="100"/>
+            </w:tcMar>
+          </w:tcPr>
+          <w:p>
+            <w:pPr>
+              <w:jc w:val="right"/>
+            </w:pPr>
+            <w:r>
+              <w:rPr>
+                <w:rFonts w:ascii="Arial" w:cs="Arial" w:eastAsia="Arial" w:hAnsi="Arial"/>
+                <w:b w:val="false"/>
+                <w:bCs w:val="false"/>
+                <w:sz w:val="18"/>
+                <w:szCs w:val="18"/>
+              </w:rPr>
+              <w:t xml:space="preserve">26.5</w:t>
+            </w:r>
+          </w:p>
+        </w:tc>
+        <w:tc>
+          <w:tcPr>
+            <w:tcW w:type="dxa" w:w="1834"/>
+            <w:tcBorders>
+              <w:top w:val="single" w:color="BFC7D5" w:sz="4"/>
+              <w:left w:val="single" w:color="BFC7D5" w:sz="4"/>
+              <w:bottom w:val="single" w:color="BFC7D5" w:sz="4"/>
+              <w:right w:val="single" w:color="BFC7D5" w:sz="4"/>
+            </w:tcBorders>
+            <w:tcMar>
+              <w:top w:type="dxa" w:w="60"/>
+              <w:left w:type="dxa" w:w="100"/>
+              <w:bottom w:type="dxa" w:w="60"/>
+              <w:right w:type="dxa" w:w="100"/>
+            </w:tcMar>
+          </w:tcPr>
+          <w:p>
+            <w:pPr>
+              <w:jc w:val="right"/>
+            </w:pPr>
+            <w:r>
+              <w:rPr>
+                <w:rFonts w:ascii="Arial" w:cs="Arial" w:eastAsia="Arial" w:hAnsi="Arial"/>
+                <w:b w:val="false"/>
+                <w:bCs w:val="false"/>
+                <w:sz w:val="18"/>
+                <w:szCs w:val="18"/>
+              </w:rPr>
+              <w:t xml:space="preserve">2,689.9</w:t>
+            </w:r>
+          </w:p>
+        </w:tc>
+        <w:tc>
+          <w:tcPr>
+            <w:tcW w:type="dxa" w:w="1834"/>
+            <w:tcBorders>
+              <w:top w:val="single" w:color="BFC7D5" w:sz="4"/>
+              <w:left w:val="single" w:color="BFC7D5" w:sz="4"/>
+              <w:bottom w:val="single" w:color="BFC7D5" w:sz="4"/>
+              <w:right w:val="single" w:color="BFC7D5" w:sz="4"/>
+            </w:tcBorders>
+            <w:shd w:fill="FBE5D6" w:color="auto" w:val="clear"/>
+            <w:tcMar>
+              <w:top w:type="dxa" w:w="60"/>
+              <w:left w:type="dxa" w:w="100"/>
+              <w:bottom w:type="dxa" w:w="60"/>
+              <w:right w:type="dxa" w:w="100"/>
+            </w:tcMar>
+          </w:tcPr>
+          <w:p>
+            <w:pPr>
+              <w:jc w:val="right"/>
+            </w:pPr>
+            <w:r>
+              <w:rPr>
+                <w:rFonts w:ascii="Arial" w:cs="Arial" w:eastAsia="Arial" w:hAnsi="Arial"/>
+                <w:b w:val="false"/>
+                <w:bCs w:val="false"/>
+                <w:sz w:val="18"/>
+                <w:szCs w:val="18"/>
+              </w:rPr>
+              <w:t xml:space="preserve">9.8</w:t>
+            </w:r>
+          </w:p>
+        </w:tc>
+        <w:tc>
+          <w:tcPr>
+            <w:tcW w:type="dxa" w:w="1840"/>
+            <w:tcBorders>
+              <w:top w:val="single" w:color="BFC7D5" w:sz="4"/>
+              <w:left w:val="single" w:color="BFC7D5" w:sz="4"/>
+              <w:bottom w:val="single" w:color="BFC7D5" w:sz="4"/>
+              <w:right w:val="single" w:color="BFC7D5" w:sz="4"/>
+            </w:tcBorders>
+            <w:tcMar>
+              <w:top w:type="dxa" w:w="60"/>
+              <w:left w:type="dxa" w:w="100"/>
+              <w:bottom w:type="dxa" w:w="60"/>
+              <w:right w:type="dxa" w:w="100"/>
+            </w:tcMar>
+          </w:tcPr>
+          <w:p>
+            <w:pPr>
+              <w:jc w:val="right"/>
+            </w:pPr>
+            <w:r>
+              <w:rPr>
+                <w:rFonts w:ascii="Arial" w:cs="Arial" w:eastAsia="Arial" w:hAnsi="Arial"/>
+                <w:b w:val="false"/>
+                <w:bCs w:val="false"/>
+                <w:sz w:val="18"/>
+                <w:szCs w:val="18"/>
+              </w:rPr>
+              <w:t xml:space="preserve">124.3</w:t>
+            </w:r>
+          </w:p>
+        </w:tc>
+      </w:tr>
+      <w:tr>
+        <w:tc>
+          <w:tcPr>
+            <w:tcW w:type="dxa" w:w="1834"/>
+            <w:tcBorders>
+              <w:top w:val="single" w:color="BFC7D5" w:sz="4"/>
+              <w:left w:val="single" w:color="BFC7D5" w:sz="4"/>
+              <w:bottom w:val="single" w:color="BFC7D5" w:sz="4"/>
+              <w:right w:val="single" w:color="BFC7D5" w:sz="4"/>
+            </w:tcBorders>
+            <w:shd w:fill="F2F5FA" w:color="auto" w:val="clear"/>
+            <w:tcMar>
+              <w:top w:type="dxa" w:w="60"/>
+              <w:left w:type="dxa" w:w="100"/>
+              <w:bottom w:type="dxa" w:w="60"/>
+              <w:right w:type="dxa" w:w="100"/>
+            </w:tcMar>
+          </w:tcPr>
+          <w:p>
+            <w:pPr>
+              <w:jc w:val="left"/>
+            </w:pPr>
+            <w:r>
+              <w:rPr>
+                <w:rFonts w:ascii="Arial" w:cs="Arial" w:eastAsia="Arial" w:hAnsi="Arial"/>
+                <w:b/>
+                <w:bCs/>
+                <w:sz w:val="18"/>
+                <w:szCs w:val="18"/>
+              </w:rPr>
+              <w:t xml:space="preserve">32</w:t>
+            </w:r>
+          </w:p>
+        </w:tc>
+        <w:tc>
+          <w:tcPr>
+            <w:tcW w:type="dxa" w:w="1834"/>
+            <w:tcBorders>
+              <w:top w:val="single" w:color="BFC7D5" w:sz="4"/>
+              <w:left w:val="single" w:color="BFC7D5" w:sz="4"/>
+              <w:bottom w:val="single" w:color="BFC7D5" w:sz="4"/>
+              <w:right w:val="single" w:color="BFC7D5" w:sz="4"/>
+            </w:tcBorders>
+            <w:shd w:fill="F2F5FA" w:color="auto" w:val="clear"/>
+            <w:tcMar>
+              <w:top w:type="dxa" w:w="60"/>
+              <w:left w:type="dxa" w:w="100"/>
+              <w:bottom w:type="dxa" w:w="60"/>
+              <w:right w:type="dxa" w:w="100"/>
+            </w:tcMar>
+          </w:tcPr>
+          <w:p>
+            <w:pPr>
+              <w:jc w:val="right"/>
+            </w:pPr>
+            <w:r>
+              <w:rPr>
+                <w:rFonts w:ascii="Arial" w:cs="Arial" w:eastAsia="Arial" w:hAnsi="Arial"/>
+                <w:b w:val="false"/>
+                <w:bCs w:val="false"/>
+                <w:sz w:val="18"/>
+                <w:szCs w:val="18"/>
+              </w:rPr>
+              <w:t xml:space="preserve">64</w:t>
+            </w:r>
+          </w:p>
+        </w:tc>
+        <w:tc>
+          <w:tcPr>
+            <w:tcW w:type="dxa" w:w="1834"/>
+            <w:tcBorders>
+              <w:top w:val="single" w:color="BFC7D5" w:sz="4"/>
+              <w:left w:val="single" w:color="BFC7D5" w:sz="4"/>
+              <w:bottom w:val="single" w:color="BFC7D5" w:sz="4"/>
+              <w:right w:val="single" w:color="BFC7D5" w:sz="4"/>
+            </w:tcBorders>
+            <w:shd w:fill="F2F5FA" w:color="auto" w:val="clear"/>
+            <w:tcMar>
+              <w:top w:type="dxa" w:w="60"/>
+              <w:left w:type="dxa" w:w="100"/>
+              <w:bottom w:type="dxa" w:w="60"/>
+              <w:right w:type="dxa" w:w="100"/>
+            </w:tcMar>
+          </w:tcPr>
+          <w:p>
+            <w:pPr>
+              <w:jc w:val="right"/>
+            </w:pPr>
+            <w:r>
+              <w:rPr>
+                <w:rFonts w:ascii="Arial" w:cs="Arial" w:eastAsia="Arial" w:hAnsi="Arial"/>
+                <w:b w:val="false"/>
+                <w:bCs w:val="false"/>
+                <w:sz w:val="18"/>
+                <w:szCs w:val="18"/>
+              </w:rPr>
+              <w:t xml:space="preserve">13.48</w:t>
+            </w:r>
+          </w:p>
+        </w:tc>
+        <w:tc>
+          <w:tcPr>
+            <w:tcW w:type="dxa" w:w="1834"/>
+            <w:tcBorders>
+              <w:top w:val="single" w:color="BFC7D5" w:sz="4"/>
+              <w:left w:val="single" w:color="BFC7D5" w:sz="4"/>
+              <w:bottom w:val="single" w:color="BFC7D5" w:sz="4"/>
+              <w:right w:val="single" w:color="BFC7D5" w:sz="4"/>
+            </w:tcBorders>
+            <w:shd w:fill="F2F5FA" w:color="auto" w:val="clear"/>
+            <w:tcMar>
+              <w:top w:type="dxa" w:w="60"/>
+              <w:left w:type="dxa" w:w="100"/>
+              <w:bottom w:type="dxa" w:w="60"/>
+              <w:right w:type="dxa" w:w="100"/>
+            </w:tcMar>
+          </w:tcPr>
+          <w:p>
+            <w:pPr>
+              <w:jc w:val="right"/>
+            </w:pPr>
+            <w:r>
+              <w:rPr>
+                <w:rFonts w:ascii="Arial" w:cs="Arial" w:eastAsia="Arial" w:hAnsi="Arial"/>
+                <w:b w:val="false"/>
+                <w:bCs w:val="false"/>
+                <w:sz w:val="18"/>
+                <w:szCs w:val="18"/>
+              </w:rPr>
+              <w:t xml:space="preserve">103.70</w:t>
+            </w:r>
+          </w:p>
+        </w:tc>
+        <w:tc>
+          <w:tcPr>
+            <w:tcW w:type="dxa" w:w="1834"/>
+            <w:tcBorders>
+              <w:top w:val="single" w:color="BFC7D5" w:sz="4"/>
+              <w:left w:val="single" w:color="BFC7D5" w:sz="4"/>
+              <w:bottom w:val="single" w:color="BFC7D5" w:sz="4"/>
+              <w:right w:val="single" w:color="BFC7D5" w:sz="4"/>
+            </w:tcBorders>
+            <w:shd w:fill="F2F5FA" w:color="auto" w:val="clear"/>
+            <w:tcMar>
+              <w:top w:type="dxa" w:w="60"/>
+              <w:left w:type="dxa" w:w="100"/>
+              <w:bottom w:type="dxa" w:w="60"/>
+              <w:right w:type="dxa" w:w="100"/>
+            </w:tcMar>
+          </w:tcPr>
+          <w:p>
+            <w:pPr>
+              <w:jc w:val="right"/>
+            </w:pPr>
+            <w:r>
+              <w:rPr>
+                <w:rFonts w:ascii="Arial" w:cs="Arial" w:eastAsia="Arial" w:hAnsi="Arial"/>
+                <w:b w:val="false"/>
+                <w:bCs w:val="false"/>
+                <w:sz w:val="18"/>
+                <w:szCs w:val="18"/>
+              </w:rPr>
+              <w:t xml:space="preserve">38.1</w:t>
+            </w:r>
+          </w:p>
+        </w:tc>
+        <w:tc>
+          <w:tcPr>
+            <w:tcW w:type="dxa" w:w="1834"/>
+            <w:tcBorders>
+              <w:top w:val="single" w:color="BFC7D5" w:sz="4"/>
+              <w:left w:val="single" w:color="BFC7D5" w:sz="4"/>
+              <w:bottom w:val="single" w:color="BFC7D5" w:sz="4"/>
+              <w:right w:val="single" w:color="BFC7D5" w:sz="4"/>
+            </w:tcBorders>
+            <w:shd w:fill="F2F5FA" w:color="auto" w:val="clear"/>
+            <w:tcMar>
+              <w:top w:type="dxa" w:w="60"/>
+              <w:left w:type="dxa" w:w="100"/>
+              <w:bottom w:type="dxa" w:w="60"/>
+              <w:right w:type="dxa" w:w="100"/>
+            </w:tcMar>
+          </w:tcPr>
+          <w:p>
+            <w:pPr>
+              <w:jc w:val="right"/>
+            </w:pPr>
+            <w:r>
+              <w:rPr>
+                <w:rFonts w:ascii="Arial" w:cs="Arial" w:eastAsia="Arial" w:hAnsi="Arial"/>
+                <w:b w:val="false"/>
+                <w:bCs w:val="false"/>
+                <w:sz w:val="18"/>
+                <w:szCs w:val="18"/>
+              </w:rPr>
+              <w:t xml:space="preserve">2,696.8</w:t>
+            </w:r>
+          </w:p>
+        </w:tc>
+        <w:tc>
+          <w:tcPr>
+            <w:tcW w:type="dxa" w:w="1834"/>
+            <w:tcBorders>
+              <w:top w:val="single" w:color="BFC7D5" w:sz="4"/>
+              <w:left w:val="single" w:color="BFC7D5" w:sz="4"/>
+              <w:bottom w:val="single" w:color="BFC7D5" w:sz="4"/>
+              <w:right w:val="single" w:color="BFC7D5" w:sz="4"/>
+            </w:tcBorders>
+            <w:shd w:fill="FBE5D6" w:color="auto" w:val="clear"/>
+            <w:tcMar>
+              <w:top w:type="dxa" w:w="60"/>
+              <w:left w:type="dxa" w:w="100"/>
+              <w:bottom w:type="dxa" w:w="60"/>
+              <w:right w:type="dxa" w:w="100"/>
+            </w:tcMar>
+          </w:tcPr>
+          <w:p>
+            <w:pPr>
+              <w:jc w:val="right"/>
+            </w:pPr>
+            <w:r>
+              <w:rPr>
+                <w:rFonts w:ascii="Arial" w:cs="Arial" w:eastAsia="Arial" w:hAnsi="Arial"/>
+                <w:b w:val="false"/>
+                <w:bCs w:val="false"/>
+                <w:sz w:val="18"/>
+                <w:szCs w:val="18"/>
+              </w:rPr>
+              <w:t xml:space="preserve">4.6</w:t>
+            </w:r>
+          </w:p>
+        </w:tc>
+        <w:tc>
+          <w:tcPr>
+            <w:tcW w:type="dxa" w:w="1840"/>
+            <w:tcBorders>
+              <w:top w:val="single" w:color="BFC7D5" w:sz="4"/>
+              <w:left w:val="single" w:color="BFC7D5" w:sz="4"/>
+              <w:bottom w:val="single" w:color="BFC7D5" w:sz="4"/>
+              <w:right w:val="single" w:color="BFC7D5" w:sz="4"/>
+            </w:tcBorders>
+            <w:shd w:fill="F2F5FA" w:color="auto" w:val="clear"/>
+            <w:tcMar>
+              <w:top w:type="dxa" w:w="60"/>
+              <w:left w:type="dxa" w:w="100"/>
+              <w:bottom w:type="dxa" w:w="60"/>
+              <w:right w:type="dxa" w:w="100"/>
+            </w:tcMar>
+          </w:tcPr>
+          <w:p>
+            <w:pPr>
+              <w:jc w:val="right"/>
+            </w:pPr>
+            <w:r>
+              <w:rPr>
+                <w:rFonts w:ascii="Arial" w:cs="Arial" w:eastAsia="Arial" w:hAnsi="Arial"/>
+                <w:b w:val="false"/>
+                <w:bCs w:val="false"/>
+                <w:sz w:val="18"/>
+                <w:szCs w:val="18"/>
+              </w:rPr>
+              <w:t xml:space="preserve">132.1</w:t>
+            </w:r>
+          </w:p>
+        </w:tc>
+      </w:tr>
+      <w:tr>
+        <w:tc>
+          <w:tcPr>
+            <w:tcW w:type="dxa" w:w="1834"/>
+            <w:tcBorders>
+              <w:top w:val="single" w:color="BFC7D5" w:sz="4"/>
+              <w:left w:val="single" w:color="BFC7D5" w:sz="4"/>
+              <w:bottom w:val="single" w:color="BFC7D5" w:sz="4"/>
+              <w:right w:val="single" w:color="BFC7D5" w:sz="4"/>
+            </w:tcBorders>
+            <w:tcMar>
+              <w:top w:type="dxa" w:w="60"/>
+              <w:left w:type="dxa" w:w="100"/>
+              <w:bottom w:type="dxa" w:w="60"/>
+              <w:right w:type="dxa" w:w="100"/>
+            </w:tcMar>
+          </w:tcPr>
+          <w:p>
+            <w:pPr>
+              <w:jc w:val="left"/>
+            </w:pPr>
+            <w:r>
+              <w:rPr>
+                <w:rFonts w:ascii="Arial" w:cs="Arial" w:eastAsia="Arial" w:hAnsi="Arial"/>
+                <w:b/>
+                <w:bCs/>
+                <w:sz w:val="18"/>
+                <w:szCs w:val="18"/>
+              </w:rPr>
+              <w:t xml:space="preserve">64</w:t>
+            </w:r>
+          </w:p>
+        </w:tc>
+        <w:tc>
+          <w:tcPr>
+            <w:tcW w:type="dxa" w:w="1834"/>
+            <w:tcBorders>
+              <w:top w:val="single" w:color="BFC7D5" w:sz="4"/>
+              <w:left w:val="single" w:color="BFC7D5" w:sz="4"/>
+              <w:bottom w:val="single" w:color="BFC7D5" w:sz="4"/>
+              <w:right w:val="single" w:color="BFC7D5" w:sz="4"/>
+            </w:tcBorders>
+            <w:tcMar>
+              <w:top w:type="dxa" w:w="60"/>
+              <w:left w:type="dxa" w:w="100"/>
+              <w:bottom w:type="dxa" w:w="60"/>
+              <w:right w:type="dxa" w:w="100"/>
+            </w:tcMar>
+          </w:tcPr>
+          <w:p>
+            <w:pPr>
+              <w:jc w:val="right"/>
+            </w:pPr>
+            <w:r>
+              <w:rPr>
+                <w:rFonts w:ascii="Arial" w:cs="Arial" w:eastAsia="Arial" w:hAnsi="Arial"/>
+                <w:b w:val="false"/>
+                <w:bCs w:val="false"/>
+                <w:sz w:val="18"/>
+                <w:szCs w:val="18"/>
+              </w:rPr>
+              <w:t xml:space="preserve">128</w:t>
+            </w:r>
+          </w:p>
+        </w:tc>
+        <w:tc>
+          <w:tcPr>
+            <w:tcW w:type="dxa" w:w="1834"/>
+            <w:tcBorders>
+              <w:top w:val="single" w:color="BFC7D5" w:sz="4"/>
+              <w:left w:val="single" w:color="BFC7D5" w:sz="4"/>
+              <w:bottom w:val="single" w:color="BFC7D5" w:sz="4"/>
+              <w:right w:val="single" w:color="BFC7D5" w:sz="4"/>
+            </w:tcBorders>
+            <w:tcMar>
+              <w:top w:type="dxa" w:w="60"/>
+              <w:left w:type="dxa" w:w="100"/>
+              <w:bottom w:type="dxa" w:w="60"/>
+              <w:right w:type="dxa" w:w="100"/>
+            </w:tcMar>
+          </w:tcPr>
+          <w:p>
+            <w:pPr>
+              <w:jc w:val="right"/>
+            </w:pPr>
+            <w:r>
+              <w:rPr>
+                <w:rFonts w:ascii="Arial" w:cs="Arial" w:eastAsia="Arial" w:hAnsi="Arial"/>
+                <w:b w:val="false"/>
+                <w:bCs w:val="false"/>
+                <w:sz w:val="18"/>
+                <w:szCs w:val="18"/>
+              </w:rPr>
+              <w:t xml:space="preserve">13.58</w:t>
+            </w:r>
+          </w:p>
+        </w:tc>
+        <w:tc>
+          <w:tcPr>
+            <w:tcW w:type="dxa" w:w="1834"/>
+            <w:tcBorders>
+              <w:top w:val="single" w:color="BFC7D5" w:sz="4"/>
+              <w:left w:val="single" w:color="BFC7D5" w:sz="4"/>
+              <w:bottom w:val="single" w:color="BFC7D5" w:sz="4"/>
+              <w:right w:val="single" w:color="BFC7D5" w:sz="4"/>
+            </w:tcBorders>
+            <w:tcMar>
+              <w:top w:type="dxa" w:w="60"/>
+              <w:left w:type="dxa" w:w="100"/>
+              <w:bottom w:type="dxa" w:w="60"/>
+              <w:right w:type="dxa" w:w="100"/>
+            </w:tcMar>
+          </w:tcPr>
+          <w:p>
+            <w:pPr>
+              <w:jc w:val="right"/>
+            </w:pPr>
+            <w:r>
+              <w:rPr>
+                <w:rFonts w:ascii="Arial" w:cs="Arial" w:eastAsia="Arial" w:hAnsi="Arial"/>
+                <w:b w:val="false"/>
+                <w:bCs w:val="false"/>
+                <w:sz w:val="18"/>
+                <w:szCs w:val="18"/>
+              </w:rPr>
+              <w:t xml:space="preserve">207.47</w:t>
+            </w:r>
+          </w:p>
+        </w:tc>
+        <w:tc>
+          <w:tcPr>
+            <w:tcW w:type="dxa" w:w="1834"/>
+            <w:tcBorders>
+              <w:top w:val="single" w:color="BFC7D5" w:sz="4"/>
+              <w:left w:val="single" w:color="BFC7D5" w:sz="4"/>
+              <w:bottom w:val="single" w:color="BFC7D5" w:sz="4"/>
+              <w:right w:val="single" w:color="BFC7D5" w:sz="4"/>
+            </w:tcBorders>
+            <w:tcMar>
+              <w:top w:type="dxa" w:w="60"/>
+              <w:left w:type="dxa" w:w="100"/>
+              <w:bottom w:type="dxa" w:w="60"/>
+              <w:right w:type="dxa" w:w="100"/>
+            </w:tcMar>
+          </w:tcPr>
+          <w:p>
+            <w:pPr>
+              <w:jc w:val="right"/>
+            </w:pPr>
+            <w:r>
+              <w:rPr>
+                <w:rFonts w:ascii="Arial" w:cs="Arial" w:eastAsia="Arial" w:hAnsi="Arial"/>
+                <w:b w:val="false"/>
+                <w:bCs w:val="false"/>
+                <w:sz w:val="18"/>
+                <w:szCs w:val="18"/>
+              </w:rPr>
+              <w:t xml:space="preserve">64.5</w:t>
+            </w:r>
+          </w:p>
+        </w:tc>
+        <w:tc>
+          <w:tcPr>
+            <w:tcW w:type="dxa" w:w="1834"/>
+            <w:tcBorders>
+              <w:top w:val="single" w:color="BFC7D5" w:sz="4"/>
+              <w:left w:val="single" w:color="BFC7D5" w:sz="4"/>
+              <w:bottom w:val="single" w:color="BFC7D5" w:sz="4"/>
+              <w:right w:val="single" w:color="BFC7D5" w:sz="4"/>
+            </w:tcBorders>
+            <w:tcMar>
+              <w:top w:type="dxa" w:w="60"/>
+              <w:left w:type="dxa" w:w="100"/>
+              <w:bottom w:type="dxa" w:w="60"/>
+              <w:right w:type="dxa" w:w="100"/>
+            </w:tcMar>
+          </w:tcPr>
+          <w:p>
+            <w:pPr>
+              <w:jc w:val="right"/>
+            </w:pPr>
+            <w:r>
+              <w:rPr>
+                <w:rFonts w:ascii="Arial" w:cs="Arial" w:eastAsia="Arial" w:hAnsi="Arial"/>
+                <w:b w:val="false"/>
+                <w:bCs w:val="false"/>
+                <w:sz w:val="18"/>
+                <w:szCs w:val="18"/>
+              </w:rPr>
+              <w:t xml:space="preserve">2,726.6</w:t>
+            </w:r>
+          </w:p>
+        </w:tc>
+        <w:tc>
+          <w:tcPr>
+            <w:tcW w:type="dxa" w:w="1834"/>
+            <w:tcBorders>
+              <w:top w:val="single" w:color="BFC7D5" w:sz="4"/>
+              <w:left w:val="single" w:color="BFC7D5" w:sz="4"/>
+              <w:bottom w:val="single" w:color="BFC7D5" w:sz="4"/>
+              <w:right w:val="single" w:color="BFC7D5" w:sz="4"/>
+            </w:tcBorders>
+            <w:shd w:fill="FBE5D6" w:color="auto" w:val="clear"/>
+            <w:tcMar>
+              <w:top w:type="dxa" w:w="60"/>
+              <w:left w:type="dxa" w:w="100"/>
+              <w:bottom w:type="dxa" w:w="60"/>
+              <w:right w:type="dxa" w:w="100"/>
+            </w:tcMar>
+          </w:tcPr>
+          <w:p>
+            <w:pPr>
+              <w:jc w:val="right"/>
+            </w:pPr>
+            <w:r>
+              <w:rPr>
+                <w:rFonts w:ascii="Arial" w:cs="Arial" w:eastAsia="Arial" w:hAnsi="Arial"/>
+                <w:b w:val="false"/>
+                <w:bCs w:val="false"/>
+                <w:sz w:val="18"/>
+                <w:szCs w:val="18"/>
+              </w:rPr>
+              <w:t xml:space="preserve">2.2</w:t>
+            </w:r>
+          </w:p>
+        </w:tc>
+        <w:tc>
+          <w:tcPr>
+            <w:tcW w:type="dxa" w:w="1840"/>
+            <w:tcBorders>
+              <w:top w:val="single" w:color="BFC7D5" w:sz="4"/>
+              <w:left w:val="single" w:color="BFC7D5" w:sz="4"/>
+              <w:bottom w:val="single" w:color="BFC7D5" w:sz="4"/>
+              <w:right w:val="single" w:color="BFC7D5" w:sz="4"/>
+            </w:tcBorders>
+            <w:tcMar>
+              <w:top w:type="dxa" w:w="60"/>
+              <w:left w:type="dxa" w:w="100"/>
+              <w:bottom w:type="dxa" w:w="60"/>
+              <w:right w:type="dxa" w:w="100"/>
+            </w:tcMar>
+          </w:tcPr>
+          <w:p>
+            <w:pPr>
+              <w:jc w:val="right"/>
+            </w:pPr>
+            <w:r>
+              <w:rPr>
+                <w:rFonts w:ascii="Arial" w:cs="Arial" w:eastAsia="Arial" w:hAnsi="Arial"/>
+                <w:b w:val="false"/>
+                <w:bCs w:val="false"/>
+                <w:sz w:val="18"/>
+                <w:szCs w:val="18"/>
+              </w:rPr>
+              <w:t xml:space="preserve">135.4</w:t>
+            </w:r>
+          </w:p>
+        </w:tc>
+      </w:tr>
+      <w:tr>
+        <w:tc>
+          <w:tcPr>
+            <w:tcW w:type="dxa" w:w="1834"/>
+            <w:tcBorders>
+              <w:top w:val="single" w:color="BFC7D5" w:sz="4"/>
+              <w:left w:val="single" w:color="BFC7D5" w:sz="4"/>
+              <w:bottom w:val="single" w:color="BFC7D5" w:sz="4"/>
+              <w:right w:val="single" w:color="BFC7D5" w:sz="4"/>
+            </w:tcBorders>
+            <w:shd w:fill="F2F5FA" w:color="auto" w:val="clear"/>
+            <w:tcMar>
+              <w:top w:type="dxa" w:w="60"/>
+              <w:left w:type="dxa" w:w="100"/>
+              <w:bottom w:type="dxa" w:w="60"/>
+              <w:right w:type="dxa" w:w="100"/>
+            </w:tcMar>
+          </w:tcPr>
+          <w:p>
+            <w:pPr>
+              <w:jc w:val="left"/>
+            </w:pPr>
+            <w:r>
+              <w:rPr>
+                <w:rFonts w:ascii="Arial" w:cs="Arial" w:eastAsia="Arial" w:hAnsi="Arial"/>
+                <w:b/>
+                <w:bCs/>
+                <w:sz w:val="18"/>
+                <w:szCs w:val="18"/>
+              </w:rPr>
+              <w:t xml:space="preserve">128</w:t>
+            </w:r>
+          </w:p>
+        </w:tc>
+        <w:tc>
+          <w:tcPr>
+            <w:tcW w:type="dxa" w:w="1834"/>
+            <w:tcBorders>
+              <w:top w:val="single" w:color="BFC7D5" w:sz="4"/>
+              <w:left w:val="single" w:color="BFC7D5" w:sz="4"/>
+              <w:bottom w:val="single" w:color="BFC7D5" w:sz="4"/>
+              <w:right w:val="single" w:color="BFC7D5" w:sz="4"/>
+            </w:tcBorders>
+            <w:shd w:fill="F2F5FA" w:color="auto" w:val="clear"/>
+            <w:tcMar>
+              <w:top w:type="dxa" w:w="60"/>
+              <w:left w:type="dxa" w:w="100"/>
+              <w:bottom w:type="dxa" w:w="60"/>
+              <w:right w:type="dxa" w:w="100"/>
+            </w:tcMar>
+          </w:tcPr>
+          <w:p>
+            <w:pPr>
+              <w:jc w:val="right"/>
+            </w:pPr>
+            <w:r>
+              <w:rPr>
+                <w:rFonts w:ascii="Arial" w:cs="Arial" w:eastAsia="Arial" w:hAnsi="Arial"/>
+                <w:b w:val="false"/>
+                <w:bCs w:val="false"/>
+                <w:sz w:val="18"/>
+                <w:szCs w:val="18"/>
+              </w:rPr>
+              <w:t xml:space="preserve">256</w:t>
+            </w:r>
+          </w:p>
+        </w:tc>
+        <w:tc>
+          <w:tcPr>
+            <w:tcW w:type="dxa" w:w="1834"/>
+            <w:tcBorders>
+              <w:top w:val="single" w:color="BFC7D5" w:sz="4"/>
+              <w:left w:val="single" w:color="BFC7D5" w:sz="4"/>
+              <w:bottom w:val="single" w:color="BFC7D5" w:sz="4"/>
+              <w:right w:val="single" w:color="BFC7D5" w:sz="4"/>
+            </w:tcBorders>
+            <w:shd w:fill="F2F5FA" w:color="auto" w:val="clear"/>
+            <w:tcMar>
+              <w:top w:type="dxa" w:w="60"/>
+              <w:left w:type="dxa" w:w="100"/>
+              <w:bottom w:type="dxa" w:w="60"/>
+              <w:right w:type="dxa" w:w="100"/>
+            </w:tcMar>
+          </w:tcPr>
+          <w:p>
+            <w:pPr>
+              <w:jc w:val="right"/>
+            </w:pPr>
+            <w:r>
+              <w:rPr>
+                <w:rFonts w:ascii="Arial" w:cs="Arial" w:eastAsia="Arial" w:hAnsi="Arial"/>
+                <w:b w:val="false"/>
+                <w:bCs w:val="false"/>
+                <w:sz w:val="18"/>
+                <w:szCs w:val="18"/>
+              </w:rPr>
+              <w:t xml:space="preserve">16.54</w:t>
+            </w:r>
+          </w:p>
+        </w:tc>
+        <w:tc>
+          <w:tcPr>
+            <w:tcW w:type="dxa" w:w="1834"/>
+            <w:tcBorders>
+              <w:top w:val="single" w:color="BFC7D5" w:sz="4"/>
+              <w:left w:val="single" w:color="BFC7D5" w:sz="4"/>
+              <w:bottom w:val="single" w:color="BFC7D5" w:sz="4"/>
+              <w:right w:val="single" w:color="BFC7D5" w:sz="4"/>
+            </w:tcBorders>
+            <w:shd w:fill="F2F5FA" w:color="auto" w:val="clear"/>
+            <w:tcMar>
+              <w:top w:type="dxa" w:w="60"/>
+              <w:left w:type="dxa" w:w="100"/>
+              <w:bottom w:type="dxa" w:w="60"/>
+              <w:right w:type="dxa" w:w="100"/>
+            </w:tcMar>
+          </w:tcPr>
+          <w:p>
+            <w:pPr>
+              <w:jc w:val="right"/>
+            </w:pPr>
+            <w:r>
+              <w:rPr>
+                <w:rFonts w:ascii="Arial" w:cs="Arial" w:eastAsia="Arial" w:hAnsi="Arial"/>
+                <w:b w:val="false"/>
+                <w:bCs w:val="false"/>
+                <w:sz w:val="18"/>
+                <w:szCs w:val="18"/>
+              </w:rPr>
+              <w:t xml:space="preserve">420.19</w:t>
+            </w:r>
+          </w:p>
+        </w:tc>
+        <w:tc>
+          <w:tcPr>
+            <w:tcW w:type="dxa" w:w="1834"/>
+            <w:tcBorders>
+              <w:top w:val="single" w:color="BFC7D5" w:sz="4"/>
+              <w:left w:val="single" w:color="BFC7D5" w:sz="4"/>
+              <w:bottom w:val="single" w:color="BFC7D5" w:sz="4"/>
+              <w:right w:val="single" w:color="BFC7D5" w:sz="4"/>
+            </w:tcBorders>
+            <w:shd w:fill="F2F5FA" w:color="auto" w:val="clear"/>
+            <w:tcMar>
+              <w:top w:type="dxa" w:w="60"/>
+              <w:left w:type="dxa" w:w="100"/>
+              <w:bottom w:type="dxa" w:w="60"/>
+              <w:right w:type="dxa" w:w="100"/>
+            </w:tcMar>
+          </w:tcPr>
+          <w:p>
+            <w:pPr>
+              <w:jc w:val="right"/>
+            </w:pPr>
+            <w:r>
+              <w:rPr>
+                <w:rFonts w:ascii="Arial" w:cs="Arial" w:eastAsia="Arial" w:hAnsi="Arial"/>
+                <w:b w:val="false"/>
+                <w:bCs w:val="false"/>
+                <w:sz w:val="18"/>
+                <w:szCs w:val="18"/>
+              </w:rPr>
+              <w:t xml:space="preserve">81.5</w:t>
+            </w:r>
+          </w:p>
+        </w:tc>
+        <w:tc>
+          <w:tcPr>
+            <w:tcW w:type="dxa" w:w="1834"/>
+            <w:tcBorders>
+              <w:top w:val="single" w:color="BFC7D5" w:sz="4"/>
+              <w:left w:val="single" w:color="BFC7D5" w:sz="4"/>
+              <w:bottom w:val="single" w:color="BFC7D5" w:sz="4"/>
+              <w:right w:val="single" w:color="BFC7D5" w:sz="4"/>
+            </w:tcBorders>
+            <w:shd w:fill="F2F5FA" w:color="auto" w:val="clear"/>
+            <w:tcMar>
+              <w:top w:type="dxa" w:w="60"/>
+              <w:left w:type="dxa" w:w="100"/>
+              <w:bottom w:type="dxa" w:w="60"/>
+              <w:right w:type="dxa" w:w="100"/>
+            </w:tcMar>
+          </w:tcPr>
+          <w:p>
+            <w:pPr>
+              <w:jc w:val="right"/>
+            </w:pPr>
+            <w:r>
+              <w:rPr>
+                <w:rFonts w:ascii="Arial" w:cs="Arial" w:eastAsia="Arial" w:hAnsi="Arial"/>
+                <w:b w:val="false"/>
+                <w:bCs w:val="false"/>
+                <w:sz w:val="18"/>
+                <w:szCs w:val="18"/>
+              </w:rPr>
+              <w:t xml:space="preserve">2,782.5</w:t>
+            </w:r>
+          </w:p>
+        </w:tc>
+        <w:tc>
+          <w:tcPr>
+            <w:tcW w:type="dxa" w:w="1834"/>
+            <w:tcBorders>
+              <w:top w:val="single" w:color="BFC7D5" w:sz="4"/>
+              <w:left w:val="single" w:color="BFC7D5" w:sz="4"/>
+              <w:bottom w:val="single" w:color="BFC7D5" w:sz="4"/>
+              <w:right w:val="single" w:color="BFC7D5" w:sz="4"/>
+            </w:tcBorders>
+            <w:shd w:fill="FBE5D6" w:color="auto" w:val="clear"/>
+            <w:tcMar>
+              <w:top w:type="dxa" w:w="60"/>
+              <w:left w:type="dxa" w:w="100"/>
+              <w:bottom w:type="dxa" w:w="60"/>
+              <w:right w:type="dxa" w:w="100"/>
+            </w:tcMar>
+          </w:tcPr>
+          <w:p>
+            <w:pPr>
+              <w:jc w:val="right"/>
+            </w:pPr>
+            <w:r>
+              <w:rPr>
+                <w:rFonts w:ascii="Arial" w:cs="Arial" w:eastAsia="Arial" w:hAnsi="Arial"/>
+                <w:b w:val="false"/>
+                <w:bCs w:val="false"/>
+                <w:sz w:val="18"/>
+                <w:szCs w:val="18"/>
+              </w:rPr>
+              <w:t xml:space="preserve">1.1</w:t>
+            </w:r>
+          </w:p>
+        </w:tc>
+        <w:tc>
+          <w:tcPr>
+            <w:tcW w:type="dxa" w:w="1840"/>
+            <w:tcBorders>
+              <w:top w:val="single" w:color="BFC7D5" w:sz="4"/>
+              <w:left w:val="single" w:color="BFC7D5" w:sz="4"/>
+              <w:bottom w:val="single" w:color="BFC7D5" w:sz="4"/>
+              <w:right w:val="single" w:color="BFC7D5" w:sz="4"/>
+            </w:tcBorders>
+            <w:shd w:fill="F2F5FA" w:color="auto" w:val="clear"/>
+            <w:tcMar>
+              <w:top w:type="dxa" w:w="60"/>
+              <w:left w:type="dxa" w:w="100"/>
+              <w:bottom w:type="dxa" w:w="60"/>
+              <w:right w:type="dxa" w:w="100"/>
+            </w:tcMar>
+          </w:tcPr>
+          <w:p>
+            <w:pPr>
+              <w:jc w:val="right"/>
+            </w:pPr>
+            <w:r>
+              <w:rPr>
+                <w:rFonts w:ascii="Arial" w:cs="Arial" w:eastAsia="Arial" w:hAnsi="Arial"/>
+                <w:b w:val="false"/>
+                <w:bCs w:val="false"/>
+                <w:sz w:val="18"/>
+                <w:szCs w:val="18"/>
+              </w:rPr>
+              <w:t xml:space="preserve">140.5</w:t>
+            </w:r>
+          </w:p>
+        </w:tc>
+      </w:tr>
     </w:tbl>
     <w:p>
       <w:pPr>
@@ -9616,6 +10690,790 @@
           </w:p>
         </w:tc>
       </w:tr>
+      <w:tr>
+        <w:tc>
+          <w:tcPr>
+            <w:tcW w:type="dxa" w:w="1834"/>
+            <w:tcBorders>
+              <w:top w:val="single" w:color="BFC7D5" w:sz="4"/>
+              <w:left w:val="single" w:color="BFC7D5" w:sz="4"/>
+              <w:bottom w:val="single" w:color="BFC7D5" w:sz="4"/>
+              <w:right w:val="single" w:color="BFC7D5" w:sz="4"/>
+            </w:tcBorders>
+            <w:tcMar>
+              <w:top w:type="dxa" w:w="60"/>
+              <w:left w:type="dxa" w:w="100"/>
+              <w:bottom w:type="dxa" w:w="60"/>
+              <w:right w:type="dxa" w:w="100"/>
+            </w:tcMar>
+          </w:tcPr>
+          <w:p>
+            <w:pPr>
+              <w:jc w:val="left"/>
+            </w:pPr>
+            <w:r>
+              <w:rPr>
+                <w:rFonts w:ascii="Arial" w:cs="Arial" w:eastAsia="Arial" w:hAnsi="Arial"/>
+                <w:b/>
+                <w:bCs/>
+                <w:sz w:val="18"/>
+                <w:szCs w:val="18"/>
+              </w:rPr>
+              <w:t xml:space="preserve">16</w:t>
+            </w:r>
+          </w:p>
+        </w:tc>
+        <w:tc>
+          <w:tcPr>
+            <w:tcW w:type="dxa" w:w="1834"/>
+            <w:tcBorders>
+              <w:top w:val="single" w:color="BFC7D5" w:sz="4"/>
+              <w:left w:val="single" w:color="BFC7D5" w:sz="4"/>
+              <w:bottom w:val="single" w:color="BFC7D5" w:sz="4"/>
+              <w:right w:val="single" w:color="BFC7D5" w:sz="4"/>
+            </w:tcBorders>
+            <w:tcMar>
+              <w:top w:type="dxa" w:w="60"/>
+              <w:left w:type="dxa" w:w="100"/>
+              <w:bottom w:type="dxa" w:w="60"/>
+              <w:right w:type="dxa" w:w="100"/>
+            </w:tcMar>
+          </w:tcPr>
+          <w:p>
+            <w:pPr>
+              <w:jc w:val="right"/>
+            </w:pPr>
+            <w:r>
+              <w:rPr>
+                <w:rFonts w:ascii="Arial" w:cs="Arial" w:eastAsia="Arial" w:hAnsi="Arial"/>
+                <w:b w:val="false"/>
+                <w:bCs w:val="false"/>
+                <w:sz w:val="18"/>
+                <w:szCs w:val="18"/>
+              </w:rPr>
+              <w:t xml:space="preserve">32</w:t>
+            </w:r>
+          </w:p>
+        </w:tc>
+        <w:tc>
+          <w:tcPr>
+            <w:tcW w:type="dxa" w:w="1834"/>
+            <w:tcBorders>
+              <w:top w:val="single" w:color="BFC7D5" w:sz="4"/>
+              <w:left w:val="single" w:color="BFC7D5" w:sz="4"/>
+              <w:bottom w:val="single" w:color="BFC7D5" w:sz="4"/>
+              <w:right w:val="single" w:color="BFC7D5" w:sz="4"/>
+            </w:tcBorders>
+            <w:tcMar>
+              <w:top w:type="dxa" w:w="60"/>
+              <w:left w:type="dxa" w:w="100"/>
+              <w:bottom w:type="dxa" w:w="60"/>
+              <w:right w:type="dxa" w:w="100"/>
+            </w:tcMar>
+          </w:tcPr>
+          <w:p>
+            <w:pPr>
+              <w:jc w:val="right"/>
+            </w:pPr>
+            <w:r>
+              <w:rPr>
+                <w:rFonts w:ascii="Arial" w:cs="Arial" w:eastAsia="Arial" w:hAnsi="Arial"/>
+                <w:b w:val="false"/>
+                <w:bCs w:val="false"/>
+                <w:sz w:val="18"/>
+                <w:szCs w:val="18"/>
+              </w:rPr>
+              <w:t xml:space="preserve">6.13</w:t>
+            </w:r>
+          </w:p>
+        </w:tc>
+        <w:tc>
+          <w:tcPr>
+            <w:tcW w:type="dxa" w:w="1834"/>
+            <w:tcBorders>
+              <w:top w:val="single" w:color="BFC7D5" w:sz="4"/>
+              <w:left w:val="single" w:color="BFC7D5" w:sz="4"/>
+              <w:bottom w:val="single" w:color="BFC7D5" w:sz="4"/>
+              <w:right w:val="single" w:color="BFC7D5" w:sz="4"/>
+            </w:tcBorders>
+            <w:tcMar>
+              <w:top w:type="dxa" w:w="60"/>
+              <w:left w:type="dxa" w:w="100"/>
+              <w:bottom w:type="dxa" w:w="60"/>
+              <w:right w:type="dxa" w:w="100"/>
+            </w:tcMar>
+          </w:tcPr>
+          <w:p>
+            <w:pPr>
+              <w:jc w:val="right"/>
+            </w:pPr>
+            <w:r>
+              <w:rPr>
+                <w:rFonts w:ascii="Arial" w:cs="Arial" w:eastAsia="Arial" w:hAnsi="Arial"/>
+                <w:b w:val="false"/>
+                <w:bCs w:val="false"/>
+                <w:sz w:val="18"/>
+                <w:szCs w:val="18"/>
+              </w:rPr>
+              <w:t xml:space="preserve">23.47</w:t>
+            </w:r>
+          </w:p>
+        </w:tc>
+        <w:tc>
+          <w:tcPr>
+            <w:tcW w:type="dxa" w:w="1834"/>
+            <w:tcBorders>
+              <w:top w:val="single" w:color="BFC7D5" w:sz="4"/>
+              <w:left w:val="single" w:color="BFC7D5" w:sz="4"/>
+              <w:bottom w:val="single" w:color="BFC7D5" w:sz="4"/>
+              <w:right w:val="single" w:color="BFC7D5" w:sz="4"/>
+            </w:tcBorders>
+            <w:tcMar>
+              <w:top w:type="dxa" w:w="60"/>
+              <w:left w:type="dxa" w:w="100"/>
+              <w:bottom w:type="dxa" w:w="60"/>
+              <w:right w:type="dxa" w:w="100"/>
+            </w:tcMar>
+          </w:tcPr>
+          <w:p>
+            <w:pPr>
+              <w:jc w:val="right"/>
+            </w:pPr>
+            <w:r>
+              <w:rPr>
+                <w:rFonts w:ascii="Arial" w:cs="Arial" w:eastAsia="Arial" w:hAnsi="Arial"/>
+                <w:b w:val="false"/>
+                <w:bCs w:val="false"/>
+                <w:sz w:val="18"/>
+                <w:szCs w:val="18"/>
+              </w:rPr>
+              <w:t xml:space="preserve">48.2</w:t>
+            </w:r>
+          </w:p>
+        </w:tc>
+        <w:tc>
+          <w:tcPr>
+            <w:tcW w:type="dxa" w:w="1834"/>
+            <w:tcBorders>
+              <w:top w:val="single" w:color="BFC7D5" w:sz="4"/>
+              <w:left w:val="single" w:color="BFC7D5" w:sz="4"/>
+              <w:bottom w:val="single" w:color="BFC7D5" w:sz="4"/>
+              <w:right w:val="single" w:color="BFC7D5" w:sz="4"/>
+            </w:tcBorders>
+            <w:tcMar>
+              <w:top w:type="dxa" w:w="60"/>
+              <w:left w:type="dxa" w:w="100"/>
+              <w:bottom w:type="dxa" w:w="60"/>
+              <w:right w:type="dxa" w:w="100"/>
+            </w:tcMar>
+          </w:tcPr>
+          <w:p>
+            <w:pPr>
+              <w:jc w:val="right"/>
+            </w:pPr>
+            <w:r>
+              <w:rPr>
+                <w:rFonts w:ascii="Arial" w:cs="Arial" w:eastAsia="Arial" w:hAnsi="Arial"/>
+                <w:b w:val="false"/>
+                <w:bCs w:val="false"/>
+                <w:sz w:val="18"/>
+                <w:szCs w:val="18"/>
+              </w:rPr>
+              <w:t xml:space="preserve">1,221.1</w:t>
+            </w:r>
+          </w:p>
+        </w:tc>
+        <w:tc>
+          <w:tcPr>
+            <w:tcW w:type="dxa" w:w="1834"/>
+            <w:tcBorders>
+              <w:top w:val="single" w:color="BFC7D5" w:sz="4"/>
+              <w:left w:val="single" w:color="BFC7D5" w:sz="4"/>
+              <w:bottom w:val="single" w:color="BFC7D5" w:sz="4"/>
+              <w:right w:val="single" w:color="BFC7D5" w:sz="4"/>
+            </w:tcBorders>
+            <w:shd w:fill="FBE5D6" w:color="auto" w:val="clear"/>
+            <w:tcMar>
+              <w:top w:type="dxa" w:w="60"/>
+              <w:left w:type="dxa" w:w="100"/>
+              <w:bottom w:type="dxa" w:w="60"/>
+              <w:right w:type="dxa" w:w="100"/>
+            </w:tcMar>
+          </w:tcPr>
+          <w:p>
+            <w:pPr>
+              <w:jc w:val="right"/>
+            </w:pPr>
+            <w:r>
+              <w:rPr>
+                <w:rFonts w:ascii="Arial" w:cs="Arial" w:eastAsia="Arial" w:hAnsi="Arial"/>
+                <w:b w:val="false"/>
+                <w:bCs w:val="false"/>
+                <w:sz w:val="18"/>
+                <w:szCs w:val="18"/>
+              </w:rPr>
+              <w:t xml:space="preserve">12.2</w:t>
+            </w:r>
+          </w:p>
+        </w:tc>
+        <w:tc>
+          <w:tcPr>
+            <w:tcW w:type="dxa" w:w="1840"/>
+            <w:tcBorders>
+              <w:top w:val="single" w:color="BFC7D5" w:sz="4"/>
+              <w:left w:val="single" w:color="BFC7D5" w:sz="4"/>
+              <w:bottom w:val="single" w:color="BFC7D5" w:sz="4"/>
+              <w:right w:val="single" w:color="BFC7D5" w:sz="4"/>
+            </w:tcBorders>
+            <w:tcMar>
+              <w:top w:type="dxa" w:w="60"/>
+              <w:left w:type="dxa" w:w="100"/>
+              <w:bottom w:type="dxa" w:w="60"/>
+              <w:right w:type="dxa" w:w="100"/>
+            </w:tcMar>
+          </w:tcPr>
+          <w:p>
+            <w:pPr>
+              <w:jc w:val="right"/>
+            </w:pPr>
+            <w:r>
+              <w:rPr>
+                <w:rFonts w:ascii="Arial" w:cs="Arial" w:eastAsia="Arial" w:hAnsi="Arial"/>
+                <w:b w:val="false"/>
+                <w:bCs w:val="false"/>
+                <w:sz w:val="18"/>
+                <w:szCs w:val="18"/>
+              </w:rPr>
+              <w:t xml:space="preserve">170.2</w:t>
+            </w:r>
+          </w:p>
+        </w:tc>
+      </w:tr>
+      <w:tr>
+        <w:tc>
+          <w:tcPr>
+            <w:tcW w:type="dxa" w:w="1834"/>
+            <w:tcBorders>
+              <w:top w:val="single" w:color="BFC7D5" w:sz="4"/>
+              <w:left w:val="single" w:color="BFC7D5" w:sz="4"/>
+              <w:bottom w:val="single" w:color="BFC7D5" w:sz="4"/>
+              <w:right w:val="single" w:color="BFC7D5" w:sz="4"/>
+            </w:tcBorders>
+            <w:shd w:fill="F2F5FA" w:color="auto" w:val="clear"/>
+            <w:tcMar>
+              <w:top w:type="dxa" w:w="60"/>
+              <w:left w:type="dxa" w:w="100"/>
+              <w:bottom w:type="dxa" w:w="60"/>
+              <w:right w:type="dxa" w:w="100"/>
+            </w:tcMar>
+          </w:tcPr>
+          <w:p>
+            <w:pPr>
+              <w:jc w:val="left"/>
+            </w:pPr>
+            <w:r>
+              <w:rPr>
+                <w:rFonts w:ascii="Arial" w:cs="Arial" w:eastAsia="Arial" w:hAnsi="Arial"/>
+                <w:b/>
+                <w:bCs/>
+                <w:sz w:val="18"/>
+                <w:szCs w:val="18"/>
+              </w:rPr>
+              <w:t xml:space="preserve">32</w:t>
+            </w:r>
+          </w:p>
+        </w:tc>
+        <w:tc>
+          <w:tcPr>
+            <w:tcW w:type="dxa" w:w="1834"/>
+            <w:tcBorders>
+              <w:top w:val="single" w:color="BFC7D5" w:sz="4"/>
+              <w:left w:val="single" w:color="BFC7D5" w:sz="4"/>
+              <w:bottom w:val="single" w:color="BFC7D5" w:sz="4"/>
+              <w:right w:val="single" w:color="BFC7D5" w:sz="4"/>
+            </w:tcBorders>
+            <w:shd w:fill="F2F5FA" w:color="auto" w:val="clear"/>
+            <w:tcMar>
+              <w:top w:type="dxa" w:w="60"/>
+              <w:left w:type="dxa" w:w="100"/>
+              <w:bottom w:type="dxa" w:w="60"/>
+              <w:right w:type="dxa" w:w="100"/>
+            </w:tcMar>
+          </w:tcPr>
+          <w:p>
+            <w:pPr>
+              <w:jc w:val="right"/>
+            </w:pPr>
+            <w:r>
+              <w:rPr>
+                <w:rFonts w:ascii="Arial" w:cs="Arial" w:eastAsia="Arial" w:hAnsi="Arial"/>
+                <w:b w:val="false"/>
+                <w:bCs w:val="false"/>
+                <w:sz w:val="18"/>
+                <w:szCs w:val="18"/>
+              </w:rPr>
+              <w:t xml:space="preserve">64</w:t>
+            </w:r>
+          </w:p>
+        </w:tc>
+        <w:tc>
+          <w:tcPr>
+            <w:tcW w:type="dxa" w:w="1834"/>
+            <w:tcBorders>
+              <w:top w:val="single" w:color="BFC7D5" w:sz="4"/>
+              <w:left w:val="single" w:color="BFC7D5" w:sz="4"/>
+              <w:bottom w:val="single" w:color="BFC7D5" w:sz="4"/>
+              <w:right w:val="single" w:color="BFC7D5" w:sz="4"/>
+            </w:tcBorders>
+            <w:shd w:fill="F2F5FA" w:color="auto" w:val="clear"/>
+            <w:tcMar>
+              <w:top w:type="dxa" w:w="60"/>
+              <w:left w:type="dxa" w:w="100"/>
+              <w:bottom w:type="dxa" w:w="60"/>
+              <w:right w:type="dxa" w:w="100"/>
+            </w:tcMar>
+          </w:tcPr>
+          <w:p>
+            <w:pPr>
+              <w:jc w:val="right"/>
+            </w:pPr>
+            <w:r>
+              <w:rPr>
+                <w:rFonts w:ascii="Arial" w:cs="Arial" w:eastAsia="Arial" w:hAnsi="Arial"/>
+                <w:b w:val="false"/>
+                <w:bCs w:val="false"/>
+                <w:sz w:val="18"/>
+                <w:szCs w:val="18"/>
+              </w:rPr>
+              <w:t xml:space="preserve">6.30</w:t>
+            </w:r>
+          </w:p>
+        </w:tc>
+        <w:tc>
+          <w:tcPr>
+            <w:tcW w:type="dxa" w:w="1834"/>
+            <w:tcBorders>
+              <w:top w:val="single" w:color="BFC7D5" w:sz="4"/>
+              <w:left w:val="single" w:color="BFC7D5" w:sz="4"/>
+              <w:bottom w:val="single" w:color="BFC7D5" w:sz="4"/>
+              <w:right w:val="single" w:color="BFC7D5" w:sz="4"/>
+            </w:tcBorders>
+            <w:shd w:fill="F2F5FA" w:color="auto" w:val="clear"/>
+            <w:tcMar>
+              <w:top w:type="dxa" w:w="60"/>
+              <w:left w:type="dxa" w:w="100"/>
+              <w:bottom w:type="dxa" w:w="60"/>
+              <w:right w:type="dxa" w:w="100"/>
+            </w:tcMar>
+          </w:tcPr>
+          <w:p>
+            <w:pPr>
+              <w:jc w:val="right"/>
+            </w:pPr>
+            <w:r>
+              <w:rPr>
+                <w:rFonts w:ascii="Arial" w:cs="Arial" w:eastAsia="Arial" w:hAnsi="Arial"/>
+                <w:b w:val="false"/>
+                <w:bCs w:val="false"/>
+                <w:sz w:val="18"/>
+                <w:szCs w:val="18"/>
+              </w:rPr>
+              <w:t xml:space="preserve">47.52</w:t>
+            </w:r>
+          </w:p>
+        </w:tc>
+        <w:tc>
+          <w:tcPr>
+            <w:tcW w:type="dxa" w:w="1834"/>
+            <w:tcBorders>
+              <w:top w:val="single" w:color="BFC7D5" w:sz="4"/>
+              <w:left w:val="single" w:color="BFC7D5" w:sz="4"/>
+              <w:bottom w:val="single" w:color="BFC7D5" w:sz="4"/>
+              <w:right w:val="single" w:color="BFC7D5" w:sz="4"/>
+            </w:tcBorders>
+            <w:shd w:fill="F2F5FA" w:color="auto" w:val="clear"/>
+            <w:tcMar>
+              <w:top w:type="dxa" w:w="60"/>
+              <w:left w:type="dxa" w:w="100"/>
+              <w:bottom w:type="dxa" w:w="60"/>
+              <w:right w:type="dxa" w:w="100"/>
+            </w:tcMar>
+          </w:tcPr>
+          <w:p>
+            <w:pPr>
+              <w:jc w:val="right"/>
+            </w:pPr>
+            <w:r>
+              <w:rPr>
+                <w:rFonts w:ascii="Arial" w:cs="Arial" w:eastAsia="Arial" w:hAnsi="Arial"/>
+                <w:b w:val="false"/>
+                <w:bCs w:val="false"/>
+                <w:sz w:val="18"/>
+                <w:szCs w:val="18"/>
+              </w:rPr>
+              <w:t xml:space="preserve">59.8</w:t>
+            </w:r>
+          </w:p>
+        </w:tc>
+        <w:tc>
+          <w:tcPr>
+            <w:tcW w:type="dxa" w:w="1834"/>
+            <w:tcBorders>
+              <w:top w:val="single" w:color="BFC7D5" w:sz="4"/>
+              <w:left w:val="single" w:color="BFC7D5" w:sz="4"/>
+              <w:bottom w:val="single" w:color="BFC7D5" w:sz="4"/>
+              <w:right w:val="single" w:color="BFC7D5" w:sz="4"/>
+            </w:tcBorders>
+            <w:shd w:fill="F2F5FA" w:color="auto" w:val="clear"/>
+            <w:tcMar>
+              <w:top w:type="dxa" w:w="60"/>
+              <w:left w:type="dxa" w:w="100"/>
+              <w:bottom w:type="dxa" w:w="60"/>
+              <w:right w:type="dxa" w:w="100"/>
+            </w:tcMar>
+          </w:tcPr>
+          <w:p>
+            <w:pPr>
+              <w:jc w:val="right"/>
+            </w:pPr>
+            <w:r>
+              <w:rPr>
+                <w:rFonts w:ascii="Arial" w:cs="Arial" w:eastAsia="Arial" w:hAnsi="Arial"/>
+                <w:b w:val="false"/>
+                <w:bCs w:val="false"/>
+                <w:sz w:val="18"/>
+                <w:szCs w:val="18"/>
+              </w:rPr>
+              <w:t xml:space="preserve">1,257.4</w:t>
+            </w:r>
+          </w:p>
+        </w:tc>
+        <w:tc>
+          <w:tcPr>
+            <w:tcW w:type="dxa" w:w="1834"/>
+            <w:tcBorders>
+              <w:top w:val="single" w:color="BFC7D5" w:sz="4"/>
+              <w:left w:val="single" w:color="BFC7D5" w:sz="4"/>
+              <w:bottom w:val="single" w:color="BFC7D5" w:sz="4"/>
+              <w:right w:val="single" w:color="BFC7D5" w:sz="4"/>
+            </w:tcBorders>
+            <w:shd w:fill="FBE5D6" w:color="auto" w:val="clear"/>
+            <w:tcMar>
+              <w:top w:type="dxa" w:w="60"/>
+              <w:left w:type="dxa" w:w="100"/>
+              <w:bottom w:type="dxa" w:w="60"/>
+              <w:right w:type="dxa" w:w="100"/>
+            </w:tcMar>
+          </w:tcPr>
+          <w:p>
+            <w:pPr>
+              <w:jc w:val="right"/>
+            </w:pPr>
+            <w:r>
+              <w:rPr>
+                <w:rFonts w:ascii="Arial" w:cs="Arial" w:eastAsia="Arial" w:hAnsi="Arial"/>
+                <w:b w:val="false"/>
+                <w:bCs w:val="false"/>
+                <w:sz w:val="18"/>
+                <w:szCs w:val="18"/>
+              </w:rPr>
+              <w:t xml:space="preserve">7.2</w:t>
+            </w:r>
+          </w:p>
+        </w:tc>
+        <w:tc>
+          <w:tcPr>
+            <w:tcW w:type="dxa" w:w="1840"/>
+            <w:tcBorders>
+              <w:top w:val="single" w:color="BFC7D5" w:sz="4"/>
+              <w:left w:val="single" w:color="BFC7D5" w:sz="4"/>
+              <w:bottom w:val="single" w:color="BFC7D5" w:sz="4"/>
+              <w:right w:val="single" w:color="BFC7D5" w:sz="4"/>
+            </w:tcBorders>
+            <w:shd w:fill="F2F5FA" w:color="auto" w:val="clear"/>
+            <w:tcMar>
+              <w:top w:type="dxa" w:w="60"/>
+              <w:left w:type="dxa" w:w="100"/>
+              <w:bottom w:type="dxa" w:w="60"/>
+              <w:right w:type="dxa" w:w="100"/>
+            </w:tcMar>
+          </w:tcPr>
+          <w:p>
+            <w:pPr>
+              <w:jc w:val="right"/>
+            </w:pPr>
+            <w:r>
+              <w:rPr>
+                <w:rFonts w:ascii="Arial" w:cs="Arial" w:eastAsia="Arial" w:hAnsi="Arial"/>
+                <w:b w:val="false"/>
+                <w:bCs w:val="false"/>
+                <w:sz w:val="18"/>
+                <w:szCs w:val="18"/>
+              </w:rPr>
+              <w:t xml:space="preserve">210.0</w:t>
+            </w:r>
+          </w:p>
+        </w:tc>
+      </w:tr>
+      <w:tr>
+        <w:tc>
+          <w:tcPr>
+            <w:tcW w:type="dxa" w:w="1834"/>
+            <w:tcBorders>
+              <w:top w:val="single" w:color="BFC7D5" w:sz="4"/>
+              <w:left w:val="single" w:color="BFC7D5" w:sz="4"/>
+              <w:bottom w:val="single" w:color="BFC7D5" w:sz="4"/>
+              <w:right w:val="single" w:color="BFC7D5" w:sz="4"/>
+            </w:tcBorders>
+            <w:tcMar>
+              <w:top w:type="dxa" w:w="60"/>
+              <w:left w:type="dxa" w:w="100"/>
+              <w:bottom w:type="dxa" w:w="60"/>
+              <w:right w:type="dxa" w:w="100"/>
+            </w:tcMar>
+          </w:tcPr>
+          <w:p>
+            <w:pPr>
+              <w:jc w:val="left"/>
+            </w:pPr>
+            <w:r>
+              <w:rPr>
+                <w:rFonts w:ascii="Arial" w:cs="Arial" w:eastAsia="Arial" w:hAnsi="Arial"/>
+                <w:b/>
+                <w:bCs/>
+                <w:sz w:val="18"/>
+                <w:szCs w:val="18"/>
+              </w:rPr>
+              <w:t xml:space="preserve">64</w:t>
+            </w:r>
+          </w:p>
+        </w:tc>
+        <w:tc>
+          <w:tcPr>
+            <w:tcW w:type="dxa" w:w="1834"/>
+            <w:tcBorders>
+              <w:top w:val="single" w:color="BFC7D5" w:sz="4"/>
+              <w:left w:val="single" w:color="BFC7D5" w:sz="4"/>
+              <w:bottom w:val="single" w:color="BFC7D5" w:sz="4"/>
+              <w:right w:val="single" w:color="BFC7D5" w:sz="4"/>
+            </w:tcBorders>
+            <w:tcMar>
+              <w:top w:type="dxa" w:w="60"/>
+              <w:left w:type="dxa" w:w="100"/>
+              <w:bottom w:type="dxa" w:w="60"/>
+              <w:right w:type="dxa" w:w="100"/>
+            </w:tcMar>
+          </w:tcPr>
+          <w:p>
+            <w:pPr>
+              <w:jc w:val="right"/>
+            </w:pPr>
+            <w:r>
+              <w:rPr>
+                <w:rFonts w:ascii="Arial" w:cs="Arial" w:eastAsia="Arial" w:hAnsi="Arial"/>
+                <w:b w:val="false"/>
+                <w:bCs w:val="false"/>
+                <w:sz w:val="18"/>
+                <w:szCs w:val="18"/>
+              </w:rPr>
+              <w:t xml:space="preserve">128</w:t>
+            </w:r>
+          </w:p>
+        </w:tc>
+        <w:tc>
+          <w:tcPr>
+            <w:tcW w:type="dxa" w:w="1834"/>
+            <w:tcBorders>
+              <w:top w:val="single" w:color="BFC7D5" w:sz="4"/>
+              <w:left w:val="single" w:color="BFC7D5" w:sz="4"/>
+              <w:bottom w:val="single" w:color="BFC7D5" w:sz="4"/>
+              <w:right w:val="single" w:color="BFC7D5" w:sz="4"/>
+            </w:tcBorders>
+            <w:tcMar>
+              <w:top w:type="dxa" w:w="60"/>
+              <w:left w:type="dxa" w:w="100"/>
+              <w:bottom w:type="dxa" w:w="60"/>
+              <w:right w:type="dxa" w:w="100"/>
+            </w:tcMar>
+          </w:tcPr>
+          <w:p>
+            <w:pPr>
+              <w:jc w:val="right"/>
+            </w:pPr>
+            <w:r>
+              <w:rPr>
+                <w:rFonts w:ascii="Arial" w:cs="Arial" w:eastAsia="Arial" w:hAnsi="Arial"/>
+                <w:b w:val="false"/>
+                <w:bCs w:val="false"/>
+                <w:sz w:val="18"/>
+                <w:szCs w:val="18"/>
+              </w:rPr>
+              <w:t xml:space="preserve">53.70</w:t>
+            </w:r>
+          </w:p>
+        </w:tc>
+        <w:tc>
+          <w:tcPr>
+            <w:tcW w:type="dxa" w:w="1834"/>
+            <w:tcBorders>
+              <w:top w:val="single" w:color="BFC7D5" w:sz="4"/>
+              <w:left w:val="single" w:color="BFC7D5" w:sz="4"/>
+              <w:bottom w:val="single" w:color="BFC7D5" w:sz="4"/>
+              <w:right w:val="single" w:color="BFC7D5" w:sz="4"/>
+            </w:tcBorders>
+            <w:tcMar>
+              <w:top w:type="dxa" w:w="60"/>
+              <w:left w:type="dxa" w:w="100"/>
+              <w:bottom w:type="dxa" w:w="60"/>
+              <w:right w:type="dxa" w:w="100"/>
+            </w:tcMar>
+          </w:tcPr>
+          <w:p>
+            <w:pPr>
+              <w:jc w:val="right"/>
+            </w:pPr>
+            <w:r>
+              <w:rPr>
+                <w:rFonts w:ascii="Arial" w:cs="Arial" w:eastAsia="Arial" w:hAnsi="Arial"/>
+                <w:b w:val="false"/>
+                <w:bCs w:val="false"/>
+                <w:sz w:val="18"/>
+                <w:szCs w:val="18"/>
+              </w:rPr>
+              <w:t xml:space="preserve">131.24</w:t>
+            </w:r>
+          </w:p>
+        </w:tc>
+        <w:tc>
+          <w:tcPr>
+            <w:tcW w:type="dxa" w:w="1834"/>
+            <w:tcBorders>
+              <w:top w:val="single" w:color="BFC7D5" w:sz="4"/>
+              <w:left w:val="single" w:color="BFC7D5" w:sz="4"/>
+              <w:bottom w:val="single" w:color="BFC7D5" w:sz="4"/>
+              <w:right w:val="single" w:color="BFC7D5" w:sz="4"/>
+            </w:tcBorders>
+            <w:tcMar>
+              <w:top w:type="dxa" w:w="60"/>
+              <w:left w:type="dxa" w:w="100"/>
+              <w:bottom w:type="dxa" w:w="60"/>
+              <w:right w:type="dxa" w:w="100"/>
+            </w:tcMar>
+          </w:tcPr>
+          <w:p>
+            <w:pPr>
+              <w:jc w:val="right"/>
+            </w:pPr>
+            <w:r>
+              <w:rPr>
+                <w:rFonts w:ascii="Arial" w:cs="Arial" w:eastAsia="Arial" w:hAnsi="Arial"/>
+                <w:b w:val="false"/>
+                <w:bCs w:val="false"/>
+                <w:sz w:val="18"/>
+                <w:szCs w:val="18"/>
+              </w:rPr>
+              <w:t xml:space="preserve">64.1</w:t>
+            </w:r>
+          </w:p>
+        </w:tc>
+        <w:tc>
+          <w:tcPr>
+            <w:tcW w:type="dxa" w:w="1834"/>
+            <w:tcBorders>
+              <w:top w:val="single" w:color="BFC7D5" w:sz="4"/>
+              <w:left w:val="single" w:color="BFC7D5" w:sz="4"/>
+              <w:bottom w:val="single" w:color="BFC7D5" w:sz="4"/>
+              <w:right w:val="single" w:color="BFC7D5" w:sz="4"/>
+            </w:tcBorders>
+            <w:tcMar>
+              <w:top w:type="dxa" w:w="60"/>
+              <w:left w:type="dxa" w:w="100"/>
+              <w:bottom w:type="dxa" w:w="60"/>
+              <w:right w:type="dxa" w:w="100"/>
+            </w:tcMar>
+          </w:tcPr>
+          <w:p>
+            <w:pPr>
+              <w:jc w:val="right"/>
+            </w:pPr>
+            <w:r>
+              <w:rPr>
+                <w:rFonts w:ascii="Arial" w:cs="Arial" w:eastAsia="Arial" w:hAnsi="Arial"/>
+                <w:b w:val="false"/>
+                <w:bCs w:val="false"/>
+                <w:sz w:val="18"/>
+                <w:szCs w:val="18"/>
+              </w:rPr>
+              <w:t xml:space="preserve">1,307.2</w:t>
+            </w:r>
+          </w:p>
+        </w:tc>
+        <w:tc>
+          <w:tcPr>
+            <w:tcW w:type="dxa" w:w="1834"/>
+            <w:tcBorders>
+              <w:top w:val="single" w:color="BFC7D5" w:sz="4"/>
+              <w:left w:val="single" w:color="BFC7D5" w:sz="4"/>
+              <w:bottom w:val="single" w:color="BFC7D5" w:sz="4"/>
+              <w:right w:val="single" w:color="BFC7D5" w:sz="4"/>
+            </w:tcBorders>
+            <w:shd w:fill="FBE5D6" w:color="auto" w:val="clear"/>
+            <w:tcMar>
+              <w:top w:type="dxa" w:w="60"/>
+              <w:left w:type="dxa" w:w="100"/>
+              <w:bottom w:type="dxa" w:w="60"/>
+              <w:right w:type="dxa" w:w="100"/>
+            </w:tcMar>
+          </w:tcPr>
+          <w:p>
+            <w:pPr>
+              <w:jc w:val="right"/>
+            </w:pPr>
+            <w:r>
+              <w:rPr>
+                <w:rFonts w:ascii="Arial" w:cs="Arial" w:eastAsia="Arial" w:hAnsi="Arial"/>
+                <w:b w:val="false"/>
+                <w:bCs w:val="false"/>
+                <w:sz w:val="18"/>
+                <w:szCs w:val="18"/>
+              </w:rPr>
+              <w:t xml:space="preserve">5.7</w:t>
+            </w:r>
+          </w:p>
+        </w:tc>
+        <w:tc>
+          <w:tcPr>
+            <w:tcW w:type="dxa" w:w="1840"/>
+            <w:tcBorders>
+              <w:top w:val="single" w:color="BFC7D5" w:sz="4"/>
+              <w:left w:val="single" w:color="BFC7D5" w:sz="4"/>
+              <w:bottom w:val="single" w:color="BFC7D5" w:sz="4"/>
+              <w:right w:val="single" w:color="BFC7D5" w:sz="4"/>
+            </w:tcBorders>
+            <w:tcMar>
+              <w:top w:type="dxa" w:w="60"/>
+              <w:left w:type="dxa" w:w="100"/>
+              <w:bottom w:type="dxa" w:w="60"/>
+              <w:right w:type="dxa" w:w="100"/>
+            </w:tcMar>
+          </w:tcPr>
+          <w:p>
+            <w:pPr>
+              <w:jc w:val="right"/>
+            </w:pPr>
+            <w:r>
+              <w:rPr>
+                <w:rFonts w:ascii="Arial" w:cs="Arial" w:eastAsia="Arial" w:hAnsi="Arial"/>
+                <w:b w:val="false"/>
+                <w:bCs w:val="false"/>
+                <w:sz w:val="18"/>
+                <w:szCs w:val="18"/>
+              </w:rPr>
+              <w:t xml:space="preserve">201.6</w:t>
+            </w:r>
+          </w:p>
+        </w:tc>
+      </w:tr>
     </w:tbl>
     <w:p>
       <w:pPr>
@@ -9630,34 +11488,40 @@
     </w:p>
     <w:p>
       <w:pPr>
-        <w:spacing w:before="80" w:after="200"/>
+        <w:spacing w:after="120"/>
       </w:pPr>
       <w:r>
         <w:rPr>
           <w:rFonts w:ascii="Arial" w:cs="Arial" w:eastAsia="Arial" w:hAnsi="Arial"/>
-          <w:i/>
-          <w:iCs/>
-          <w:color w:val="595959"/>
-          <w:sz w:val="18"/>
-          <w:szCs w:val="18"/>
+          <w:b/>
+          <w:bCs/>
         </w:rPr>
-        <w:t xml:space="preserve">TP=4: concurrency sweep (16–128 users) in progress — this section updates when it completes.</w:t>
+        <w:t xml:space="preserve">TP=4: </w:t>
+      </w:r>
+      <w:r>
+        <w:rPr>
+          <w:rFonts w:ascii="Arial" w:cs="Arial" w:eastAsia="Arial" w:hAnsi="Arial"/>
+        </w:rPr>
+        <w:t xml:space="preserve">peak total throughput 185 tok/s at 8 concurrent users; highest concurrency still at ≥35 tok/s per user: 4.</w:t>
       </w:r>
     </w:p>
     <w:p>
       <w:pPr>
-        <w:spacing w:before="80" w:after="200"/>
+        <w:spacing w:after="120"/>
       </w:pPr>
       <w:r>
         <w:rPr>
           <w:rFonts w:ascii="Arial" w:cs="Arial" w:eastAsia="Arial" w:hAnsi="Arial"/>
-          <w:i/>
-          <w:iCs/>
-          <w:color w:val="595959"/>
-          <w:sz w:val="18"/>
-          <w:szCs w:val="18"/>
+          <w:b/>
+          <w:bCs/>
         </w:rPr>
-        <w:t xml:space="preserve">TP=1: concurrency sweep (16–128 users) in progress — this section updates when it completes.</w:t>
+        <w:t xml:space="preserve">TP=1: </w:t>
+      </w:r>
+      <w:r>
+        <w:rPr>
+          <w:rFonts w:ascii="Arial" w:cs="Arial" w:eastAsia="Arial" w:hAnsi="Arial"/>
+        </w:rPr>
+        <w:t xml:space="preserve">peak total throughput 210 tok/s at 32 concurrent users; highest concurrency still at ≥35 tok/s per user: none.</w:t>
       </w:r>
     </w:p>
     <w:p>
@@ -9674,6 +11538,724 @@
           <w:szCs w:val="18"/>
         </w:rPr>
         <w:t xml:space="preserve">Green: per-user speed ≥ 35 tok/s (target). Orange: below target. Requests per level = 2× concurrency for levels ≥ 16 so the server reaches steady state.</w:t>
+      </w:r>
+    </w:p>
+    <w:p>
+      <w:pPr>
+        <w:pStyle w:val="Heading2"/>
+      </w:pPr>
+      <w:r>
+        <w:rPr>
+          <w:rFonts w:ascii="Arial" w:cs="Arial" w:eastAsia="Arial" w:hAnsi="Arial"/>
+        </w:rPr>
+        <w:t xml:space="preserve">4.4 What the plateau means for deployment</w:t>
+      </w:r>
+    </w:p>
+    <w:tbl>
+      <w:tblPr>
+        <w:tblW w:type="dxa" w:w="14678"/>
+        <w:tblBorders>
+          <w:top w:val="single" w:color="auto" w:sz="4"/>
+          <w:left w:val="single" w:color="auto" w:sz="4"/>
+          <w:bottom w:val="single" w:color="auto" w:sz="4"/>
+          <w:right w:val="single" w:color="auto" w:sz="4"/>
+          <w:insideH w:val="single" w:color="auto" w:sz="4"/>
+          <w:insideV w:val="single" w:color="auto" w:sz="4"/>
+        </w:tblBorders>
+      </w:tblPr>
+      <w:tblGrid>
+        <w:gridCol w:w="3453"/>
+        <w:gridCol w:w="2590"/>
+        <w:gridCol w:w="2590"/>
+        <w:gridCol w:w="2590"/>
+        <w:gridCol w:w="3455"/>
+      </w:tblGrid>
+      <w:tr>
+        <w:trPr>
+          <w:tblHeader/>
+        </w:trPr>
+        <w:tc>
+          <w:tcPr>
+            <w:tcW w:type="dxa" w:w="3453"/>
+            <w:tcBorders>
+              <w:top w:val="single" w:color="BFC7D5" w:sz="4"/>
+              <w:left w:val="single" w:color="BFC7D5" w:sz="4"/>
+              <w:bottom w:val="single" w:color="BFC7D5" w:sz="4"/>
+              <w:right w:val="single" w:color="BFC7D5" w:sz="4"/>
+            </w:tcBorders>
+            <w:shd w:fill="1F3864" w:color="auto" w:val="clear"/>
+            <w:tcMar>
+              <w:top w:type="dxa" w:w="60"/>
+              <w:left w:type="dxa" w:w="100"/>
+              <w:bottom w:type="dxa" w:w="60"/>
+              <w:right w:type="dxa" w:w="100"/>
+            </w:tcMar>
+          </w:tcPr>
+          <w:p>
+            <w:pPr>
+              <w:jc w:val="center"/>
+            </w:pPr>
+            <w:r>
+              <w:rPr>
+                <w:rFonts w:ascii="Arial" w:cs="Arial" w:eastAsia="Arial" w:hAnsi="Arial"/>
+                <w:b/>
+                <w:bCs/>
+                <w:color w:val="FFFFFF"/>
+                <w:sz w:val="18"/>
+                <w:szCs w:val="18"/>
+              </w:rPr>
+              <w:t xml:space="preserve">Layout on one 4-GPU server</w:t>
+            </w:r>
+          </w:p>
+        </w:tc>
+        <w:tc>
+          <w:tcPr>
+            <w:tcW w:type="dxa" w:w="2590"/>
+            <w:tcBorders>
+              <w:top w:val="single" w:color="BFC7D5" w:sz="4"/>
+              <w:left w:val="single" w:color="BFC7D5" w:sz="4"/>
+              <w:bottom w:val="single" w:color="BFC7D5" w:sz="4"/>
+              <w:right w:val="single" w:color="BFC7D5" w:sz="4"/>
+            </w:tcBorders>
+            <w:shd w:fill="1F3864" w:color="auto" w:val="clear"/>
+            <w:tcMar>
+              <w:top w:type="dxa" w:w="60"/>
+              <w:left w:type="dxa" w:w="100"/>
+              <w:bottom w:type="dxa" w:w="60"/>
+              <w:right w:type="dxa" w:w="100"/>
+            </w:tcMar>
+          </w:tcPr>
+          <w:p>
+            <w:pPr>
+              <w:jc w:val="center"/>
+            </w:pPr>
+            <w:r>
+              <w:rPr>
+                <w:rFonts w:ascii="Arial" w:cs="Arial" w:eastAsia="Arial" w:hAnsi="Arial"/>
+                <w:b/>
+                <w:bCs/>
+                <w:color w:val="FFFFFF"/>
+                <w:sz w:val="18"/>
+                <w:szCs w:val="18"/>
+              </w:rPr>
+              <w:t xml:space="preserve">Per-user speed, 1 user (tok/s)</w:t>
+            </w:r>
+          </w:p>
+        </w:tc>
+        <w:tc>
+          <w:tcPr>
+            <w:tcW w:type="dxa" w:w="2590"/>
+            <w:tcBorders>
+              <w:top w:val="single" w:color="BFC7D5" w:sz="4"/>
+              <w:left w:val="single" w:color="BFC7D5" w:sz="4"/>
+              <w:bottom w:val="single" w:color="BFC7D5" w:sz="4"/>
+              <w:right w:val="single" w:color="BFC7D5" w:sz="4"/>
+            </w:tcBorders>
+            <w:shd w:fill="1F3864" w:color="auto" w:val="clear"/>
+            <w:tcMar>
+              <w:top w:type="dxa" w:w="60"/>
+              <w:left w:type="dxa" w:w="100"/>
+              <w:bottom w:type="dxa" w:w="60"/>
+              <w:right w:type="dxa" w:w="100"/>
+            </w:tcMar>
+          </w:tcPr>
+          <w:p>
+            <w:pPr>
+              <w:jc w:val="center"/>
+            </w:pPr>
+            <w:r>
+              <w:rPr>
+                <w:rFonts w:ascii="Arial" w:cs="Arial" w:eastAsia="Arial" w:hAnsi="Arial"/>
+                <w:b/>
+                <w:bCs/>
+                <w:color w:val="FFFFFF"/>
+                <w:sz w:val="18"/>
+                <w:szCs w:val="18"/>
+              </w:rPr>
+              <w:t xml:space="preserve">Users at ≥35 tok/s each</w:t>
+            </w:r>
+          </w:p>
+        </w:tc>
+        <w:tc>
+          <w:tcPr>
+            <w:tcW w:type="dxa" w:w="2590"/>
+            <w:tcBorders>
+              <w:top w:val="single" w:color="BFC7D5" w:sz="4"/>
+              <w:left w:val="single" w:color="BFC7D5" w:sz="4"/>
+              <w:bottom w:val="single" w:color="BFC7D5" w:sz="4"/>
+              <w:right w:val="single" w:color="BFC7D5" w:sz="4"/>
+            </w:tcBorders>
+            <w:shd w:fill="1F3864" w:color="auto" w:val="clear"/>
+            <w:tcMar>
+              <w:top w:type="dxa" w:w="60"/>
+              <w:left w:type="dxa" w:w="100"/>
+              <w:bottom w:type="dxa" w:w="60"/>
+              <w:right w:type="dxa" w:w="100"/>
+            </w:tcMar>
+          </w:tcPr>
+          <w:p>
+            <w:pPr>
+              <w:jc w:val="center"/>
+            </w:pPr>
+            <w:r>
+              <w:rPr>
+                <w:rFonts w:ascii="Arial" w:cs="Arial" w:eastAsia="Arial" w:hAnsi="Arial"/>
+                <w:b/>
+                <w:bCs/>
+                <w:color w:val="FFFFFF"/>
+                <w:sz w:val="18"/>
+                <w:szCs w:val="18"/>
+              </w:rPr>
+              <w:t xml:space="preserve">Peak total output (tok/s)</w:t>
+            </w:r>
+          </w:p>
+        </w:tc>
+        <w:tc>
+          <w:tcPr>
+            <w:tcW w:type="dxa" w:w="3455"/>
+            <w:tcBorders>
+              <w:top w:val="single" w:color="BFC7D5" w:sz="4"/>
+              <w:left w:val="single" w:color="BFC7D5" w:sz="4"/>
+              <w:bottom w:val="single" w:color="BFC7D5" w:sz="4"/>
+              <w:right w:val="single" w:color="BFC7D5" w:sz="4"/>
+            </w:tcBorders>
+            <w:shd w:fill="1F3864" w:color="auto" w:val="clear"/>
+            <w:tcMar>
+              <w:top w:type="dxa" w:w="60"/>
+              <w:left w:type="dxa" w:w="100"/>
+              <w:bottom w:type="dxa" w:w="60"/>
+              <w:right w:type="dxa" w:w="100"/>
+            </w:tcMar>
+          </w:tcPr>
+          <w:p>
+            <w:pPr>
+              <w:jc w:val="center"/>
+            </w:pPr>
+            <w:r>
+              <w:rPr>
+                <w:rFonts w:ascii="Arial" w:cs="Arial" w:eastAsia="Arial" w:hAnsi="Arial"/>
+                <w:b/>
+                <w:bCs/>
+                <w:color w:val="FFFFFF"/>
+                <w:sz w:val="18"/>
+                <w:szCs w:val="18"/>
+              </w:rPr>
+              <w:t xml:space="preserve">Basis</w:t>
+            </w:r>
+          </w:p>
+        </w:tc>
+      </w:tr>
+      <w:tr>
+        <w:tc>
+          <w:tcPr>
+            <w:tcW w:type="dxa" w:w="3453"/>
+            <w:tcBorders>
+              <w:top w:val="single" w:color="BFC7D5" w:sz="4"/>
+              <w:left w:val="single" w:color="BFC7D5" w:sz="4"/>
+              <w:bottom w:val="single" w:color="BFC7D5" w:sz="4"/>
+              <w:right w:val="single" w:color="BFC7D5" w:sz="4"/>
+            </w:tcBorders>
+            <w:tcMar>
+              <w:top w:type="dxa" w:w="60"/>
+              <w:left w:type="dxa" w:w="100"/>
+              <w:bottom w:type="dxa" w:w="60"/>
+              <w:right w:type="dxa" w:w="100"/>
+            </w:tcMar>
+          </w:tcPr>
+          <w:p>
+            <w:pPr>
+              <w:jc w:val="left"/>
+            </w:pPr>
+            <w:r>
+              <w:rPr>
+                <w:rFonts w:ascii="Arial" w:cs="Arial" w:eastAsia="Arial" w:hAnsi="Arial"/>
+                <w:b/>
+                <w:bCs/>
+                <w:sz w:val="18"/>
+                <w:szCs w:val="18"/>
+              </w:rPr>
+              <w:t xml:space="preserve">1× TP=4 (all 4 GPUs, one replica)</w:t>
+            </w:r>
+          </w:p>
+        </w:tc>
+        <w:tc>
+          <w:tcPr>
+            <w:tcW w:type="dxa" w:w="2590"/>
+            <w:tcBorders>
+              <w:top w:val="single" w:color="BFC7D5" w:sz="4"/>
+              <w:left w:val="single" w:color="BFC7D5" w:sz="4"/>
+              <w:bottom w:val="single" w:color="BFC7D5" w:sz="4"/>
+              <w:right w:val="single" w:color="BFC7D5" w:sz="4"/>
+            </w:tcBorders>
+            <w:tcMar>
+              <w:top w:type="dxa" w:w="60"/>
+              <w:left w:type="dxa" w:w="100"/>
+              <w:bottom w:type="dxa" w:w="60"/>
+              <w:right w:type="dxa" w:w="100"/>
+            </w:tcMar>
+          </w:tcPr>
+          <w:p>
+            <w:pPr>
+              <w:jc w:val="right"/>
+            </w:pPr>
+            <w:r>
+              <w:rPr>
+                <w:rFonts w:ascii="Arial" w:cs="Arial" w:eastAsia="Arial" w:hAnsi="Arial"/>
+                <w:b w:val="false"/>
+                <w:bCs w:val="false"/>
+                <w:sz w:val="18"/>
+                <w:szCs w:val="18"/>
+              </w:rPr>
+              <w:t xml:space="preserve">72</w:t>
+            </w:r>
+          </w:p>
+        </w:tc>
+        <w:tc>
+          <w:tcPr>
+            <w:tcW w:type="dxa" w:w="2590"/>
+            <w:tcBorders>
+              <w:top w:val="single" w:color="BFC7D5" w:sz="4"/>
+              <w:left w:val="single" w:color="BFC7D5" w:sz="4"/>
+              <w:bottom w:val="single" w:color="BFC7D5" w:sz="4"/>
+              <w:right w:val="single" w:color="BFC7D5" w:sz="4"/>
+            </w:tcBorders>
+            <w:tcMar>
+              <w:top w:type="dxa" w:w="60"/>
+              <w:left w:type="dxa" w:w="100"/>
+              <w:bottom w:type="dxa" w:w="60"/>
+              <w:right w:type="dxa" w:w="100"/>
+            </w:tcMar>
+          </w:tcPr>
+          <w:p>
+            <w:pPr>
+              <w:jc w:val="right"/>
+            </w:pPr>
+            <w:r>
+              <w:rPr>
+                <w:rFonts w:ascii="Arial" w:cs="Arial" w:eastAsia="Arial" w:hAnsi="Arial"/>
+                <w:b w:val="false"/>
+                <w:bCs w:val="false"/>
+                <w:sz w:val="18"/>
+                <w:szCs w:val="18"/>
+              </w:rPr>
+              <w:t xml:space="preserve">4</w:t>
+            </w:r>
+          </w:p>
+        </w:tc>
+        <w:tc>
+          <w:tcPr>
+            <w:tcW w:type="dxa" w:w="2590"/>
+            <w:tcBorders>
+              <w:top w:val="single" w:color="BFC7D5" w:sz="4"/>
+              <w:left w:val="single" w:color="BFC7D5" w:sz="4"/>
+              <w:bottom w:val="single" w:color="BFC7D5" w:sz="4"/>
+              <w:right w:val="single" w:color="BFC7D5" w:sz="4"/>
+            </w:tcBorders>
+            <w:tcMar>
+              <w:top w:type="dxa" w:w="60"/>
+              <w:left w:type="dxa" w:w="100"/>
+              <w:bottom w:type="dxa" w:w="60"/>
+              <w:right w:type="dxa" w:w="100"/>
+            </w:tcMar>
+          </w:tcPr>
+          <w:p>
+            <w:pPr>
+              <w:jc w:val="right"/>
+            </w:pPr>
+            <w:r>
+              <w:rPr>
+                <w:rFonts w:ascii="Arial" w:cs="Arial" w:eastAsia="Arial" w:hAnsi="Arial"/>
+                <w:b w:val="false"/>
+                <w:bCs w:val="false"/>
+                <w:sz w:val="18"/>
+                <w:szCs w:val="18"/>
+              </w:rPr>
+              <w:t xml:space="preserve">185</w:t>
+            </w:r>
+          </w:p>
+        </w:tc>
+        <w:tc>
+          <w:tcPr>
+            <w:tcW w:type="dxa" w:w="3455"/>
+            <w:tcBorders>
+              <w:top w:val="single" w:color="BFC7D5" w:sz="4"/>
+              <w:left w:val="single" w:color="BFC7D5" w:sz="4"/>
+              <w:bottom w:val="single" w:color="BFC7D5" w:sz="4"/>
+              <w:right w:val="single" w:color="BFC7D5" w:sz="4"/>
+            </w:tcBorders>
+            <w:tcMar>
+              <w:top w:type="dxa" w:w="60"/>
+              <w:left w:type="dxa" w:w="100"/>
+              <w:bottom w:type="dxa" w:w="60"/>
+              <w:right w:type="dxa" w:w="100"/>
+            </w:tcMar>
+          </w:tcPr>
+          <w:p>
+            <w:pPr>
+              <w:jc w:val="left"/>
+            </w:pPr>
+            <w:r>
+              <w:rPr>
+                <w:rFonts w:ascii="Arial" w:cs="Arial" w:eastAsia="Arial" w:hAnsi="Arial"/>
+                <w:b w:val="false"/>
+                <w:bCs w:val="false"/>
+                <w:sz w:val="18"/>
+                <w:szCs w:val="18"/>
+              </w:rPr>
+              <w:t xml:space="preserve">Measured</w:t>
+            </w:r>
+          </w:p>
+        </w:tc>
+      </w:tr>
+      <w:tr>
+        <w:tc>
+          <w:tcPr>
+            <w:tcW w:type="dxa" w:w="3453"/>
+            <w:tcBorders>
+              <w:top w:val="single" w:color="BFC7D5" w:sz="4"/>
+              <w:left w:val="single" w:color="BFC7D5" w:sz="4"/>
+              <w:bottom w:val="single" w:color="BFC7D5" w:sz="4"/>
+              <w:right w:val="single" w:color="BFC7D5" w:sz="4"/>
+            </w:tcBorders>
+            <w:shd w:fill="F2F5FA" w:color="auto" w:val="clear"/>
+            <w:tcMar>
+              <w:top w:type="dxa" w:w="60"/>
+              <w:left w:type="dxa" w:w="100"/>
+              <w:bottom w:type="dxa" w:w="60"/>
+              <w:right w:type="dxa" w:w="100"/>
+            </w:tcMar>
+          </w:tcPr>
+          <w:p>
+            <w:pPr>
+              <w:jc w:val="left"/>
+            </w:pPr>
+            <w:r>
+              <w:rPr>
+                <w:rFonts w:ascii="Arial" w:cs="Arial" w:eastAsia="Arial" w:hAnsi="Arial"/>
+                <w:b/>
+                <w:bCs/>
+                <w:sz w:val="18"/>
+                <w:szCs w:val="18"/>
+              </w:rPr>
+              <w:t xml:space="preserve">4× TP=1 (one replica per GPU)</w:t>
+            </w:r>
+          </w:p>
+        </w:tc>
+        <w:tc>
+          <w:tcPr>
+            <w:tcW w:type="dxa" w:w="2590"/>
+            <w:tcBorders>
+              <w:top w:val="single" w:color="BFC7D5" w:sz="4"/>
+              <w:left w:val="single" w:color="BFC7D5" w:sz="4"/>
+              <w:bottom w:val="single" w:color="BFC7D5" w:sz="4"/>
+              <w:right w:val="single" w:color="BFC7D5" w:sz="4"/>
+            </w:tcBorders>
+            <w:shd w:fill="F2F5FA" w:color="auto" w:val="clear"/>
+            <w:tcMar>
+              <w:top w:type="dxa" w:w="60"/>
+              <w:left w:type="dxa" w:w="100"/>
+              <w:bottom w:type="dxa" w:w="60"/>
+              <w:right w:type="dxa" w:w="100"/>
+            </w:tcMar>
+          </w:tcPr>
+          <w:p>
+            <w:pPr>
+              <w:jc w:val="right"/>
+            </w:pPr>
+            <w:r>
+              <w:rPr>
+                <w:rFonts w:ascii="Arial" w:cs="Arial" w:eastAsia="Arial" w:hAnsi="Arial"/>
+                <w:b w:val="false"/>
+                <w:bCs w:val="false"/>
+                <w:sz w:val="18"/>
+                <w:szCs w:val="18"/>
+              </w:rPr>
+              <w:t xml:space="preserve">26</w:t>
+            </w:r>
+          </w:p>
+        </w:tc>
+        <w:tc>
+          <w:tcPr>
+            <w:tcW w:type="dxa" w:w="2590"/>
+            <w:tcBorders>
+              <w:top w:val="single" w:color="BFC7D5" w:sz="4"/>
+              <w:left w:val="single" w:color="BFC7D5" w:sz="4"/>
+              <w:bottom w:val="single" w:color="BFC7D5" w:sz="4"/>
+              <w:right w:val="single" w:color="BFC7D5" w:sz="4"/>
+            </w:tcBorders>
+            <w:shd w:fill="F2F5FA" w:color="auto" w:val="clear"/>
+            <w:tcMar>
+              <w:top w:type="dxa" w:w="60"/>
+              <w:left w:type="dxa" w:w="100"/>
+              <w:bottom w:type="dxa" w:w="60"/>
+              <w:right w:type="dxa" w:w="100"/>
+            </w:tcMar>
+          </w:tcPr>
+          <w:p>
+            <w:pPr>
+              <w:jc w:val="right"/>
+            </w:pPr>
+            <w:r>
+              <w:rPr>
+                <w:rFonts w:ascii="Arial" w:cs="Arial" w:eastAsia="Arial" w:hAnsi="Arial"/>
+                <w:b w:val="false"/>
+                <w:bCs w:val="false"/>
+                <w:sz w:val="18"/>
+                <w:szCs w:val="18"/>
+              </w:rPr>
+              <w:t xml:space="preserve">none (per-user speed &lt; 35)</w:t>
+            </w:r>
+          </w:p>
+        </w:tc>
+        <w:tc>
+          <w:tcPr>
+            <w:tcW w:type="dxa" w:w="2590"/>
+            <w:tcBorders>
+              <w:top w:val="single" w:color="BFC7D5" w:sz="4"/>
+              <w:left w:val="single" w:color="BFC7D5" w:sz="4"/>
+              <w:bottom w:val="single" w:color="BFC7D5" w:sz="4"/>
+              <w:right w:val="single" w:color="BFC7D5" w:sz="4"/>
+            </w:tcBorders>
+            <w:shd w:fill="F2F5FA" w:color="auto" w:val="clear"/>
+            <w:tcMar>
+              <w:top w:type="dxa" w:w="60"/>
+              <w:left w:type="dxa" w:w="100"/>
+              <w:bottom w:type="dxa" w:w="60"/>
+              <w:right w:type="dxa" w:w="100"/>
+            </w:tcMar>
+          </w:tcPr>
+          <w:p>
+            <w:pPr>
+              <w:jc w:val="right"/>
+            </w:pPr>
+            <w:r>
+              <w:rPr>
+                <w:rFonts w:ascii="Arial" w:cs="Arial" w:eastAsia="Arial" w:hAnsi="Arial"/>
+                <w:b w:val="false"/>
+                <w:bCs w:val="false"/>
+                <w:sz w:val="18"/>
+                <w:szCs w:val="18"/>
+              </w:rPr>
+              <w:t xml:space="preserve">~840</w:t>
+            </w:r>
+          </w:p>
+        </w:tc>
+        <w:tc>
+          <w:tcPr>
+            <w:tcW w:type="dxa" w:w="3455"/>
+            <w:tcBorders>
+              <w:top w:val="single" w:color="BFC7D5" w:sz="4"/>
+              <w:left w:val="single" w:color="BFC7D5" w:sz="4"/>
+              <w:bottom w:val="single" w:color="BFC7D5" w:sz="4"/>
+              <w:right w:val="single" w:color="BFC7D5" w:sz="4"/>
+            </w:tcBorders>
+            <w:shd w:fill="F2F5FA" w:color="auto" w:val="clear"/>
+            <w:tcMar>
+              <w:top w:type="dxa" w:w="60"/>
+              <w:left w:type="dxa" w:w="100"/>
+              <w:bottom w:type="dxa" w:w="60"/>
+              <w:right w:type="dxa" w:w="100"/>
+            </w:tcMar>
+          </w:tcPr>
+          <w:p>
+            <w:pPr>
+              <w:jc w:val="left"/>
+            </w:pPr>
+            <w:r>
+              <w:rPr>
+                <w:rFonts w:ascii="Arial" w:cs="Arial" w:eastAsia="Arial" w:hAnsi="Arial"/>
+                <w:b w:val="false"/>
+                <w:bCs w:val="false"/>
+                <w:sz w:val="18"/>
+                <w:szCs w:val="18"/>
+              </w:rPr>
+              <w:t xml:space="preserve">Estimated: 4 × measured single-GPU plateau</w:t>
+            </w:r>
+          </w:p>
+        </w:tc>
+      </w:tr>
+      <w:tr>
+        <w:tc>
+          <w:tcPr>
+            <w:tcW w:type="dxa" w:w="3453"/>
+            <w:tcBorders>
+              <w:top w:val="single" w:color="BFC7D5" w:sz="4"/>
+              <w:left w:val="single" w:color="BFC7D5" w:sz="4"/>
+              <w:bottom w:val="single" w:color="BFC7D5" w:sz="4"/>
+              <w:right w:val="single" w:color="BFC7D5" w:sz="4"/>
+            </w:tcBorders>
+            <w:shd w:fill="EDEDED" w:color="auto" w:val="clear"/>
+            <w:tcMar>
+              <w:top w:type="dxa" w:w="60"/>
+              <w:left w:type="dxa" w:w="100"/>
+              <w:bottom w:type="dxa" w:w="60"/>
+              <w:right w:type="dxa" w:w="100"/>
+            </w:tcMar>
+          </w:tcPr>
+          <w:p>
+            <w:pPr>
+              <w:jc w:val="left"/>
+            </w:pPr>
+            <w:r>
+              <w:rPr>
+                <w:rFonts w:ascii="Arial" w:cs="Arial" w:eastAsia="Arial" w:hAnsi="Arial"/>
+                <w:b/>
+                <w:bCs/>
+                <w:sz w:val="18"/>
+                <w:szCs w:val="18"/>
+              </w:rPr>
+              <w:t xml:space="preserve">2× TP=2 (two replicas of 2 GPUs)</w:t>
+            </w:r>
+          </w:p>
+        </w:tc>
+        <w:tc>
+          <w:tcPr>
+            <w:tcW w:type="dxa" w:w="2590"/>
+            <w:tcBorders>
+              <w:top w:val="single" w:color="BFC7D5" w:sz="4"/>
+              <w:left w:val="single" w:color="BFC7D5" w:sz="4"/>
+              <w:bottom w:val="single" w:color="BFC7D5" w:sz="4"/>
+              <w:right w:val="single" w:color="BFC7D5" w:sz="4"/>
+            </w:tcBorders>
+            <w:shd w:fill="EDEDED" w:color="auto" w:val="clear"/>
+            <w:tcMar>
+              <w:top w:type="dxa" w:w="60"/>
+              <w:left w:type="dxa" w:w="100"/>
+              <w:bottom w:type="dxa" w:w="60"/>
+              <w:right w:type="dxa" w:w="100"/>
+            </w:tcMar>
+          </w:tcPr>
+          <w:p>
+            <w:pPr>
+              <w:jc w:val="right"/>
+            </w:pPr>
+            <w:r>
+              <w:rPr>
+                <w:rFonts w:ascii="Arial" w:cs="Arial" w:eastAsia="Arial" w:hAnsi="Arial"/>
+                <w:b w:val="false"/>
+                <w:bCs w:val="false"/>
+                <w:sz w:val="18"/>
+                <w:szCs w:val="18"/>
+              </w:rPr>
+              <w:t xml:space="preserve">not measured</w:t>
+            </w:r>
+          </w:p>
+        </w:tc>
+        <w:tc>
+          <w:tcPr>
+            <w:tcW w:type="dxa" w:w="2590"/>
+            <w:tcBorders>
+              <w:top w:val="single" w:color="BFC7D5" w:sz="4"/>
+              <w:left w:val="single" w:color="BFC7D5" w:sz="4"/>
+              <w:bottom w:val="single" w:color="BFC7D5" w:sz="4"/>
+              <w:right w:val="single" w:color="BFC7D5" w:sz="4"/>
+            </w:tcBorders>
+            <w:shd w:fill="EDEDED" w:color="auto" w:val="clear"/>
+            <w:tcMar>
+              <w:top w:type="dxa" w:w="60"/>
+              <w:left w:type="dxa" w:w="100"/>
+              <w:bottom w:type="dxa" w:w="60"/>
+              <w:right w:type="dxa" w:w="100"/>
+            </w:tcMar>
+          </w:tcPr>
+          <w:p>
+            <w:pPr>
+              <w:jc w:val="right"/>
+            </w:pPr>
+            <w:r>
+              <w:rPr>
+                <w:rFonts w:ascii="Arial" w:cs="Arial" w:eastAsia="Arial" w:hAnsi="Arial"/>
+                <w:b w:val="false"/>
+                <w:bCs w:val="false"/>
+                <w:sz w:val="18"/>
+                <w:szCs w:val="18"/>
+              </w:rPr>
+              <w:t xml:space="preserve">not measured</w:t>
+            </w:r>
+          </w:p>
+        </w:tc>
+        <w:tc>
+          <w:tcPr>
+            <w:tcW w:type="dxa" w:w="2590"/>
+            <w:tcBorders>
+              <w:top w:val="single" w:color="BFC7D5" w:sz="4"/>
+              <w:left w:val="single" w:color="BFC7D5" w:sz="4"/>
+              <w:bottom w:val="single" w:color="BFC7D5" w:sz="4"/>
+              <w:right w:val="single" w:color="BFC7D5" w:sz="4"/>
+            </w:tcBorders>
+            <w:shd w:fill="EDEDED" w:color="auto" w:val="clear"/>
+            <w:tcMar>
+              <w:top w:type="dxa" w:w="60"/>
+              <w:left w:type="dxa" w:w="100"/>
+              <w:bottom w:type="dxa" w:w="60"/>
+              <w:right w:type="dxa" w:w="100"/>
+            </w:tcMar>
+          </w:tcPr>
+          <w:p>
+            <w:pPr>
+              <w:jc w:val="right"/>
+            </w:pPr>
+            <w:r>
+              <w:rPr>
+                <w:rFonts w:ascii="Arial" w:cs="Arial" w:eastAsia="Arial" w:hAnsi="Arial"/>
+                <w:b w:val="false"/>
+                <w:bCs w:val="false"/>
+                <w:sz w:val="18"/>
+                <w:szCs w:val="18"/>
+              </w:rPr>
+              <w:t xml:space="preserve">not measured</w:t>
+            </w:r>
+          </w:p>
+        </w:tc>
+        <w:tc>
+          <w:tcPr>
+            <w:tcW w:type="dxa" w:w="3455"/>
+            <w:tcBorders>
+              <w:top w:val="single" w:color="BFC7D5" w:sz="4"/>
+              <w:left w:val="single" w:color="BFC7D5" w:sz="4"/>
+              <w:bottom w:val="single" w:color="BFC7D5" w:sz="4"/>
+              <w:right w:val="single" w:color="BFC7D5" w:sz="4"/>
+            </w:tcBorders>
+            <w:shd w:fill="EDEDED" w:color="auto" w:val="clear"/>
+            <w:tcMar>
+              <w:top w:type="dxa" w:w="60"/>
+              <w:left w:type="dxa" w:w="100"/>
+              <w:bottom w:type="dxa" w:w="60"/>
+              <w:right w:type="dxa" w:w="100"/>
+            </w:tcMar>
+          </w:tcPr>
+          <w:p>
+            <w:pPr>
+              <w:jc w:val="left"/>
+            </w:pPr>
+            <w:r>
+              <w:rPr>
+                <w:rFonts w:ascii="Arial" w:cs="Arial" w:eastAsia="Arial" w:hAnsi="Arial"/>
+                <w:b w:val="false"/>
+                <w:bCs w:val="false"/>
+                <w:sz w:val="18"/>
+                <w:szCs w:val="18"/>
+              </w:rPr>
+              <w:t xml:space="preserve">Next test: vLLM's custom all-reduce works on 2 PCIe GPUs (disabled for 4)</w:t>
+            </w:r>
+          </w:p>
+        </w:tc>
+      </w:tr>
+    </w:tbl>
+    <w:p>
+      <w:pPr>
+        <w:spacing w:before="80" w:after="200"/>
+      </w:pPr>
+      <w:r>
+        <w:rPr>
+          <w:rFonts w:ascii="Arial" w:cs="Arial" w:eastAsia="Arial" w:hAnsi="Arial"/>
+          <w:i/>
+          <w:iCs/>
+          <w:color w:val="595959"/>
+          <w:sz w:val="18"/>
+          <w:szCs w:val="18"/>
+        </w:rPr>
+        <w:t xml:space="preserve">TP=4 telemetry under saturation: ~190 W average per GPU at 100% SM busy, i.e. the GPUs mostly wait on the PCIe all-reduce. A single GPU (TP=1) under the same load runs at ~500 W average.</w:t>
       </w:r>
     </w:p>
     <w:p>
@@ -10632,6 +13214,465 @@
                 <w:szCs w:val="18"/>
               </w:rPr>
               <w:t xml:space="preserve">2,352</w:t>
+            </w:r>
+          </w:p>
+        </w:tc>
+      </w:tr>
+      <w:tr>
+        <w:tc>
+          <w:tcPr>
+            <w:tcW w:type="dxa" w:w="3669"/>
+            <w:tcBorders>
+              <w:top w:val="single" w:color="BFC7D5" w:sz="4"/>
+              <w:left w:val="single" w:color="BFC7D5" w:sz="4"/>
+              <w:bottom w:val="single" w:color="BFC7D5" w:sz="4"/>
+              <w:right w:val="single" w:color="BFC7D5" w:sz="4"/>
+            </w:tcBorders>
+            <w:shd w:fill="F2F5FA" w:color="auto" w:val="clear"/>
+            <w:tcMar>
+              <w:top w:type="dxa" w:w="60"/>
+              <w:left w:type="dxa" w:w="100"/>
+              <w:bottom w:type="dxa" w:w="60"/>
+              <w:right w:type="dxa" w:w="100"/>
+            </w:tcMar>
+          </w:tcPr>
+          <w:p>
+            <w:pPr>
+              <w:jc w:val="left"/>
+            </w:pPr>
+            <w:r>
+              <w:rPr>
+                <w:rFonts w:ascii="Arial" w:cs="Arial" w:eastAsia="Arial" w:hAnsi="Arial"/>
+                <w:b/>
+                <w:bCs/>
+                <w:sz w:val="18"/>
+                <w:szCs w:val="18"/>
+              </w:rPr>
+              <w:t xml:space="preserve">TP=4 — concurrency sweep</w:t>
+            </w:r>
+          </w:p>
+        </w:tc>
+        <w:tc>
+          <w:tcPr>
+            <w:tcW w:type="dxa" w:w="1834"/>
+            <w:tcBorders>
+              <w:top w:val="single" w:color="BFC7D5" w:sz="4"/>
+              <w:left w:val="single" w:color="BFC7D5" w:sz="4"/>
+              <w:bottom w:val="single" w:color="BFC7D5" w:sz="4"/>
+              <w:right w:val="single" w:color="BFC7D5" w:sz="4"/>
+            </w:tcBorders>
+            <w:shd w:fill="F2F5FA" w:color="auto" w:val="clear"/>
+            <w:tcMar>
+              <w:top w:type="dxa" w:w="60"/>
+              <w:left w:type="dxa" w:w="100"/>
+              <w:bottom w:type="dxa" w:w="60"/>
+              <w:right w:type="dxa" w:w="100"/>
+            </w:tcMar>
+          </w:tcPr>
+          <w:p>
+            <w:pPr>
+              <w:jc w:val="right"/>
+            </w:pPr>
+            <w:r>
+              <w:rPr>
+                <w:rFonts w:ascii="Arial" w:cs="Arial" w:eastAsia="Arial" w:hAnsi="Arial"/>
+                <w:b w:val="false"/>
+                <w:bCs w:val="false"/>
+                <w:sz w:val="18"/>
+                <w:szCs w:val="18"/>
+              </w:rPr>
+              <w:t xml:space="preserve">4</w:t>
+            </w:r>
+          </w:p>
+        </w:tc>
+        <w:tc>
+          <w:tcPr>
+            <w:tcW w:type="dxa" w:w="1834"/>
+            <w:tcBorders>
+              <w:top w:val="single" w:color="BFC7D5" w:sz="4"/>
+              <w:left w:val="single" w:color="BFC7D5" w:sz="4"/>
+              <w:bottom w:val="single" w:color="BFC7D5" w:sz="4"/>
+              <w:right w:val="single" w:color="BFC7D5" w:sz="4"/>
+            </w:tcBorders>
+            <w:shd w:fill="F2F5FA" w:color="auto" w:val="clear"/>
+            <w:tcMar>
+              <w:top w:type="dxa" w:w="60"/>
+              <w:left w:type="dxa" w:w="100"/>
+              <w:bottom w:type="dxa" w:w="60"/>
+              <w:right w:type="dxa" w:w="100"/>
+            </w:tcMar>
+          </w:tcPr>
+          <w:p>
+            <w:pPr>
+              <w:jc w:val="right"/>
+            </w:pPr>
+            <w:r>
+              <w:rPr>
+                <w:rFonts w:ascii="Arial" w:cs="Arial" w:eastAsia="Arial" w:hAnsi="Arial"/>
+                <w:b w:val="false"/>
+                <w:bCs w:val="false"/>
+                <w:sz w:val="18"/>
+                <w:szCs w:val="18"/>
+              </w:rPr>
+              <w:t xml:space="preserve">188</w:t>
+            </w:r>
+          </w:p>
+        </w:tc>
+        <w:tc>
+          <w:tcPr>
+            <w:tcW w:type="dxa" w:w="1834"/>
+            <w:tcBorders>
+              <w:top w:val="single" w:color="BFC7D5" w:sz="4"/>
+              <w:left w:val="single" w:color="BFC7D5" w:sz="4"/>
+              <w:bottom w:val="single" w:color="BFC7D5" w:sz="4"/>
+              <w:right w:val="single" w:color="BFC7D5" w:sz="4"/>
+            </w:tcBorders>
+            <w:shd w:fill="F2F5FA" w:color="auto" w:val="clear"/>
+            <w:tcMar>
+              <w:top w:type="dxa" w:w="60"/>
+              <w:left w:type="dxa" w:w="100"/>
+              <w:bottom w:type="dxa" w:w="60"/>
+              <w:right w:type="dxa" w:w="100"/>
+            </w:tcMar>
+          </w:tcPr>
+          <w:p>
+            <w:pPr>
+              <w:jc w:val="right"/>
+            </w:pPr>
+            <w:r>
+              <w:rPr>
+                <w:rFonts w:ascii="Arial" w:cs="Arial" w:eastAsia="Arial" w:hAnsi="Arial"/>
+                <w:b w:val="false"/>
+                <w:bCs w:val="false"/>
+                <w:sz w:val="18"/>
+                <w:szCs w:val="18"/>
+              </w:rPr>
+              <w:t xml:space="preserve">304</w:t>
+            </w:r>
+          </w:p>
+        </w:tc>
+        <w:tc>
+          <w:tcPr>
+            <w:tcW w:type="dxa" w:w="1834"/>
+            <w:tcBorders>
+              <w:top w:val="single" w:color="BFC7D5" w:sz="4"/>
+              <w:left w:val="single" w:color="BFC7D5" w:sz="4"/>
+              <w:bottom w:val="single" w:color="BFC7D5" w:sz="4"/>
+              <w:right w:val="single" w:color="BFC7D5" w:sz="4"/>
+            </w:tcBorders>
+            <w:shd w:fill="F2F5FA" w:color="auto" w:val="clear"/>
+            <w:tcMar>
+              <w:top w:type="dxa" w:w="60"/>
+              <w:left w:type="dxa" w:w="100"/>
+              <w:bottom w:type="dxa" w:w="60"/>
+              <w:right w:type="dxa" w:w="100"/>
+            </w:tcMar>
+          </w:tcPr>
+          <w:p>
+            <w:pPr>
+              <w:jc w:val="right"/>
+            </w:pPr>
+            <w:r>
+              <w:rPr>
+                <w:rFonts w:ascii="Arial" w:cs="Arial" w:eastAsia="Arial" w:hAnsi="Arial"/>
+                <w:b w:val="false"/>
+                <w:bCs w:val="false"/>
+                <w:sz w:val="18"/>
+                <w:szCs w:val="18"/>
+              </w:rPr>
+              <w:t xml:space="preserve">47</w:t>
+            </w:r>
+          </w:p>
+        </w:tc>
+        <w:tc>
+          <w:tcPr>
+            <w:tcW w:type="dxa" w:w="1834"/>
+            <w:tcBorders>
+              <w:top w:val="single" w:color="BFC7D5" w:sz="4"/>
+              <w:left w:val="single" w:color="BFC7D5" w:sz="4"/>
+              <w:bottom w:val="single" w:color="BFC7D5" w:sz="4"/>
+              <w:right w:val="single" w:color="BFC7D5" w:sz="4"/>
+            </w:tcBorders>
+            <w:shd w:fill="F2F5FA" w:color="auto" w:val="clear"/>
+            <w:tcMar>
+              <w:top w:type="dxa" w:w="60"/>
+              <w:left w:type="dxa" w:w="100"/>
+              <w:bottom w:type="dxa" w:w="60"/>
+              <w:right w:type="dxa" w:w="100"/>
+            </w:tcMar>
+          </w:tcPr>
+          <w:p>
+            <w:pPr>
+              <w:jc w:val="right"/>
+            </w:pPr>
+            <w:r>
+              <w:rPr>
+                <w:rFonts w:ascii="Arial" w:cs="Arial" w:eastAsia="Arial" w:hAnsi="Arial"/>
+                <w:b w:val="false"/>
+                <w:bCs w:val="false"/>
+                <w:sz w:val="18"/>
+                <w:szCs w:val="18"/>
+              </w:rPr>
+              <w:t xml:space="preserve">100</w:t>
+            </w:r>
+          </w:p>
+        </w:tc>
+        <w:tc>
+          <w:tcPr>
+            <w:tcW w:type="dxa" w:w="1839"/>
+            <w:tcBorders>
+              <w:top w:val="single" w:color="BFC7D5" w:sz="4"/>
+              <w:left w:val="single" w:color="BFC7D5" w:sz="4"/>
+              <w:bottom w:val="single" w:color="BFC7D5" w:sz="4"/>
+              <w:right w:val="single" w:color="BFC7D5" w:sz="4"/>
+            </w:tcBorders>
+            <w:shd w:fill="F2F5FA" w:color="auto" w:val="clear"/>
+            <w:tcMar>
+              <w:top w:type="dxa" w:w="60"/>
+              <w:left w:type="dxa" w:w="100"/>
+              <w:bottom w:type="dxa" w:w="60"/>
+              <w:right w:type="dxa" w:w="100"/>
+            </w:tcMar>
+          </w:tcPr>
+          <w:p>
+            <w:pPr>
+              <w:jc w:val="right"/>
+            </w:pPr>
+            <w:r>
+              <w:rPr>
+                <w:rFonts w:ascii="Arial" w:cs="Arial" w:eastAsia="Arial" w:hAnsi="Arial"/>
+                <w:b w:val="false"/>
+                <w:bCs w:val="false"/>
+                <w:sz w:val="18"/>
+                <w:szCs w:val="18"/>
+              </w:rPr>
+              <w:t xml:space="preserve">2,352</w:t>
+            </w:r>
+          </w:p>
+        </w:tc>
+      </w:tr>
+      <w:tr>
+        <w:tc>
+          <w:tcPr>
+            <w:tcW w:type="dxa" w:w="3669"/>
+            <w:tcBorders>
+              <w:top w:val="single" w:color="BFC7D5" w:sz="4"/>
+              <w:left w:val="single" w:color="BFC7D5" w:sz="4"/>
+              <w:bottom w:val="single" w:color="BFC7D5" w:sz="4"/>
+              <w:right w:val="single" w:color="BFC7D5" w:sz="4"/>
+            </w:tcBorders>
+            <w:tcMar>
+              <w:top w:type="dxa" w:w="60"/>
+              <w:left w:type="dxa" w:w="100"/>
+              <w:bottom w:type="dxa" w:w="60"/>
+              <w:right w:type="dxa" w:w="100"/>
+            </w:tcMar>
+          </w:tcPr>
+          <w:p>
+            <w:pPr>
+              <w:jc w:val="left"/>
+            </w:pPr>
+            <w:r>
+              <w:rPr>
+                <w:rFonts w:ascii="Arial" w:cs="Arial" w:eastAsia="Arial" w:hAnsi="Arial"/>
+                <w:b/>
+                <w:bCs/>
+                <w:sz w:val="18"/>
+                <w:szCs w:val="18"/>
+              </w:rPr>
+              <w:t xml:space="preserve">TP=1 — concurrency sweep</w:t>
+            </w:r>
+          </w:p>
+        </w:tc>
+        <w:tc>
+          <w:tcPr>
+            <w:tcW w:type="dxa" w:w="1834"/>
+            <w:tcBorders>
+              <w:top w:val="single" w:color="BFC7D5" w:sz="4"/>
+              <w:left w:val="single" w:color="BFC7D5" w:sz="4"/>
+              <w:bottom w:val="single" w:color="BFC7D5" w:sz="4"/>
+              <w:right w:val="single" w:color="BFC7D5" w:sz="4"/>
+            </w:tcBorders>
+            <w:tcMar>
+              <w:top w:type="dxa" w:w="60"/>
+              <w:left w:type="dxa" w:w="100"/>
+              <w:bottom w:type="dxa" w:w="60"/>
+              <w:right w:type="dxa" w:w="100"/>
+            </w:tcMar>
+          </w:tcPr>
+          <w:p>
+            <w:pPr>
+              <w:jc w:val="right"/>
+            </w:pPr>
+            <w:r>
+              <w:rPr>
+                <w:rFonts w:ascii="Arial" w:cs="Arial" w:eastAsia="Arial" w:hAnsi="Arial"/>
+                <w:b w:val="false"/>
+                <w:bCs w:val="false"/>
+                <w:sz w:val="18"/>
+                <w:szCs w:val="18"/>
+              </w:rPr>
+              <w:t xml:space="preserve">1</w:t>
+            </w:r>
+          </w:p>
+        </w:tc>
+        <w:tc>
+          <w:tcPr>
+            <w:tcW w:type="dxa" w:w="1834"/>
+            <w:tcBorders>
+              <w:top w:val="single" w:color="BFC7D5" w:sz="4"/>
+              <w:left w:val="single" w:color="BFC7D5" w:sz="4"/>
+              <w:bottom w:val="single" w:color="BFC7D5" w:sz="4"/>
+              <w:right w:val="single" w:color="BFC7D5" w:sz="4"/>
+            </w:tcBorders>
+            <w:tcMar>
+              <w:top w:type="dxa" w:w="60"/>
+              <w:left w:type="dxa" w:w="100"/>
+              <w:bottom w:type="dxa" w:w="60"/>
+              <w:right w:type="dxa" w:w="100"/>
+            </w:tcMar>
+          </w:tcPr>
+          <w:p>
+            <w:pPr>
+              <w:jc w:val="right"/>
+            </w:pPr>
+            <w:r>
+              <w:rPr>
+                <w:rFonts w:ascii="Arial" w:cs="Arial" w:eastAsia="Arial" w:hAnsi="Arial"/>
+                <w:b w:val="false"/>
+                <w:bCs w:val="false"/>
+                <w:sz w:val="18"/>
+                <w:szCs w:val="18"/>
+              </w:rPr>
+              <w:t xml:space="preserve">508</w:t>
+            </w:r>
+          </w:p>
+        </w:tc>
+        <w:tc>
+          <w:tcPr>
+            <w:tcW w:type="dxa" w:w="1834"/>
+            <w:tcBorders>
+              <w:top w:val="single" w:color="BFC7D5" w:sz="4"/>
+              <w:left w:val="single" w:color="BFC7D5" w:sz="4"/>
+              <w:bottom w:val="single" w:color="BFC7D5" w:sz="4"/>
+              <w:right w:val="single" w:color="BFC7D5" w:sz="4"/>
+            </w:tcBorders>
+            <w:tcMar>
+              <w:top w:type="dxa" w:w="60"/>
+              <w:left w:type="dxa" w:w="100"/>
+              <w:bottom w:type="dxa" w:w="60"/>
+              <w:right w:type="dxa" w:w="100"/>
+            </w:tcMar>
+          </w:tcPr>
+          <w:p>
+            <w:pPr>
+              <w:jc w:val="right"/>
+            </w:pPr>
+            <w:r>
+              <w:rPr>
+                <w:rFonts w:ascii="Arial" w:cs="Arial" w:eastAsia="Arial" w:hAnsi="Arial"/>
+                <w:b w:val="false"/>
+                <w:bCs w:val="false"/>
+                <w:sz w:val="18"/>
+                <w:szCs w:val="18"/>
+              </w:rPr>
+              <w:t xml:space="preserve">601</w:t>
+            </w:r>
+          </w:p>
+        </w:tc>
+        <w:tc>
+          <w:tcPr>
+            <w:tcW w:type="dxa" w:w="1834"/>
+            <w:tcBorders>
+              <w:top w:val="single" w:color="BFC7D5" w:sz="4"/>
+              <w:left w:val="single" w:color="BFC7D5" w:sz="4"/>
+              <w:bottom w:val="single" w:color="BFC7D5" w:sz="4"/>
+              <w:right w:val="single" w:color="BFC7D5" w:sz="4"/>
+            </w:tcBorders>
+            <w:tcMar>
+              <w:top w:type="dxa" w:w="60"/>
+              <w:left w:type="dxa" w:w="100"/>
+              <w:bottom w:type="dxa" w:w="60"/>
+              <w:right w:type="dxa" w:w="100"/>
+            </w:tcMar>
+          </w:tcPr>
+          <w:p>
+            <w:pPr>
+              <w:jc w:val="right"/>
+            </w:pPr>
+            <w:r>
+              <w:rPr>
+                <w:rFonts w:ascii="Arial" w:cs="Arial" w:eastAsia="Arial" w:hAnsi="Arial"/>
+                <w:b w:val="false"/>
+                <w:bCs w:val="false"/>
+                <w:sz w:val="18"/>
+                <w:szCs w:val="18"/>
+              </w:rPr>
+              <w:t xml:space="preserve">77</w:t>
+            </w:r>
+          </w:p>
+        </w:tc>
+        <w:tc>
+          <w:tcPr>
+            <w:tcW w:type="dxa" w:w="1834"/>
+            <w:tcBorders>
+              <w:top w:val="single" w:color="BFC7D5" w:sz="4"/>
+              <w:left w:val="single" w:color="BFC7D5" w:sz="4"/>
+              <w:bottom w:val="single" w:color="BFC7D5" w:sz="4"/>
+              <w:right w:val="single" w:color="BFC7D5" w:sz="4"/>
+            </w:tcBorders>
+            <w:tcMar>
+              <w:top w:type="dxa" w:w="60"/>
+              <w:left w:type="dxa" w:w="100"/>
+              <w:bottom w:type="dxa" w:w="60"/>
+              <w:right w:type="dxa" w:w="100"/>
+            </w:tcMar>
+          </w:tcPr>
+          <w:p>
+            <w:pPr>
+              <w:jc w:val="right"/>
+            </w:pPr>
+            <w:r>
+              <w:rPr>
+                <w:rFonts w:ascii="Arial" w:cs="Arial" w:eastAsia="Arial" w:hAnsi="Arial"/>
+                <w:b w:val="false"/>
+                <w:bCs w:val="false"/>
+                <w:sz w:val="18"/>
+                <w:szCs w:val="18"/>
+              </w:rPr>
+              <w:t xml:space="preserve">100</w:t>
+            </w:r>
+          </w:p>
+        </w:tc>
+        <w:tc>
+          <w:tcPr>
+            <w:tcW w:type="dxa" w:w="1839"/>
+            <w:tcBorders>
+              <w:top w:val="single" w:color="BFC7D5" w:sz="4"/>
+              <w:left w:val="single" w:color="BFC7D5" w:sz="4"/>
+              <w:bottom w:val="single" w:color="BFC7D5" w:sz="4"/>
+              <w:right w:val="single" w:color="BFC7D5" w:sz="4"/>
+            </w:tcBorders>
+            <w:tcMar>
+              <w:top w:type="dxa" w:w="60"/>
+              <w:left w:type="dxa" w:w="100"/>
+              <w:bottom w:type="dxa" w:w="60"/>
+              <w:right w:type="dxa" w:w="100"/>
+            </w:tcMar>
+          </w:tcPr>
+          <w:p>
+            <w:pPr>
+              <w:jc w:val="right"/>
+            </w:pPr>
+            <w:r>
+              <w:rPr>
+                <w:rFonts w:ascii="Arial" w:cs="Arial" w:eastAsia="Arial" w:hAnsi="Arial"/>
+                <w:b w:val="false"/>
+                <w:bCs w:val="false"/>
+                <w:sz w:val="18"/>
+                <w:szCs w:val="18"/>
+              </w:rPr>
+              <w:t xml:space="preserve">2,304</w:t>
             </w:r>
           </w:p>
         </w:tc>

</xml_diff>

<commit_message>
results: sizing for TTFT<=16s and >=25 tok/s per user (TP=4: 8 users per 4-GPU server; TP=1: 1 per GPU)
</commit_message>
<xml_diff>
--- a/reports/Qwen3.8-27B-benchmark-results.docx
+++ b/reports/Qwen3.8-27B-benchmark-results.docx
@@ -38,7 +38,7 @@
           <w:sz w:val="18"/>
           <w:szCs w:val="18"/>
         </w:rPr>
-        <w:t xml:space="preserve">Test date: 2026-10-25 (UTC) · vLLM 0.32.0 · Generated 2026-10-25</w:t>
+        <w:t xml:space="preserve">Test date: 2026-10-25 (UTC) · vLLM 0.32.0 · Generated 2026-10-26</w:t>
       </w:r>
     </w:p>
     <w:p>
@@ -694,6 +694,30 @@
           <w:b/>
           <w:bCs/>
         </w:rPr>
+        <w:t xml:space="preserve">Sizing for TTFT ≤ 16 s and ≥ 25 tok/s per user (10k prompt): </w:t>
+      </w:r>
+      <w:r>
+        <w:rPr>
+          <w:rFonts w:ascii="Arial" w:cs="Arial" w:eastAsia="Arial" w:hAnsi="Arial"/>
+        </w:rPr>
+        <w:t xml:space="preserve">TP=4 serves 8 concurrent users per 4-GPU server (0.50 GPU per user); TP=1 serves 1 per GPU (1.00 GPU per user). TP=4 needs half the GPUs for this target.</w:t>
+      </w:r>
+    </w:p>
+    <w:p>
+      <w:pPr>
+        <w:pStyle w:val="ListParagraph"/>
+        <w:numPr>
+          <w:ilvl w:val="0"/>
+          <w:numId w:val="2"/>
+        </w:numPr>
+        <w:spacing w:after="60"/>
+      </w:pPr>
+      <w:r>
+        <w:rPr>
+          <w:rFonts w:ascii="Arial" w:cs="Arial" w:eastAsia="Arial" w:hAnsi="Arial"/>
+          <w:b/>
+          <w:bCs/>
+        </w:rPr>
         <w:t xml:space="preserve">Concurrency: </w:t>
       </w:r>
       <w:r>
@@ -12256,6 +12280,1888 @@
           <w:szCs w:val="18"/>
         </w:rPr>
         <w:t xml:space="preserve">TP=4 telemetry under saturation: ~190 W average per GPU at 100% SM busy, i.e. the GPUs mostly wait on the PCIe all-reduce. A single GPU (TP=1) under the same load runs at ~500 W average.</w:t>
+      </w:r>
+    </w:p>
+    <w:p>
+      <w:pPr>
+        <w:pStyle w:val="Heading2"/>
+      </w:pPr>
+      <w:r>
+        <w:rPr>
+          <w:rFonts w:ascii="Arial" w:cs="Arial" w:eastAsia="Arial" w:hAnsi="Arial"/>
+        </w:rPr>
+        <w:t xml:space="preserve">4.5 Sizing for TTFT ≤ 16 s and ≥ 25 tok/s per user (10k prompt)</w:t>
+      </w:r>
+    </w:p>
+    <w:p>
+      <w:pPr>
+        <w:spacing w:after="120"/>
+      </w:pPr>
+      <w:r>
+        <w:rPr>
+          <w:rFonts w:ascii="Arial" w:cs="Arial" w:eastAsia="Arial" w:hAnsi="Arial"/>
+        </w:rPr>
+        <w:t xml:space="preserve">A concurrency level passes when TTFT p99 ≤ 16 s (worst case, not just the median) and per-user generation speed ≥ 25 tok/s.</w:t>
+      </w:r>
+    </w:p>
+    <w:tbl>
+      <w:tblPr>
+        <w:tblW w:type="dxa" w:w="14678"/>
+        <w:tblBorders>
+          <w:top w:val="single" w:color="auto" w:sz="4"/>
+          <w:left w:val="single" w:color="auto" w:sz="4"/>
+          <w:bottom w:val="single" w:color="auto" w:sz="4"/>
+          <w:right w:val="single" w:color="auto" w:sz="4"/>
+          <w:insideH w:val="single" w:color="auto" w:sz="4"/>
+          <w:insideV w:val="single" w:color="auto" w:sz="4"/>
+        </w:tblBorders>
+      </w:tblPr>
+      <w:tblGrid>
+        <w:gridCol w:w="2096"/>
+        <w:gridCol w:w="3145"/>
+        <w:gridCol w:w="2096"/>
+        <w:gridCol w:w="1048"/>
+        <w:gridCol w:w="3145"/>
+        <w:gridCol w:w="2096"/>
+        <w:gridCol w:w="1052"/>
+      </w:tblGrid>
+      <w:tr>
+        <w:trPr>
+          <w:tblHeader/>
+        </w:trPr>
+        <w:tc>
+          <w:tcPr>
+            <w:tcW w:type="dxa" w:w="2096"/>
+            <w:tcBorders>
+              <w:top w:val="single" w:color="BFC7D5" w:sz="4"/>
+              <w:left w:val="single" w:color="BFC7D5" w:sz="4"/>
+              <w:bottom w:val="single" w:color="BFC7D5" w:sz="4"/>
+              <w:right w:val="single" w:color="BFC7D5" w:sz="4"/>
+            </w:tcBorders>
+            <w:shd w:fill="1F3864" w:color="auto" w:val="clear"/>
+            <w:tcMar>
+              <w:top w:type="dxa" w:w="60"/>
+              <w:left w:type="dxa" w:w="100"/>
+              <w:bottom w:type="dxa" w:w="60"/>
+              <w:right w:type="dxa" w:w="100"/>
+            </w:tcMar>
+          </w:tcPr>
+          <w:p>
+            <w:pPr>
+              <w:jc w:val="center"/>
+            </w:pPr>
+            <w:r>
+              <w:rPr>
+                <w:rFonts w:ascii="Arial" w:cs="Arial" w:eastAsia="Arial" w:hAnsi="Arial"/>
+                <w:b/>
+                <w:bCs/>
+                <w:color w:val="FFFFFF"/>
+                <w:sz w:val="18"/>
+                <w:szCs w:val="18"/>
+              </w:rPr>
+              <w:t xml:space="preserve">Concurrent users</w:t>
+            </w:r>
+          </w:p>
+        </w:tc>
+        <w:tc>
+          <w:tcPr>
+            <w:tcW w:type="dxa" w:w="3145"/>
+            <w:tcBorders>
+              <w:top w:val="single" w:color="BFC7D5" w:sz="4"/>
+              <w:left w:val="single" w:color="BFC7D5" w:sz="4"/>
+              <w:bottom w:val="single" w:color="BFC7D5" w:sz="4"/>
+              <w:right w:val="single" w:color="BFC7D5" w:sz="4"/>
+            </w:tcBorders>
+            <w:shd w:fill="1F3864" w:color="auto" w:val="clear"/>
+            <w:tcMar>
+              <w:top w:type="dxa" w:w="60"/>
+              <w:left w:type="dxa" w:w="100"/>
+              <w:bottom w:type="dxa" w:w="60"/>
+              <w:right w:type="dxa" w:w="100"/>
+            </w:tcMar>
+          </w:tcPr>
+          <w:p>
+            <w:pPr>
+              <w:jc w:val="center"/>
+            </w:pPr>
+            <w:r>
+              <w:rPr>
+                <w:rFonts w:ascii="Arial" w:cs="Arial" w:eastAsia="Arial" w:hAnsi="Arial"/>
+                <w:b/>
+                <w:bCs/>
+                <w:color w:val="FFFFFF"/>
+                <w:sz w:val="18"/>
+                <w:szCs w:val="18"/>
+              </w:rPr>
+              <w:t xml:space="preserve">TP=4 TTFT p50 / p99 (s)</w:t>
+            </w:r>
+          </w:p>
+        </w:tc>
+        <w:tc>
+          <w:tcPr>
+            <w:tcW w:type="dxa" w:w="2096"/>
+            <w:tcBorders>
+              <w:top w:val="single" w:color="BFC7D5" w:sz="4"/>
+              <w:left w:val="single" w:color="BFC7D5" w:sz="4"/>
+              <w:bottom w:val="single" w:color="BFC7D5" w:sz="4"/>
+              <w:right w:val="single" w:color="BFC7D5" w:sz="4"/>
+            </w:tcBorders>
+            <w:shd w:fill="1F3864" w:color="auto" w:val="clear"/>
+            <w:tcMar>
+              <w:top w:type="dxa" w:w="60"/>
+              <w:left w:type="dxa" w:w="100"/>
+              <w:bottom w:type="dxa" w:w="60"/>
+              <w:right w:type="dxa" w:w="100"/>
+            </w:tcMar>
+          </w:tcPr>
+          <w:p>
+            <w:pPr>
+              <w:jc w:val="center"/>
+            </w:pPr>
+            <w:r>
+              <w:rPr>
+                <w:rFonts w:ascii="Arial" w:cs="Arial" w:eastAsia="Arial" w:hAnsi="Arial"/>
+                <w:b/>
+                <w:bCs/>
+                <w:color w:val="FFFFFF"/>
+                <w:sz w:val="18"/>
+                <w:szCs w:val="18"/>
+              </w:rPr>
+              <w:t xml:space="preserve">TP=4 tok/s per user</w:t>
+            </w:r>
+          </w:p>
+        </w:tc>
+        <w:tc>
+          <w:tcPr>
+            <w:tcW w:type="dxa" w:w="1048"/>
+            <w:tcBorders>
+              <w:top w:val="single" w:color="BFC7D5" w:sz="4"/>
+              <w:left w:val="single" w:color="BFC7D5" w:sz="4"/>
+              <w:bottom w:val="single" w:color="BFC7D5" w:sz="4"/>
+              <w:right w:val="single" w:color="BFC7D5" w:sz="4"/>
+            </w:tcBorders>
+            <w:shd w:fill="1F3864" w:color="auto" w:val="clear"/>
+            <w:tcMar>
+              <w:top w:type="dxa" w:w="60"/>
+              <w:left w:type="dxa" w:w="100"/>
+              <w:bottom w:type="dxa" w:w="60"/>
+              <w:right w:type="dxa" w:w="100"/>
+            </w:tcMar>
+          </w:tcPr>
+          <w:p>
+            <w:pPr>
+              <w:jc w:val="center"/>
+            </w:pPr>
+            <w:r>
+              <w:rPr>
+                <w:rFonts w:ascii="Arial" w:cs="Arial" w:eastAsia="Arial" w:hAnsi="Arial"/>
+                <w:b/>
+                <w:bCs/>
+                <w:color w:val="FFFFFF"/>
+                <w:sz w:val="18"/>
+                <w:szCs w:val="18"/>
+              </w:rPr>
+              <w:t xml:space="preserve">TP=4</w:t>
+            </w:r>
+          </w:p>
+        </w:tc>
+        <w:tc>
+          <w:tcPr>
+            <w:tcW w:type="dxa" w:w="3145"/>
+            <w:tcBorders>
+              <w:top w:val="single" w:color="BFC7D5" w:sz="4"/>
+              <w:left w:val="single" w:color="BFC7D5" w:sz="4"/>
+              <w:bottom w:val="single" w:color="BFC7D5" w:sz="4"/>
+              <w:right w:val="single" w:color="BFC7D5" w:sz="4"/>
+            </w:tcBorders>
+            <w:shd w:fill="1F3864" w:color="auto" w:val="clear"/>
+            <w:tcMar>
+              <w:top w:type="dxa" w:w="60"/>
+              <w:left w:type="dxa" w:w="100"/>
+              <w:bottom w:type="dxa" w:w="60"/>
+              <w:right w:type="dxa" w:w="100"/>
+            </w:tcMar>
+          </w:tcPr>
+          <w:p>
+            <w:pPr>
+              <w:jc w:val="center"/>
+            </w:pPr>
+            <w:r>
+              <w:rPr>
+                <w:rFonts w:ascii="Arial" w:cs="Arial" w:eastAsia="Arial" w:hAnsi="Arial"/>
+                <w:b/>
+                <w:bCs/>
+                <w:color w:val="FFFFFF"/>
+                <w:sz w:val="18"/>
+                <w:szCs w:val="18"/>
+              </w:rPr>
+              <w:t xml:space="preserve">TP=1 TTFT p50 / p99 (s)</w:t>
+            </w:r>
+          </w:p>
+        </w:tc>
+        <w:tc>
+          <w:tcPr>
+            <w:tcW w:type="dxa" w:w="2096"/>
+            <w:tcBorders>
+              <w:top w:val="single" w:color="BFC7D5" w:sz="4"/>
+              <w:left w:val="single" w:color="BFC7D5" w:sz="4"/>
+              <w:bottom w:val="single" w:color="BFC7D5" w:sz="4"/>
+              <w:right w:val="single" w:color="BFC7D5" w:sz="4"/>
+            </w:tcBorders>
+            <w:shd w:fill="1F3864" w:color="auto" w:val="clear"/>
+            <w:tcMar>
+              <w:top w:type="dxa" w:w="60"/>
+              <w:left w:type="dxa" w:w="100"/>
+              <w:bottom w:type="dxa" w:w="60"/>
+              <w:right w:type="dxa" w:w="100"/>
+            </w:tcMar>
+          </w:tcPr>
+          <w:p>
+            <w:pPr>
+              <w:jc w:val="center"/>
+            </w:pPr>
+            <w:r>
+              <w:rPr>
+                <w:rFonts w:ascii="Arial" w:cs="Arial" w:eastAsia="Arial" w:hAnsi="Arial"/>
+                <w:b/>
+                <w:bCs/>
+                <w:color w:val="FFFFFF"/>
+                <w:sz w:val="18"/>
+                <w:szCs w:val="18"/>
+              </w:rPr>
+              <w:t xml:space="preserve">TP=1 tok/s per user</w:t>
+            </w:r>
+          </w:p>
+        </w:tc>
+        <w:tc>
+          <w:tcPr>
+            <w:tcW w:type="dxa" w:w="1052"/>
+            <w:tcBorders>
+              <w:top w:val="single" w:color="BFC7D5" w:sz="4"/>
+              <w:left w:val="single" w:color="BFC7D5" w:sz="4"/>
+              <w:bottom w:val="single" w:color="BFC7D5" w:sz="4"/>
+              <w:right w:val="single" w:color="BFC7D5" w:sz="4"/>
+            </w:tcBorders>
+            <w:shd w:fill="1F3864" w:color="auto" w:val="clear"/>
+            <w:tcMar>
+              <w:top w:type="dxa" w:w="60"/>
+              <w:left w:type="dxa" w:w="100"/>
+              <w:bottom w:type="dxa" w:w="60"/>
+              <w:right w:type="dxa" w:w="100"/>
+            </w:tcMar>
+          </w:tcPr>
+          <w:p>
+            <w:pPr>
+              <w:jc w:val="center"/>
+            </w:pPr>
+            <w:r>
+              <w:rPr>
+                <w:rFonts w:ascii="Arial" w:cs="Arial" w:eastAsia="Arial" w:hAnsi="Arial"/>
+                <w:b/>
+                <w:bCs/>
+                <w:color w:val="FFFFFF"/>
+                <w:sz w:val="18"/>
+                <w:szCs w:val="18"/>
+              </w:rPr>
+              <w:t xml:space="preserve">TP=1</w:t>
+            </w:r>
+          </w:p>
+        </w:tc>
+      </w:tr>
+      <w:tr>
+        <w:tc>
+          <w:tcPr>
+            <w:tcW w:type="dxa" w:w="2096"/>
+            <w:tcBorders>
+              <w:top w:val="single" w:color="BFC7D5" w:sz="4"/>
+              <w:left w:val="single" w:color="BFC7D5" w:sz="4"/>
+              <w:bottom w:val="single" w:color="BFC7D5" w:sz="4"/>
+              <w:right w:val="single" w:color="BFC7D5" w:sz="4"/>
+            </w:tcBorders>
+            <w:tcMar>
+              <w:top w:type="dxa" w:w="60"/>
+              <w:left w:type="dxa" w:w="100"/>
+              <w:bottom w:type="dxa" w:w="60"/>
+              <w:right w:type="dxa" w:w="100"/>
+            </w:tcMar>
+          </w:tcPr>
+          <w:p>
+            <w:pPr>
+              <w:jc w:val="left"/>
+            </w:pPr>
+            <w:r>
+              <w:rPr>
+                <w:rFonts w:ascii="Arial" w:cs="Arial" w:eastAsia="Arial" w:hAnsi="Arial"/>
+                <w:b/>
+                <w:bCs/>
+                <w:sz w:val="18"/>
+                <w:szCs w:val="18"/>
+              </w:rPr>
+              <w:t xml:space="preserve">1</w:t>
+            </w:r>
+          </w:p>
+        </w:tc>
+        <w:tc>
+          <w:tcPr>
+            <w:tcW w:type="dxa" w:w="3145"/>
+            <w:tcBorders>
+              <w:top w:val="single" w:color="BFC7D5" w:sz="4"/>
+              <w:left w:val="single" w:color="BFC7D5" w:sz="4"/>
+              <w:bottom w:val="single" w:color="BFC7D5" w:sz="4"/>
+              <w:right w:val="single" w:color="BFC7D5" w:sz="4"/>
+            </w:tcBorders>
+            <w:tcMar>
+              <w:top w:type="dxa" w:w="60"/>
+              <w:left w:type="dxa" w:w="100"/>
+              <w:bottom w:type="dxa" w:w="60"/>
+              <w:right w:type="dxa" w:w="100"/>
+            </w:tcMar>
+          </w:tcPr>
+          <w:p>
+            <w:pPr>
+              <w:jc w:val="right"/>
+            </w:pPr>
+            <w:r>
+              <w:rPr>
+                <w:rFonts w:ascii="Arial" w:cs="Arial" w:eastAsia="Arial" w:hAnsi="Arial"/>
+                <w:b w:val="false"/>
+                <w:bCs w:val="false"/>
+                <w:sz w:val="18"/>
+                <w:szCs w:val="18"/>
+              </w:rPr>
+              <w:t xml:space="preserve">1.6 / 1.6</w:t>
+            </w:r>
+          </w:p>
+        </w:tc>
+        <w:tc>
+          <w:tcPr>
+            <w:tcW w:type="dxa" w:w="2096"/>
+            <w:tcBorders>
+              <w:top w:val="single" w:color="BFC7D5" w:sz="4"/>
+              <w:left w:val="single" w:color="BFC7D5" w:sz="4"/>
+              <w:bottom w:val="single" w:color="BFC7D5" w:sz="4"/>
+              <w:right w:val="single" w:color="BFC7D5" w:sz="4"/>
+            </w:tcBorders>
+            <w:tcMar>
+              <w:top w:type="dxa" w:w="60"/>
+              <w:left w:type="dxa" w:w="100"/>
+              <w:bottom w:type="dxa" w:w="60"/>
+              <w:right w:type="dxa" w:w="100"/>
+            </w:tcMar>
+          </w:tcPr>
+          <w:p>
+            <w:pPr>
+              <w:jc w:val="right"/>
+            </w:pPr>
+            <w:r>
+              <w:rPr>
+                <w:rFonts w:ascii="Arial" w:cs="Arial" w:eastAsia="Arial" w:hAnsi="Arial"/>
+                <w:b w:val="false"/>
+                <w:bCs w:val="false"/>
+                <w:sz w:val="18"/>
+                <w:szCs w:val="18"/>
+              </w:rPr>
+              <w:t xml:space="preserve">71.6</w:t>
+            </w:r>
+          </w:p>
+        </w:tc>
+        <w:tc>
+          <w:tcPr>
+            <w:tcW w:type="dxa" w:w="1048"/>
+            <w:tcBorders>
+              <w:top w:val="single" w:color="BFC7D5" w:sz="4"/>
+              <w:left w:val="single" w:color="BFC7D5" w:sz="4"/>
+              <w:bottom w:val="single" w:color="BFC7D5" w:sz="4"/>
+              <w:right w:val="single" w:color="BFC7D5" w:sz="4"/>
+            </w:tcBorders>
+            <w:shd w:fill="E2F0D9" w:color="auto" w:val="clear"/>
+            <w:tcMar>
+              <w:top w:type="dxa" w:w="60"/>
+              <w:left w:type="dxa" w:w="100"/>
+              <w:bottom w:type="dxa" w:w="60"/>
+              <w:right w:type="dxa" w:w="100"/>
+            </w:tcMar>
+          </w:tcPr>
+          <w:p>
+            <w:pPr>
+              <w:jc w:val="center"/>
+            </w:pPr>
+            <w:r>
+              <w:rPr>
+                <w:rFonts w:ascii="Arial" w:cs="Arial" w:eastAsia="Arial" w:hAnsi="Arial"/>
+                <w:b w:val="false"/>
+                <w:bCs w:val="false"/>
+                <w:sz w:val="18"/>
+                <w:szCs w:val="18"/>
+              </w:rPr>
+              <w:t xml:space="preserve">pass</w:t>
+            </w:r>
+          </w:p>
+        </w:tc>
+        <w:tc>
+          <w:tcPr>
+            <w:tcW w:type="dxa" w:w="3145"/>
+            <w:tcBorders>
+              <w:top w:val="single" w:color="BFC7D5" w:sz="4"/>
+              <w:left w:val="single" w:color="BFC7D5" w:sz="4"/>
+              <w:bottom w:val="single" w:color="BFC7D5" w:sz="4"/>
+              <w:right w:val="single" w:color="BFC7D5" w:sz="4"/>
+            </w:tcBorders>
+            <w:tcMar>
+              <w:top w:type="dxa" w:w="60"/>
+              <w:left w:type="dxa" w:w="100"/>
+              <w:bottom w:type="dxa" w:w="60"/>
+              <w:right w:type="dxa" w:w="100"/>
+            </w:tcMar>
+          </w:tcPr>
+          <w:p>
+            <w:pPr>
+              <w:jc w:val="right"/>
+            </w:pPr>
+            <w:r>
+              <w:rPr>
+                <w:rFonts w:ascii="Arial" w:cs="Arial" w:eastAsia="Arial" w:hAnsi="Arial"/>
+                <w:b w:val="false"/>
+                <w:bCs w:val="false"/>
+                <w:sz w:val="18"/>
+                <w:szCs w:val="18"/>
+              </w:rPr>
+              <w:t xml:space="preserve">1.6 / 1.6</w:t>
+            </w:r>
+          </w:p>
+        </w:tc>
+        <w:tc>
+          <w:tcPr>
+            <w:tcW w:type="dxa" w:w="2096"/>
+            <w:tcBorders>
+              <w:top w:val="single" w:color="BFC7D5" w:sz="4"/>
+              <w:left w:val="single" w:color="BFC7D5" w:sz="4"/>
+              <w:bottom w:val="single" w:color="BFC7D5" w:sz="4"/>
+              <w:right w:val="single" w:color="BFC7D5" w:sz="4"/>
+            </w:tcBorders>
+            <w:tcMar>
+              <w:top w:type="dxa" w:w="60"/>
+              <w:left w:type="dxa" w:w="100"/>
+              <w:bottom w:type="dxa" w:w="60"/>
+              <w:right w:type="dxa" w:w="100"/>
+            </w:tcMar>
+          </w:tcPr>
+          <w:p>
+            <w:pPr>
+              <w:jc w:val="right"/>
+            </w:pPr>
+            <w:r>
+              <w:rPr>
+                <w:rFonts w:ascii="Arial" w:cs="Arial" w:eastAsia="Arial" w:hAnsi="Arial"/>
+                <w:b w:val="false"/>
+                <w:bCs w:val="false"/>
+                <w:sz w:val="18"/>
+                <w:szCs w:val="18"/>
+              </w:rPr>
+              <w:t xml:space="preserve">26.1</w:t>
+            </w:r>
+          </w:p>
+        </w:tc>
+        <w:tc>
+          <w:tcPr>
+            <w:tcW w:type="dxa" w:w="1052"/>
+            <w:tcBorders>
+              <w:top w:val="single" w:color="BFC7D5" w:sz="4"/>
+              <w:left w:val="single" w:color="BFC7D5" w:sz="4"/>
+              <w:bottom w:val="single" w:color="BFC7D5" w:sz="4"/>
+              <w:right w:val="single" w:color="BFC7D5" w:sz="4"/>
+            </w:tcBorders>
+            <w:shd w:fill="E2F0D9" w:color="auto" w:val="clear"/>
+            <w:tcMar>
+              <w:top w:type="dxa" w:w="60"/>
+              <w:left w:type="dxa" w:w="100"/>
+              <w:bottom w:type="dxa" w:w="60"/>
+              <w:right w:type="dxa" w:w="100"/>
+            </w:tcMar>
+          </w:tcPr>
+          <w:p>
+            <w:pPr>
+              <w:jc w:val="center"/>
+            </w:pPr>
+            <w:r>
+              <w:rPr>
+                <w:rFonts w:ascii="Arial" w:cs="Arial" w:eastAsia="Arial" w:hAnsi="Arial"/>
+                <w:b w:val="false"/>
+                <w:bCs w:val="false"/>
+                <w:sz w:val="18"/>
+                <w:szCs w:val="18"/>
+              </w:rPr>
+              <w:t xml:space="preserve">pass</w:t>
+            </w:r>
+          </w:p>
+        </w:tc>
+      </w:tr>
+      <w:tr>
+        <w:tc>
+          <w:tcPr>
+            <w:tcW w:type="dxa" w:w="2096"/>
+            <w:tcBorders>
+              <w:top w:val="single" w:color="BFC7D5" w:sz="4"/>
+              <w:left w:val="single" w:color="BFC7D5" w:sz="4"/>
+              <w:bottom w:val="single" w:color="BFC7D5" w:sz="4"/>
+              <w:right w:val="single" w:color="BFC7D5" w:sz="4"/>
+            </w:tcBorders>
+            <w:shd w:fill="F2F5FA" w:color="auto" w:val="clear"/>
+            <w:tcMar>
+              <w:top w:type="dxa" w:w="60"/>
+              <w:left w:type="dxa" w:w="100"/>
+              <w:bottom w:type="dxa" w:w="60"/>
+              <w:right w:type="dxa" w:w="100"/>
+            </w:tcMar>
+          </w:tcPr>
+          <w:p>
+            <w:pPr>
+              <w:jc w:val="left"/>
+            </w:pPr>
+            <w:r>
+              <w:rPr>
+                <w:rFonts w:ascii="Arial" w:cs="Arial" w:eastAsia="Arial" w:hAnsi="Arial"/>
+                <w:b/>
+                <w:bCs/>
+                <w:sz w:val="18"/>
+                <w:szCs w:val="18"/>
+              </w:rPr>
+              <w:t xml:space="preserve">2</w:t>
+            </w:r>
+          </w:p>
+        </w:tc>
+        <w:tc>
+          <w:tcPr>
+            <w:tcW w:type="dxa" w:w="3145"/>
+            <w:tcBorders>
+              <w:top w:val="single" w:color="BFC7D5" w:sz="4"/>
+              <w:left w:val="single" w:color="BFC7D5" w:sz="4"/>
+              <w:bottom w:val="single" w:color="BFC7D5" w:sz="4"/>
+              <w:right w:val="single" w:color="BFC7D5" w:sz="4"/>
+            </w:tcBorders>
+            <w:shd w:fill="F2F5FA" w:color="auto" w:val="clear"/>
+            <w:tcMar>
+              <w:top w:type="dxa" w:w="60"/>
+              <w:left w:type="dxa" w:w="100"/>
+              <w:bottom w:type="dxa" w:w="60"/>
+              <w:right w:type="dxa" w:w="100"/>
+            </w:tcMar>
+          </w:tcPr>
+          <w:p>
+            <w:pPr>
+              <w:jc w:val="right"/>
+            </w:pPr>
+            <w:r>
+              <w:rPr>
+                <w:rFonts w:ascii="Arial" w:cs="Arial" w:eastAsia="Arial" w:hAnsi="Arial"/>
+                <w:b w:val="false"/>
+                <w:bCs w:val="false"/>
+                <w:sz w:val="18"/>
+                <w:szCs w:val="18"/>
+              </w:rPr>
+              <w:t xml:space="preserve">2.3 / 3.1</w:t>
+            </w:r>
+          </w:p>
+        </w:tc>
+        <w:tc>
+          <w:tcPr>
+            <w:tcW w:type="dxa" w:w="2096"/>
+            <w:tcBorders>
+              <w:top w:val="single" w:color="BFC7D5" w:sz="4"/>
+              <w:left w:val="single" w:color="BFC7D5" w:sz="4"/>
+              <w:bottom w:val="single" w:color="BFC7D5" w:sz="4"/>
+              <w:right w:val="single" w:color="BFC7D5" w:sz="4"/>
+            </w:tcBorders>
+            <w:shd w:fill="F2F5FA" w:color="auto" w:val="clear"/>
+            <w:tcMar>
+              <w:top w:type="dxa" w:w="60"/>
+              <w:left w:type="dxa" w:w="100"/>
+              <w:bottom w:type="dxa" w:w="60"/>
+              <w:right w:type="dxa" w:w="100"/>
+            </w:tcMar>
+          </w:tcPr>
+          <w:p>
+            <w:pPr>
+              <w:jc w:val="right"/>
+            </w:pPr>
+            <w:r>
+              <w:rPr>
+                <w:rFonts w:ascii="Arial" w:cs="Arial" w:eastAsia="Arial" w:hAnsi="Arial"/>
+                <w:b w:val="false"/>
+                <w:bCs w:val="false"/>
+                <w:sz w:val="18"/>
+                <w:szCs w:val="18"/>
+              </w:rPr>
+              <w:t xml:space="preserve">57.0</w:t>
+            </w:r>
+          </w:p>
+        </w:tc>
+        <w:tc>
+          <w:tcPr>
+            <w:tcW w:type="dxa" w:w="1048"/>
+            <w:tcBorders>
+              <w:top w:val="single" w:color="BFC7D5" w:sz="4"/>
+              <w:left w:val="single" w:color="BFC7D5" w:sz="4"/>
+              <w:bottom w:val="single" w:color="BFC7D5" w:sz="4"/>
+              <w:right w:val="single" w:color="BFC7D5" w:sz="4"/>
+            </w:tcBorders>
+            <w:shd w:fill="E2F0D9" w:color="auto" w:val="clear"/>
+            <w:tcMar>
+              <w:top w:type="dxa" w:w="60"/>
+              <w:left w:type="dxa" w:w="100"/>
+              <w:bottom w:type="dxa" w:w="60"/>
+              <w:right w:type="dxa" w:w="100"/>
+            </w:tcMar>
+          </w:tcPr>
+          <w:p>
+            <w:pPr>
+              <w:jc w:val="center"/>
+            </w:pPr>
+            <w:r>
+              <w:rPr>
+                <w:rFonts w:ascii="Arial" w:cs="Arial" w:eastAsia="Arial" w:hAnsi="Arial"/>
+                <w:b w:val="false"/>
+                <w:bCs w:val="false"/>
+                <w:sz w:val="18"/>
+                <w:szCs w:val="18"/>
+              </w:rPr>
+              <w:t xml:space="preserve">pass</w:t>
+            </w:r>
+          </w:p>
+        </w:tc>
+        <w:tc>
+          <w:tcPr>
+            <w:tcW w:type="dxa" w:w="3145"/>
+            <w:tcBorders>
+              <w:top w:val="single" w:color="BFC7D5" w:sz="4"/>
+              <w:left w:val="single" w:color="BFC7D5" w:sz="4"/>
+              <w:bottom w:val="single" w:color="BFC7D5" w:sz="4"/>
+              <w:right w:val="single" w:color="BFC7D5" w:sz="4"/>
+            </w:tcBorders>
+            <w:shd w:fill="F2F5FA" w:color="auto" w:val="clear"/>
+            <w:tcMar>
+              <w:top w:type="dxa" w:w="60"/>
+              <w:left w:type="dxa" w:w="100"/>
+              <w:bottom w:type="dxa" w:w="60"/>
+              <w:right w:type="dxa" w:w="100"/>
+            </w:tcMar>
+          </w:tcPr>
+          <w:p>
+            <w:pPr>
+              <w:jc w:val="right"/>
+            </w:pPr>
+            <w:r>
+              <w:rPr>
+                <w:rFonts w:ascii="Arial" w:cs="Arial" w:eastAsia="Arial" w:hAnsi="Arial"/>
+                <w:b w:val="false"/>
+                <w:bCs w:val="false"/>
+                <w:sz w:val="18"/>
+                <w:szCs w:val="18"/>
+              </w:rPr>
+              <w:t xml:space="preserve">2.8 / 3.0</w:t>
+            </w:r>
+          </w:p>
+        </w:tc>
+        <w:tc>
+          <w:tcPr>
+            <w:tcW w:type="dxa" w:w="2096"/>
+            <w:tcBorders>
+              <w:top w:val="single" w:color="BFC7D5" w:sz="4"/>
+              <w:left w:val="single" w:color="BFC7D5" w:sz="4"/>
+              <w:bottom w:val="single" w:color="BFC7D5" w:sz="4"/>
+              <w:right w:val="single" w:color="BFC7D5" w:sz="4"/>
+            </w:tcBorders>
+            <w:shd w:fill="F2F5FA" w:color="auto" w:val="clear"/>
+            <w:tcMar>
+              <w:top w:type="dxa" w:w="60"/>
+              <w:left w:type="dxa" w:w="100"/>
+              <w:bottom w:type="dxa" w:w="60"/>
+              <w:right w:type="dxa" w:w="100"/>
+            </w:tcMar>
+          </w:tcPr>
+          <w:p>
+            <w:pPr>
+              <w:jc w:val="right"/>
+            </w:pPr>
+            <w:r>
+              <w:rPr>
+                <w:rFonts w:ascii="Arial" w:cs="Arial" w:eastAsia="Arial" w:hAnsi="Arial"/>
+                <w:b w:val="false"/>
+                <w:bCs w:val="false"/>
+                <w:sz w:val="18"/>
+                <w:szCs w:val="18"/>
+              </w:rPr>
+              <w:t xml:space="preserve">24.8</w:t>
+            </w:r>
+          </w:p>
+        </w:tc>
+        <w:tc>
+          <w:tcPr>
+            <w:tcW w:type="dxa" w:w="1052"/>
+            <w:tcBorders>
+              <w:top w:val="single" w:color="BFC7D5" w:sz="4"/>
+              <w:left w:val="single" w:color="BFC7D5" w:sz="4"/>
+              <w:bottom w:val="single" w:color="BFC7D5" w:sz="4"/>
+              <w:right w:val="single" w:color="BFC7D5" w:sz="4"/>
+            </w:tcBorders>
+            <w:shd w:fill="FBE5D6" w:color="auto" w:val="clear"/>
+            <w:tcMar>
+              <w:top w:type="dxa" w:w="60"/>
+              <w:left w:type="dxa" w:w="100"/>
+              <w:bottom w:type="dxa" w:w="60"/>
+              <w:right w:type="dxa" w:w="100"/>
+            </w:tcMar>
+          </w:tcPr>
+          <w:p>
+            <w:pPr>
+              <w:jc w:val="center"/>
+            </w:pPr>
+            <w:r>
+              <w:rPr>
+                <w:rFonts w:ascii="Arial" w:cs="Arial" w:eastAsia="Arial" w:hAnsi="Arial"/>
+                <w:b w:val="false"/>
+                <w:bCs w:val="false"/>
+                <w:sz w:val="18"/>
+                <w:szCs w:val="18"/>
+              </w:rPr>
+              <w:t xml:space="preserve">fail</w:t>
+            </w:r>
+          </w:p>
+        </w:tc>
+      </w:tr>
+      <w:tr>
+        <w:tc>
+          <w:tcPr>
+            <w:tcW w:type="dxa" w:w="2096"/>
+            <w:tcBorders>
+              <w:top w:val="single" w:color="BFC7D5" w:sz="4"/>
+              <w:left w:val="single" w:color="BFC7D5" w:sz="4"/>
+              <w:bottom w:val="single" w:color="BFC7D5" w:sz="4"/>
+              <w:right w:val="single" w:color="BFC7D5" w:sz="4"/>
+            </w:tcBorders>
+            <w:tcMar>
+              <w:top w:type="dxa" w:w="60"/>
+              <w:left w:type="dxa" w:w="100"/>
+              <w:bottom w:type="dxa" w:w="60"/>
+              <w:right w:type="dxa" w:w="100"/>
+            </w:tcMar>
+          </w:tcPr>
+          <w:p>
+            <w:pPr>
+              <w:jc w:val="left"/>
+            </w:pPr>
+            <w:r>
+              <w:rPr>
+                <w:rFonts w:ascii="Arial" w:cs="Arial" w:eastAsia="Arial" w:hAnsi="Arial"/>
+                <w:b/>
+                <w:bCs/>
+                <w:sz w:val="18"/>
+                <w:szCs w:val="18"/>
+              </w:rPr>
+              <w:t xml:space="preserve">4</w:t>
+            </w:r>
+          </w:p>
+        </w:tc>
+        <w:tc>
+          <w:tcPr>
+            <w:tcW w:type="dxa" w:w="3145"/>
+            <w:tcBorders>
+              <w:top w:val="single" w:color="BFC7D5" w:sz="4"/>
+              <w:left w:val="single" w:color="BFC7D5" w:sz="4"/>
+              <w:bottom w:val="single" w:color="BFC7D5" w:sz="4"/>
+              <w:right w:val="single" w:color="BFC7D5" w:sz="4"/>
+            </w:tcBorders>
+            <w:tcMar>
+              <w:top w:type="dxa" w:w="60"/>
+              <w:left w:type="dxa" w:w="100"/>
+              <w:bottom w:type="dxa" w:w="60"/>
+              <w:right w:type="dxa" w:w="100"/>
+            </w:tcMar>
+          </w:tcPr>
+          <w:p>
+            <w:pPr>
+              <w:jc w:val="right"/>
+            </w:pPr>
+            <w:r>
+              <w:rPr>
+                <w:rFonts w:ascii="Arial" w:cs="Arial" w:eastAsia="Arial" w:hAnsi="Arial"/>
+                <w:b w:val="false"/>
+                <w:bCs w:val="false"/>
+                <w:sz w:val="18"/>
+                <w:szCs w:val="18"/>
+              </w:rPr>
+              <w:t xml:space="preserve">4.6 / 6.1</w:t>
+            </w:r>
+          </w:p>
+        </w:tc>
+        <w:tc>
+          <w:tcPr>
+            <w:tcW w:type="dxa" w:w="2096"/>
+            <w:tcBorders>
+              <w:top w:val="single" w:color="BFC7D5" w:sz="4"/>
+              <w:left w:val="single" w:color="BFC7D5" w:sz="4"/>
+              <w:bottom w:val="single" w:color="BFC7D5" w:sz="4"/>
+              <w:right w:val="single" w:color="BFC7D5" w:sz="4"/>
+            </w:tcBorders>
+            <w:tcMar>
+              <w:top w:type="dxa" w:w="60"/>
+              <w:left w:type="dxa" w:w="100"/>
+              <w:bottom w:type="dxa" w:w="60"/>
+              <w:right w:type="dxa" w:w="100"/>
+            </w:tcMar>
+          </w:tcPr>
+          <w:p>
+            <w:pPr>
+              <w:jc w:val="right"/>
+            </w:pPr>
+            <w:r>
+              <w:rPr>
+                <w:rFonts w:ascii="Arial" w:cs="Arial" w:eastAsia="Arial" w:hAnsi="Arial"/>
+                <w:b w:val="false"/>
+                <w:bCs w:val="false"/>
+                <w:sz w:val="18"/>
+                <w:szCs w:val="18"/>
+              </w:rPr>
+              <w:t xml:space="preserve">50.6</w:t>
+            </w:r>
+          </w:p>
+        </w:tc>
+        <w:tc>
+          <w:tcPr>
+            <w:tcW w:type="dxa" w:w="1048"/>
+            <w:tcBorders>
+              <w:top w:val="single" w:color="BFC7D5" w:sz="4"/>
+              <w:left w:val="single" w:color="BFC7D5" w:sz="4"/>
+              <w:bottom w:val="single" w:color="BFC7D5" w:sz="4"/>
+              <w:right w:val="single" w:color="BFC7D5" w:sz="4"/>
+            </w:tcBorders>
+            <w:shd w:fill="E2F0D9" w:color="auto" w:val="clear"/>
+            <w:tcMar>
+              <w:top w:type="dxa" w:w="60"/>
+              <w:left w:type="dxa" w:w="100"/>
+              <w:bottom w:type="dxa" w:w="60"/>
+              <w:right w:type="dxa" w:w="100"/>
+            </w:tcMar>
+          </w:tcPr>
+          <w:p>
+            <w:pPr>
+              <w:jc w:val="center"/>
+            </w:pPr>
+            <w:r>
+              <w:rPr>
+                <w:rFonts w:ascii="Arial" w:cs="Arial" w:eastAsia="Arial" w:hAnsi="Arial"/>
+                <w:b w:val="false"/>
+                <w:bCs w:val="false"/>
+                <w:sz w:val="18"/>
+                <w:szCs w:val="18"/>
+              </w:rPr>
+              <w:t xml:space="preserve">pass</w:t>
+            </w:r>
+          </w:p>
+        </w:tc>
+        <w:tc>
+          <w:tcPr>
+            <w:tcW w:type="dxa" w:w="3145"/>
+            <w:tcBorders>
+              <w:top w:val="single" w:color="BFC7D5" w:sz="4"/>
+              <w:left w:val="single" w:color="BFC7D5" w:sz="4"/>
+              <w:bottom w:val="single" w:color="BFC7D5" w:sz="4"/>
+              <w:right w:val="single" w:color="BFC7D5" w:sz="4"/>
+            </w:tcBorders>
+            <w:tcMar>
+              <w:top w:type="dxa" w:w="60"/>
+              <w:left w:type="dxa" w:w="100"/>
+              <w:bottom w:type="dxa" w:w="60"/>
+              <w:right w:type="dxa" w:w="100"/>
+            </w:tcMar>
+          </w:tcPr>
+          <w:p>
+            <w:pPr>
+              <w:jc w:val="right"/>
+            </w:pPr>
+            <w:r>
+              <w:rPr>
+                <w:rFonts w:ascii="Arial" w:cs="Arial" w:eastAsia="Arial" w:hAnsi="Arial"/>
+                <w:b w:val="false"/>
+                <w:bCs w:val="false"/>
+                <w:sz w:val="18"/>
+                <w:szCs w:val="18"/>
+              </w:rPr>
+              <w:t xml:space="preserve">4.3 / 5.9</w:t>
+            </w:r>
+          </w:p>
+        </w:tc>
+        <w:tc>
+          <w:tcPr>
+            <w:tcW w:type="dxa" w:w="2096"/>
+            <w:tcBorders>
+              <w:top w:val="single" w:color="BFC7D5" w:sz="4"/>
+              <w:left w:val="single" w:color="BFC7D5" w:sz="4"/>
+              <w:bottom w:val="single" w:color="BFC7D5" w:sz="4"/>
+              <w:right w:val="single" w:color="BFC7D5" w:sz="4"/>
+            </w:tcBorders>
+            <w:tcMar>
+              <w:top w:type="dxa" w:w="60"/>
+              <w:left w:type="dxa" w:w="100"/>
+              <w:bottom w:type="dxa" w:w="60"/>
+              <w:right w:type="dxa" w:w="100"/>
+            </w:tcMar>
+          </w:tcPr>
+          <w:p>
+            <w:pPr>
+              <w:jc w:val="right"/>
+            </w:pPr>
+            <w:r>
+              <w:rPr>
+                <w:rFonts w:ascii="Arial" w:cs="Arial" w:eastAsia="Arial" w:hAnsi="Arial"/>
+                <w:b w:val="false"/>
+                <w:bCs w:val="false"/>
+                <w:sz w:val="18"/>
+                <w:szCs w:val="18"/>
+              </w:rPr>
+              <w:t xml:space="preserve">22.5</w:t>
+            </w:r>
+          </w:p>
+        </w:tc>
+        <w:tc>
+          <w:tcPr>
+            <w:tcW w:type="dxa" w:w="1052"/>
+            <w:tcBorders>
+              <w:top w:val="single" w:color="BFC7D5" w:sz="4"/>
+              <w:left w:val="single" w:color="BFC7D5" w:sz="4"/>
+              <w:bottom w:val="single" w:color="BFC7D5" w:sz="4"/>
+              <w:right w:val="single" w:color="BFC7D5" w:sz="4"/>
+            </w:tcBorders>
+            <w:shd w:fill="FBE5D6" w:color="auto" w:val="clear"/>
+            <w:tcMar>
+              <w:top w:type="dxa" w:w="60"/>
+              <w:left w:type="dxa" w:w="100"/>
+              <w:bottom w:type="dxa" w:w="60"/>
+              <w:right w:type="dxa" w:w="100"/>
+            </w:tcMar>
+          </w:tcPr>
+          <w:p>
+            <w:pPr>
+              <w:jc w:val="center"/>
+            </w:pPr>
+            <w:r>
+              <w:rPr>
+                <w:rFonts w:ascii="Arial" w:cs="Arial" w:eastAsia="Arial" w:hAnsi="Arial"/>
+                <w:b w:val="false"/>
+                <w:bCs w:val="false"/>
+                <w:sz w:val="18"/>
+                <w:szCs w:val="18"/>
+              </w:rPr>
+              <w:t xml:space="preserve">fail</w:t>
+            </w:r>
+          </w:p>
+        </w:tc>
+      </w:tr>
+      <w:tr>
+        <w:tc>
+          <w:tcPr>
+            <w:tcW w:type="dxa" w:w="2096"/>
+            <w:tcBorders>
+              <w:top w:val="single" w:color="BFC7D5" w:sz="4"/>
+              <w:left w:val="single" w:color="BFC7D5" w:sz="4"/>
+              <w:bottom w:val="single" w:color="BFC7D5" w:sz="4"/>
+              <w:right w:val="single" w:color="BFC7D5" w:sz="4"/>
+            </w:tcBorders>
+            <w:shd w:fill="F2F5FA" w:color="auto" w:val="clear"/>
+            <w:tcMar>
+              <w:top w:type="dxa" w:w="60"/>
+              <w:left w:type="dxa" w:w="100"/>
+              <w:bottom w:type="dxa" w:w="60"/>
+              <w:right w:type="dxa" w:w="100"/>
+            </w:tcMar>
+          </w:tcPr>
+          <w:p>
+            <w:pPr>
+              <w:jc w:val="left"/>
+            </w:pPr>
+            <w:r>
+              <w:rPr>
+                <w:rFonts w:ascii="Arial" w:cs="Arial" w:eastAsia="Arial" w:hAnsi="Arial"/>
+                <w:b/>
+                <w:bCs/>
+                <w:sz w:val="18"/>
+                <w:szCs w:val="18"/>
+              </w:rPr>
+              <w:t xml:space="preserve">8</w:t>
+            </w:r>
+          </w:p>
+        </w:tc>
+        <w:tc>
+          <w:tcPr>
+            <w:tcW w:type="dxa" w:w="3145"/>
+            <w:tcBorders>
+              <w:top w:val="single" w:color="BFC7D5" w:sz="4"/>
+              <w:left w:val="single" w:color="BFC7D5" w:sz="4"/>
+              <w:bottom w:val="single" w:color="BFC7D5" w:sz="4"/>
+              <w:right w:val="single" w:color="BFC7D5" w:sz="4"/>
+            </w:tcBorders>
+            <w:shd w:fill="F2F5FA" w:color="auto" w:val="clear"/>
+            <w:tcMar>
+              <w:top w:type="dxa" w:w="60"/>
+              <w:left w:type="dxa" w:w="100"/>
+              <w:bottom w:type="dxa" w:w="60"/>
+              <w:right w:type="dxa" w:w="100"/>
+            </w:tcMar>
+          </w:tcPr>
+          <w:p>
+            <w:pPr>
+              <w:jc w:val="right"/>
+            </w:pPr>
+            <w:r>
+              <w:rPr>
+                <w:rFonts w:ascii="Arial" w:cs="Arial" w:eastAsia="Arial" w:hAnsi="Arial"/>
+                <w:b w:val="false"/>
+                <w:bCs w:val="false"/>
+                <w:sz w:val="18"/>
+                <w:szCs w:val="18"/>
+              </w:rPr>
+              <w:t xml:space="preserve">6.2 / 12.0</w:t>
+            </w:r>
+          </w:p>
+        </w:tc>
+        <w:tc>
+          <w:tcPr>
+            <w:tcW w:type="dxa" w:w="2096"/>
+            <w:tcBorders>
+              <w:top w:val="single" w:color="BFC7D5" w:sz="4"/>
+              <w:left w:val="single" w:color="BFC7D5" w:sz="4"/>
+              <w:bottom w:val="single" w:color="BFC7D5" w:sz="4"/>
+              <w:right w:val="single" w:color="BFC7D5" w:sz="4"/>
+            </w:tcBorders>
+            <w:shd w:fill="F2F5FA" w:color="auto" w:val="clear"/>
+            <w:tcMar>
+              <w:top w:type="dxa" w:w="60"/>
+              <w:left w:type="dxa" w:w="100"/>
+              <w:bottom w:type="dxa" w:w="60"/>
+              <w:right w:type="dxa" w:w="100"/>
+            </w:tcMar>
+          </w:tcPr>
+          <w:p>
+            <w:pPr>
+              <w:jc w:val="right"/>
+            </w:pPr>
+            <w:r>
+              <w:rPr>
+                <w:rFonts w:ascii="Arial" w:cs="Arial" w:eastAsia="Arial" w:hAnsi="Arial"/>
+                <w:b w:val="false"/>
+                <w:bCs w:val="false"/>
+                <w:sz w:val="18"/>
+                <w:szCs w:val="18"/>
+              </w:rPr>
+              <w:t xml:space="preserve">32.1</w:t>
+            </w:r>
+          </w:p>
+        </w:tc>
+        <w:tc>
+          <w:tcPr>
+            <w:tcW w:type="dxa" w:w="1048"/>
+            <w:tcBorders>
+              <w:top w:val="single" w:color="BFC7D5" w:sz="4"/>
+              <w:left w:val="single" w:color="BFC7D5" w:sz="4"/>
+              <w:bottom w:val="single" w:color="BFC7D5" w:sz="4"/>
+              <w:right w:val="single" w:color="BFC7D5" w:sz="4"/>
+            </w:tcBorders>
+            <w:shd w:fill="E2F0D9" w:color="auto" w:val="clear"/>
+            <w:tcMar>
+              <w:top w:type="dxa" w:w="60"/>
+              <w:left w:type="dxa" w:w="100"/>
+              <w:bottom w:type="dxa" w:w="60"/>
+              <w:right w:type="dxa" w:w="100"/>
+            </w:tcMar>
+          </w:tcPr>
+          <w:p>
+            <w:pPr>
+              <w:jc w:val="center"/>
+            </w:pPr>
+            <w:r>
+              <w:rPr>
+                <w:rFonts w:ascii="Arial" w:cs="Arial" w:eastAsia="Arial" w:hAnsi="Arial"/>
+                <w:b w:val="false"/>
+                <w:bCs w:val="false"/>
+                <w:sz w:val="18"/>
+                <w:szCs w:val="18"/>
+              </w:rPr>
+              <w:t xml:space="preserve">pass</w:t>
+            </w:r>
+          </w:p>
+        </w:tc>
+        <w:tc>
+          <w:tcPr>
+            <w:tcW w:type="dxa" w:w="3145"/>
+            <w:tcBorders>
+              <w:top w:val="single" w:color="BFC7D5" w:sz="4"/>
+              <w:left w:val="single" w:color="BFC7D5" w:sz="4"/>
+              <w:bottom w:val="single" w:color="BFC7D5" w:sz="4"/>
+              <w:right w:val="single" w:color="BFC7D5" w:sz="4"/>
+            </w:tcBorders>
+            <w:shd w:fill="F2F5FA" w:color="auto" w:val="clear"/>
+            <w:tcMar>
+              <w:top w:type="dxa" w:w="60"/>
+              <w:left w:type="dxa" w:w="100"/>
+              <w:bottom w:type="dxa" w:w="60"/>
+              <w:right w:type="dxa" w:w="100"/>
+            </w:tcMar>
+          </w:tcPr>
+          <w:p>
+            <w:pPr>
+              <w:jc w:val="right"/>
+            </w:pPr>
+            <w:r>
+              <w:rPr>
+                <w:rFonts w:ascii="Arial" w:cs="Arial" w:eastAsia="Arial" w:hAnsi="Arial"/>
+                <w:b w:val="false"/>
+                <w:bCs w:val="false"/>
+                <w:sz w:val="18"/>
+                <w:szCs w:val="18"/>
+              </w:rPr>
+              <w:t xml:space="preserve">5.1 / 11.8</w:t>
+            </w:r>
+          </w:p>
+        </w:tc>
+        <w:tc>
+          <w:tcPr>
+            <w:tcW w:type="dxa" w:w="2096"/>
+            <w:tcBorders>
+              <w:top w:val="single" w:color="BFC7D5" w:sz="4"/>
+              <w:left w:val="single" w:color="BFC7D5" w:sz="4"/>
+              <w:bottom w:val="single" w:color="BFC7D5" w:sz="4"/>
+              <w:right w:val="single" w:color="BFC7D5" w:sz="4"/>
+            </w:tcBorders>
+            <w:shd w:fill="F2F5FA" w:color="auto" w:val="clear"/>
+            <w:tcMar>
+              <w:top w:type="dxa" w:w="60"/>
+              <w:left w:type="dxa" w:w="100"/>
+              <w:bottom w:type="dxa" w:w="60"/>
+              <w:right w:type="dxa" w:w="100"/>
+            </w:tcMar>
+          </w:tcPr>
+          <w:p>
+            <w:pPr>
+              <w:jc w:val="right"/>
+            </w:pPr>
+            <w:r>
+              <w:rPr>
+                <w:rFonts w:ascii="Arial" w:cs="Arial" w:eastAsia="Arial" w:hAnsi="Arial"/>
+                <w:b w:val="false"/>
+                <w:bCs w:val="false"/>
+                <w:sz w:val="18"/>
+                <w:szCs w:val="18"/>
+              </w:rPr>
+              <w:t xml:space="preserve">18.0</w:t>
+            </w:r>
+          </w:p>
+        </w:tc>
+        <w:tc>
+          <w:tcPr>
+            <w:tcW w:type="dxa" w:w="1052"/>
+            <w:tcBorders>
+              <w:top w:val="single" w:color="BFC7D5" w:sz="4"/>
+              <w:left w:val="single" w:color="BFC7D5" w:sz="4"/>
+              <w:bottom w:val="single" w:color="BFC7D5" w:sz="4"/>
+              <w:right w:val="single" w:color="BFC7D5" w:sz="4"/>
+            </w:tcBorders>
+            <w:shd w:fill="FBE5D6" w:color="auto" w:val="clear"/>
+            <w:tcMar>
+              <w:top w:type="dxa" w:w="60"/>
+              <w:left w:type="dxa" w:w="100"/>
+              <w:bottom w:type="dxa" w:w="60"/>
+              <w:right w:type="dxa" w:w="100"/>
+            </w:tcMar>
+          </w:tcPr>
+          <w:p>
+            <w:pPr>
+              <w:jc w:val="center"/>
+            </w:pPr>
+            <w:r>
+              <w:rPr>
+                <w:rFonts w:ascii="Arial" w:cs="Arial" w:eastAsia="Arial" w:hAnsi="Arial"/>
+                <w:b w:val="false"/>
+                <w:bCs w:val="false"/>
+                <w:sz w:val="18"/>
+                <w:szCs w:val="18"/>
+              </w:rPr>
+              <w:t xml:space="preserve">fail</w:t>
+            </w:r>
+          </w:p>
+        </w:tc>
+      </w:tr>
+      <w:tr>
+        <w:tc>
+          <w:tcPr>
+            <w:tcW w:type="dxa" w:w="2096"/>
+            <w:tcBorders>
+              <w:top w:val="single" w:color="BFC7D5" w:sz="4"/>
+              <w:left w:val="single" w:color="BFC7D5" w:sz="4"/>
+              <w:bottom w:val="single" w:color="BFC7D5" w:sz="4"/>
+              <w:right w:val="single" w:color="BFC7D5" w:sz="4"/>
+            </w:tcBorders>
+            <w:tcMar>
+              <w:top w:type="dxa" w:w="60"/>
+              <w:left w:type="dxa" w:w="100"/>
+              <w:bottom w:type="dxa" w:w="60"/>
+              <w:right w:type="dxa" w:w="100"/>
+            </w:tcMar>
+          </w:tcPr>
+          <w:p>
+            <w:pPr>
+              <w:jc w:val="left"/>
+            </w:pPr>
+            <w:r>
+              <w:rPr>
+                <w:rFonts w:ascii="Arial" w:cs="Arial" w:eastAsia="Arial" w:hAnsi="Arial"/>
+                <w:b/>
+                <w:bCs/>
+                <w:sz w:val="18"/>
+                <w:szCs w:val="18"/>
+              </w:rPr>
+              <w:t xml:space="preserve">16</w:t>
+            </w:r>
+          </w:p>
+        </w:tc>
+        <w:tc>
+          <w:tcPr>
+            <w:tcW w:type="dxa" w:w="3145"/>
+            <w:tcBorders>
+              <w:top w:val="single" w:color="BFC7D5" w:sz="4"/>
+              <w:left w:val="single" w:color="BFC7D5" w:sz="4"/>
+              <w:bottom w:val="single" w:color="BFC7D5" w:sz="4"/>
+              <w:right w:val="single" w:color="BFC7D5" w:sz="4"/>
+            </w:tcBorders>
+            <w:tcMar>
+              <w:top w:type="dxa" w:w="60"/>
+              <w:left w:type="dxa" w:w="100"/>
+              <w:bottom w:type="dxa" w:w="60"/>
+              <w:right w:type="dxa" w:w="100"/>
+            </w:tcMar>
+          </w:tcPr>
+          <w:p>
+            <w:pPr>
+              <w:jc w:val="right"/>
+            </w:pPr>
+            <w:r>
+              <w:rPr>
+                <w:rFonts w:ascii="Arial" w:cs="Arial" w:eastAsia="Arial" w:hAnsi="Arial"/>
+                <w:b w:val="false"/>
+                <w:bCs w:val="false"/>
+                <w:sz w:val="18"/>
+                <w:szCs w:val="18"/>
+              </w:rPr>
+              <w:t xml:space="preserve">13.5 / 52.5</w:t>
+            </w:r>
+          </w:p>
+        </w:tc>
+        <w:tc>
+          <w:tcPr>
+            <w:tcW w:type="dxa" w:w="2096"/>
+            <w:tcBorders>
+              <w:top w:val="single" w:color="BFC7D5" w:sz="4"/>
+              <w:left w:val="single" w:color="BFC7D5" w:sz="4"/>
+              <w:bottom w:val="single" w:color="BFC7D5" w:sz="4"/>
+              <w:right w:val="single" w:color="BFC7D5" w:sz="4"/>
+            </w:tcBorders>
+            <w:tcMar>
+              <w:top w:type="dxa" w:w="60"/>
+              <w:left w:type="dxa" w:w="100"/>
+              <w:bottom w:type="dxa" w:w="60"/>
+              <w:right w:type="dxa" w:w="100"/>
+            </w:tcMar>
+          </w:tcPr>
+          <w:p>
+            <w:pPr>
+              <w:jc w:val="right"/>
+            </w:pPr>
+            <w:r>
+              <w:rPr>
+                <w:rFonts w:ascii="Arial" w:cs="Arial" w:eastAsia="Arial" w:hAnsi="Arial"/>
+                <w:b w:val="false"/>
+                <w:bCs w:val="false"/>
+                <w:sz w:val="18"/>
+                <w:szCs w:val="18"/>
+              </w:rPr>
+              <w:t xml:space="preserve">9.8</w:t>
+            </w:r>
+          </w:p>
+        </w:tc>
+        <w:tc>
+          <w:tcPr>
+            <w:tcW w:type="dxa" w:w="1048"/>
+            <w:tcBorders>
+              <w:top w:val="single" w:color="BFC7D5" w:sz="4"/>
+              <w:left w:val="single" w:color="BFC7D5" w:sz="4"/>
+              <w:bottom w:val="single" w:color="BFC7D5" w:sz="4"/>
+              <w:right w:val="single" w:color="BFC7D5" w:sz="4"/>
+            </w:tcBorders>
+            <w:shd w:fill="FBE5D6" w:color="auto" w:val="clear"/>
+            <w:tcMar>
+              <w:top w:type="dxa" w:w="60"/>
+              <w:left w:type="dxa" w:w="100"/>
+              <w:bottom w:type="dxa" w:w="60"/>
+              <w:right w:type="dxa" w:w="100"/>
+            </w:tcMar>
+          </w:tcPr>
+          <w:p>
+            <w:pPr>
+              <w:jc w:val="center"/>
+            </w:pPr>
+            <w:r>
+              <w:rPr>
+                <w:rFonts w:ascii="Arial" w:cs="Arial" w:eastAsia="Arial" w:hAnsi="Arial"/>
+                <w:b w:val="false"/>
+                <w:bCs w:val="false"/>
+                <w:sz w:val="18"/>
+                <w:szCs w:val="18"/>
+              </w:rPr>
+              <w:t xml:space="preserve">fail</w:t>
+            </w:r>
+          </w:p>
+        </w:tc>
+        <w:tc>
+          <w:tcPr>
+            <w:tcW w:type="dxa" w:w="3145"/>
+            <w:tcBorders>
+              <w:top w:val="single" w:color="BFC7D5" w:sz="4"/>
+              <w:left w:val="single" w:color="BFC7D5" w:sz="4"/>
+              <w:bottom w:val="single" w:color="BFC7D5" w:sz="4"/>
+              <w:right w:val="single" w:color="BFC7D5" w:sz="4"/>
+            </w:tcBorders>
+            <w:tcMar>
+              <w:top w:type="dxa" w:w="60"/>
+              <w:left w:type="dxa" w:w="100"/>
+              <w:bottom w:type="dxa" w:w="60"/>
+              <w:right w:type="dxa" w:w="100"/>
+            </w:tcMar>
+          </w:tcPr>
+          <w:p>
+            <w:pPr>
+              <w:jc w:val="right"/>
+            </w:pPr>
+            <w:r>
+              <w:rPr>
+                <w:rFonts w:ascii="Arial" w:cs="Arial" w:eastAsia="Arial" w:hAnsi="Arial"/>
+                <w:b w:val="false"/>
+                <w:bCs w:val="false"/>
+                <w:sz w:val="18"/>
+                <w:szCs w:val="18"/>
+              </w:rPr>
+              <w:t xml:space="preserve">6.1 / 23.5</w:t>
+            </w:r>
+          </w:p>
+        </w:tc>
+        <w:tc>
+          <w:tcPr>
+            <w:tcW w:type="dxa" w:w="2096"/>
+            <w:tcBorders>
+              <w:top w:val="single" w:color="BFC7D5" w:sz="4"/>
+              <w:left w:val="single" w:color="BFC7D5" w:sz="4"/>
+              <w:bottom w:val="single" w:color="BFC7D5" w:sz="4"/>
+              <w:right w:val="single" w:color="BFC7D5" w:sz="4"/>
+            </w:tcBorders>
+            <w:tcMar>
+              <w:top w:type="dxa" w:w="60"/>
+              <w:left w:type="dxa" w:w="100"/>
+              <w:bottom w:type="dxa" w:w="60"/>
+              <w:right w:type="dxa" w:w="100"/>
+            </w:tcMar>
+          </w:tcPr>
+          <w:p>
+            <w:pPr>
+              <w:jc w:val="right"/>
+            </w:pPr>
+            <w:r>
+              <w:rPr>
+                <w:rFonts w:ascii="Arial" w:cs="Arial" w:eastAsia="Arial" w:hAnsi="Arial"/>
+                <w:b w:val="false"/>
+                <w:bCs w:val="false"/>
+                <w:sz w:val="18"/>
+                <w:szCs w:val="18"/>
+              </w:rPr>
+              <w:t xml:space="preserve">12.2</w:t>
+            </w:r>
+          </w:p>
+        </w:tc>
+        <w:tc>
+          <w:tcPr>
+            <w:tcW w:type="dxa" w:w="1052"/>
+            <w:tcBorders>
+              <w:top w:val="single" w:color="BFC7D5" w:sz="4"/>
+              <w:left w:val="single" w:color="BFC7D5" w:sz="4"/>
+              <w:bottom w:val="single" w:color="BFC7D5" w:sz="4"/>
+              <w:right w:val="single" w:color="BFC7D5" w:sz="4"/>
+            </w:tcBorders>
+            <w:shd w:fill="FBE5D6" w:color="auto" w:val="clear"/>
+            <w:tcMar>
+              <w:top w:type="dxa" w:w="60"/>
+              <w:left w:type="dxa" w:w="100"/>
+              <w:bottom w:type="dxa" w:w="60"/>
+              <w:right w:type="dxa" w:w="100"/>
+            </w:tcMar>
+          </w:tcPr>
+          <w:p>
+            <w:pPr>
+              <w:jc w:val="center"/>
+            </w:pPr>
+            <w:r>
+              <w:rPr>
+                <w:rFonts w:ascii="Arial" w:cs="Arial" w:eastAsia="Arial" w:hAnsi="Arial"/>
+                <w:b w:val="false"/>
+                <w:bCs w:val="false"/>
+                <w:sz w:val="18"/>
+                <w:szCs w:val="18"/>
+              </w:rPr>
+              <w:t xml:space="preserve">fail</w:t>
+            </w:r>
+          </w:p>
+        </w:tc>
+      </w:tr>
+    </w:tbl>
+    <w:p>
+      <w:pPr>
+        <w:spacing w:after="120"/>
+      </w:pPr>
+    </w:p>
+    <w:tbl>
+      <w:tblPr>
+        <w:tblW w:type="dxa" w:w="14678"/>
+        <w:tblBorders>
+          <w:top w:val="single" w:color="auto" w:sz="4"/>
+          <w:left w:val="single" w:color="auto" w:sz="4"/>
+          <w:bottom w:val="single" w:color="auto" w:sz="4"/>
+          <w:right w:val="single" w:color="auto" w:sz="4"/>
+          <w:insideH w:val="single" w:color="auto" w:sz="4"/>
+          <w:insideV w:val="single" w:color="auto" w:sz="4"/>
+        </w:tblBorders>
+      </w:tblPr>
+      <w:tblGrid>
+        <w:gridCol w:w="4003"/>
+        <w:gridCol w:w="5337"/>
+        <w:gridCol w:w="5338"/>
+      </w:tblGrid>
+      <w:tr>
+        <w:trPr>
+          <w:tblHeader/>
+        </w:trPr>
+        <w:tc>
+          <w:tcPr>
+            <w:tcW w:type="dxa" w:w="4003"/>
+            <w:tcBorders>
+              <w:top w:val="single" w:color="BFC7D5" w:sz="4"/>
+              <w:left w:val="single" w:color="BFC7D5" w:sz="4"/>
+              <w:bottom w:val="single" w:color="BFC7D5" w:sz="4"/>
+              <w:right w:val="single" w:color="BFC7D5" w:sz="4"/>
+            </w:tcBorders>
+            <w:shd w:fill="1F3864" w:color="auto" w:val="clear"/>
+            <w:tcMar>
+              <w:top w:type="dxa" w:w="60"/>
+              <w:left w:type="dxa" w:w="100"/>
+              <w:bottom w:type="dxa" w:w="60"/>
+              <w:right w:type="dxa" w:w="100"/>
+            </w:tcMar>
+          </w:tcPr>
+          <w:p>
+            <w:pPr>
+              <w:jc w:val="center"/>
+            </w:pPr>
+            <w:r>
+              <w:rPr>
+                <w:rFonts w:ascii="Arial" w:cs="Arial" w:eastAsia="Arial" w:hAnsi="Arial"/>
+                <w:b/>
+                <w:bCs/>
+                <w:color w:val="FFFFFF"/>
+                <w:sz w:val="18"/>
+                <w:szCs w:val="18"/>
+              </w:rPr>
+              <w:t xml:space="preserve">Concurrent users to serve</w:t>
+            </w:r>
+          </w:p>
+        </w:tc>
+        <w:tc>
+          <w:tcPr>
+            <w:tcW w:type="dxa" w:w="5337"/>
+            <w:tcBorders>
+              <w:top w:val="single" w:color="BFC7D5" w:sz="4"/>
+              <w:left w:val="single" w:color="BFC7D5" w:sz="4"/>
+              <w:bottom w:val="single" w:color="BFC7D5" w:sz="4"/>
+              <w:right w:val="single" w:color="BFC7D5" w:sz="4"/>
+            </w:tcBorders>
+            <w:shd w:fill="1F3864" w:color="auto" w:val="clear"/>
+            <w:tcMar>
+              <w:top w:type="dxa" w:w="60"/>
+              <w:left w:type="dxa" w:w="100"/>
+              <w:bottom w:type="dxa" w:w="60"/>
+              <w:right w:type="dxa" w:w="100"/>
+            </w:tcMar>
+          </w:tcPr>
+          <w:p>
+            <w:pPr>
+              <w:jc w:val="center"/>
+            </w:pPr>
+            <w:r>
+              <w:rPr>
+                <w:rFonts w:ascii="Arial" w:cs="Arial" w:eastAsia="Arial" w:hAnsi="Arial"/>
+                <w:b/>
+                <w:bCs/>
+                <w:color w:val="FFFFFF"/>
+                <w:sz w:val="18"/>
+                <w:szCs w:val="18"/>
+              </w:rPr>
+              <w:t xml:space="preserve">TP=4 (8 users per 4-GPU server)</w:t>
+            </w:r>
+          </w:p>
+        </w:tc>
+        <w:tc>
+          <w:tcPr>
+            <w:tcW w:type="dxa" w:w="5338"/>
+            <w:tcBorders>
+              <w:top w:val="single" w:color="BFC7D5" w:sz="4"/>
+              <w:left w:val="single" w:color="BFC7D5" w:sz="4"/>
+              <w:bottom w:val="single" w:color="BFC7D5" w:sz="4"/>
+              <w:right w:val="single" w:color="BFC7D5" w:sz="4"/>
+            </w:tcBorders>
+            <w:shd w:fill="1F3864" w:color="auto" w:val="clear"/>
+            <w:tcMar>
+              <w:top w:type="dxa" w:w="60"/>
+              <w:left w:type="dxa" w:w="100"/>
+              <w:bottom w:type="dxa" w:w="60"/>
+              <w:right w:type="dxa" w:w="100"/>
+            </w:tcMar>
+          </w:tcPr>
+          <w:p>
+            <w:pPr>
+              <w:jc w:val="center"/>
+            </w:pPr>
+            <w:r>
+              <w:rPr>
+                <w:rFonts w:ascii="Arial" w:cs="Arial" w:eastAsia="Arial" w:hAnsi="Arial"/>
+                <w:b/>
+                <w:bCs/>
+                <w:color w:val="FFFFFF"/>
+                <w:sz w:val="18"/>
+                <w:szCs w:val="18"/>
+              </w:rPr>
+              <w:t xml:space="preserve">TP=1 (1 user per GPU, 4 per server)</w:t>
+            </w:r>
+          </w:p>
+        </w:tc>
+      </w:tr>
+      <w:tr>
+        <w:tc>
+          <w:tcPr>
+            <w:tcW w:type="dxa" w:w="4003"/>
+            <w:tcBorders>
+              <w:top w:val="single" w:color="BFC7D5" w:sz="4"/>
+              <w:left w:val="single" w:color="BFC7D5" w:sz="4"/>
+              <w:bottom w:val="single" w:color="BFC7D5" w:sz="4"/>
+              <w:right w:val="single" w:color="BFC7D5" w:sz="4"/>
+            </w:tcBorders>
+            <w:tcMar>
+              <w:top w:type="dxa" w:w="60"/>
+              <w:left w:type="dxa" w:w="100"/>
+              <w:bottom w:type="dxa" w:w="60"/>
+              <w:right w:type="dxa" w:w="100"/>
+            </w:tcMar>
+          </w:tcPr>
+          <w:p>
+            <w:pPr>
+              <w:jc w:val="left"/>
+            </w:pPr>
+            <w:r>
+              <w:rPr>
+                <w:rFonts w:ascii="Arial" w:cs="Arial" w:eastAsia="Arial" w:hAnsi="Arial"/>
+                <w:b/>
+                <w:bCs/>
+                <w:sz w:val="18"/>
+                <w:szCs w:val="18"/>
+              </w:rPr>
+              <w:t xml:space="preserve">8</w:t>
+            </w:r>
+          </w:p>
+        </w:tc>
+        <w:tc>
+          <w:tcPr>
+            <w:tcW w:type="dxa" w:w="5337"/>
+            <w:tcBorders>
+              <w:top w:val="single" w:color="BFC7D5" w:sz="4"/>
+              <w:left w:val="single" w:color="BFC7D5" w:sz="4"/>
+              <w:bottom w:val="single" w:color="BFC7D5" w:sz="4"/>
+              <w:right w:val="single" w:color="BFC7D5" w:sz="4"/>
+            </w:tcBorders>
+            <w:shd w:fill="E2F0D9" w:color="auto" w:val="clear"/>
+            <w:tcMar>
+              <w:top w:type="dxa" w:w="60"/>
+              <w:left w:type="dxa" w:w="100"/>
+              <w:bottom w:type="dxa" w:w="60"/>
+              <w:right w:type="dxa" w:w="100"/>
+            </w:tcMar>
+          </w:tcPr>
+          <w:p>
+            <w:pPr>
+              <w:jc w:val="right"/>
+            </w:pPr>
+            <w:r>
+              <w:rPr>
+                <w:rFonts w:ascii="Arial" w:cs="Arial" w:eastAsia="Arial" w:hAnsi="Arial"/>
+                <w:b w:val="false"/>
+                <w:bCs w:val="false"/>
+                <w:sz w:val="18"/>
+                <w:szCs w:val="18"/>
+              </w:rPr>
+              <w:t xml:space="preserve">4 GPUs (1 server)</w:t>
+            </w:r>
+          </w:p>
+        </w:tc>
+        <w:tc>
+          <w:tcPr>
+            <w:tcW w:type="dxa" w:w="5338"/>
+            <w:tcBorders>
+              <w:top w:val="single" w:color="BFC7D5" w:sz="4"/>
+              <w:left w:val="single" w:color="BFC7D5" w:sz="4"/>
+              <w:bottom w:val="single" w:color="BFC7D5" w:sz="4"/>
+              <w:right w:val="single" w:color="BFC7D5" w:sz="4"/>
+            </w:tcBorders>
+            <w:tcMar>
+              <w:top w:type="dxa" w:w="60"/>
+              <w:left w:type="dxa" w:w="100"/>
+              <w:bottom w:type="dxa" w:w="60"/>
+              <w:right w:type="dxa" w:w="100"/>
+            </w:tcMar>
+          </w:tcPr>
+          <w:p>
+            <w:pPr>
+              <w:jc w:val="right"/>
+            </w:pPr>
+            <w:r>
+              <w:rPr>
+                <w:rFonts w:ascii="Arial" w:cs="Arial" w:eastAsia="Arial" w:hAnsi="Arial"/>
+                <w:b w:val="false"/>
+                <w:bCs w:val="false"/>
+                <w:sz w:val="18"/>
+                <w:szCs w:val="18"/>
+              </w:rPr>
+              <w:t xml:space="preserve">8 GPUs (2 servers)</w:t>
+            </w:r>
+          </w:p>
+        </w:tc>
+      </w:tr>
+      <w:tr>
+        <w:tc>
+          <w:tcPr>
+            <w:tcW w:type="dxa" w:w="4003"/>
+            <w:tcBorders>
+              <w:top w:val="single" w:color="BFC7D5" w:sz="4"/>
+              <w:left w:val="single" w:color="BFC7D5" w:sz="4"/>
+              <w:bottom w:val="single" w:color="BFC7D5" w:sz="4"/>
+              <w:right w:val="single" w:color="BFC7D5" w:sz="4"/>
+            </w:tcBorders>
+            <w:shd w:fill="F2F5FA" w:color="auto" w:val="clear"/>
+            <w:tcMar>
+              <w:top w:type="dxa" w:w="60"/>
+              <w:left w:type="dxa" w:w="100"/>
+              <w:bottom w:type="dxa" w:w="60"/>
+              <w:right w:type="dxa" w:w="100"/>
+            </w:tcMar>
+          </w:tcPr>
+          <w:p>
+            <w:pPr>
+              <w:jc w:val="left"/>
+            </w:pPr>
+            <w:r>
+              <w:rPr>
+                <w:rFonts w:ascii="Arial" w:cs="Arial" w:eastAsia="Arial" w:hAnsi="Arial"/>
+                <w:b/>
+                <w:bCs/>
+                <w:sz w:val="18"/>
+                <w:szCs w:val="18"/>
+              </w:rPr>
+              <w:t xml:space="preserve">40</w:t>
+            </w:r>
+          </w:p>
+        </w:tc>
+        <w:tc>
+          <w:tcPr>
+            <w:tcW w:type="dxa" w:w="5337"/>
+            <w:tcBorders>
+              <w:top w:val="single" w:color="BFC7D5" w:sz="4"/>
+              <w:left w:val="single" w:color="BFC7D5" w:sz="4"/>
+              <w:bottom w:val="single" w:color="BFC7D5" w:sz="4"/>
+              <w:right w:val="single" w:color="BFC7D5" w:sz="4"/>
+            </w:tcBorders>
+            <w:shd w:fill="E2F0D9" w:color="auto" w:val="clear"/>
+            <w:tcMar>
+              <w:top w:type="dxa" w:w="60"/>
+              <w:left w:type="dxa" w:w="100"/>
+              <w:bottom w:type="dxa" w:w="60"/>
+              <w:right w:type="dxa" w:w="100"/>
+            </w:tcMar>
+          </w:tcPr>
+          <w:p>
+            <w:pPr>
+              <w:jc w:val="right"/>
+            </w:pPr>
+            <w:r>
+              <w:rPr>
+                <w:rFonts w:ascii="Arial" w:cs="Arial" w:eastAsia="Arial" w:hAnsi="Arial"/>
+                <w:b w:val="false"/>
+                <w:bCs w:val="false"/>
+                <w:sz w:val="18"/>
+                <w:szCs w:val="18"/>
+              </w:rPr>
+              <w:t xml:space="preserve">20 GPUs (5 servers)</w:t>
+            </w:r>
+          </w:p>
+        </w:tc>
+        <w:tc>
+          <w:tcPr>
+            <w:tcW w:type="dxa" w:w="5338"/>
+            <w:tcBorders>
+              <w:top w:val="single" w:color="BFC7D5" w:sz="4"/>
+              <w:left w:val="single" w:color="BFC7D5" w:sz="4"/>
+              <w:bottom w:val="single" w:color="BFC7D5" w:sz="4"/>
+              <w:right w:val="single" w:color="BFC7D5" w:sz="4"/>
+            </w:tcBorders>
+            <w:shd w:fill="F2F5FA" w:color="auto" w:val="clear"/>
+            <w:tcMar>
+              <w:top w:type="dxa" w:w="60"/>
+              <w:left w:type="dxa" w:w="100"/>
+              <w:bottom w:type="dxa" w:w="60"/>
+              <w:right w:type="dxa" w:w="100"/>
+            </w:tcMar>
+          </w:tcPr>
+          <w:p>
+            <w:pPr>
+              <w:jc w:val="right"/>
+            </w:pPr>
+            <w:r>
+              <w:rPr>
+                <w:rFonts w:ascii="Arial" w:cs="Arial" w:eastAsia="Arial" w:hAnsi="Arial"/>
+                <w:b w:val="false"/>
+                <w:bCs w:val="false"/>
+                <w:sz w:val="18"/>
+                <w:szCs w:val="18"/>
+              </w:rPr>
+              <w:t xml:space="preserve">40 GPUs (10 servers)</w:t>
+            </w:r>
+          </w:p>
+        </w:tc>
+      </w:tr>
+      <w:tr>
+        <w:tc>
+          <w:tcPr>
+            <w:tcW w:type="dxa" w:w="4003"/>
+            <w:tcBorders>
+              <w:top w:val="single" w:color="BFC7D5" w:sz="4"/>
+              <w:left w:val="single" w:color="BFC7D5" w:sz="4"/>
+              <w:bottom w:val="single" w:color="BFC7D5" w:sz="4"/>
+              <w:right w:val="single" w:color="BFC7D5" w:sz="4"/>
+            </w:tcBorders>
+            <w:tcMar>
+              <w:top w:type="dxa" w:w="60"/>
+              <w:left w:type="dxa" w:w="100"/>
+              <w:bottom w:type="dxa" w:w="60"/>
+              <w:right w:type="dxa" w:w="100"/>
+            </w:tcMar>
+          </w:tcPr>
+          <w:p>
+            <w:pPr>
+              <w:jc w:val="left"/>
+            </w:pPr>
+            <w:r>
+              <w:rPr>
+                <w:rFonts w:ascii="Arial" w:cs="Arial" w:eastAsia="Arial" w:hAnsi="Arial"/>
+                <w:b/>
+                <w:bCs/>
+                <w:sz w:val="18"/>
+                <w:szCs w:val="18"/>
+              </w:rPr>
+              <w:t xml:space="preserve">100</w:t>
+            </w:r>
+          </w:p>
+        </w:tc>
+        <w:tc>
+          <w:tcPr>
+            <w:tcW w:type="dxa" w:w="5337"/>
+            <w:tcBorders>
+              <w:top w:val="single" w:color="BFC7D5" w:sz="4"/>
+              <w:left w:val="single" w:color="BFC7D5" w:sz="4"/>
+              <w:bottom w:val="single" w:color="BFC7D5" w:sz="4"/>
+              <w:right w:val="single" w:color="BFC7D5" w:sz="4"/>
+            </w:tcBorders>
+            <w:shd w:fill="E2F0D9" w:color="auto" w:val="clear"/>
+            <w:tcMar>
+              <w:top w:type="dxa" w:w="60"/>
+              <w:left w:type="dxa" w:w="100"/>
+              <w:bottom w:type="dxa" w:w="60"/>
+              <w:right w:type="dxa" w:w="100"/>
+            </w:tcMar>
+          </w:tcPr>
+          <w:p>
+            <w:pPr>
+              <w:jc w:val="right"/>
+            </w:pPr>
+            <w:r>
+              <w:rPr>
+                <w:rFonts w:ascii="Arial" w:cs="Arial" w:eastAsia="Arial" w:hAnsi="Arial"/>
+                <w:b w:val="false"/>
+                <w:bCs w:val="false"/>
+                <w:sz w:val="18"/>
+                <w:szCs w:val="18"/>
+              </w:rPr>
+              <w:t xml:space="preserve">52 GPUs (13 servers)</w:t>
+            </w:r>
+          </w:p>
+        </w:tc>
+        <w:tc>
+          <w:tcPr>
+            <w:tcW w:type="dxa" w:w="5338"/>
+            <w:tcBorders>
+              <w:top w:val="single" w:color="BFC7D5" w:sz="4"/>
+              <w:left w:val="single" w:color="BFC7D5" w:sz="4"/>
+              <w:bottom w:val="single" w:color="BFC7D5" w:sz="4"/>
+              <w:right w:val="single" w:color="BFC7D5" w:sz="4"/>
+            </w:tcBorders>
+            <w:tcMar>
+              <w:top w:type="dxa" w:w="60"/>
+              <w:left w:type="dxa" w:w="100"/>
+              <w:bottom w:type="dxa" w:w="60"/>
+              <w:right w:type="dxa" w:w="100"/>
+            </w:tcMar>
+          </w:tcPr>
+          <w:p>
+            <w:pPr>
+              <w:jc w:val="right"/>
+            </w:pPr>
+            <w:r>
+              <w:rPr>
+                <w:rFonts w:ascii="Arial" w:cs="Arial" w:eastAsia="Arial" w:hAnsi="Arial"/>
+                <w:b w:val="false"/>
+                <w:bCs w:val="false"/>
+                <w:sz w:val="18"/>
+                <w:szCs w:val="18"/>
+              </w:rPr>
+              <w:t xml:space="preserve">100 GPUs (25 servers)</w:t>
+            </w:r>
+          </w:p>
+        </w:tc>
+      </w:tr>
+    </w:tbl>
+    <w:p>
+      <w:pPr>
+        <w:spacing w:before="80" w:after="200"/>
+      </w:pPr>
+      <w:r>
+        <w:rPr>
+          <w:rFonts w:ascii="Arial" w:cs="Arial" w:eastAsia="Arial" w:hAnsi="Arial"/>
+          <w:i/>
+          <w:iCs/>
+          <w:color w:val="595959"/>
+          <w:sz w:val="18"/>
+          <w:szCs w:val="18"/>
+        </w:rPr>
+        <w:t xml:space="preserve">"Concurrent users" = requests in flight at the same time. At 8 concurrent requests a TP=4 server completes ~0.36 requests/s (~1,299 per hour). Levels between 8 and 16 were not measured, so TP=4 capacity is between 8 and ~12; 8 is the safe measured value. TP=1 at 2 users gives 24.8 tok/s — if that is accepted as 25, TP=1 matches TP=4 (8 users per server). Valid for 10k prompts with 512-token answers; FP8 weights would likely raise TP=1 capacity (not measured).</w:t>
       </w:r>
     </w:p>
     <w:p>

</xml_diff>